<commit_message>
completed CartSlice functions - tested
</commit_message>
<xml_diff>
--- a/docs/COURSE_TASK_INSTRUCTIONS.docx
+++ b/docs/COURSE_TASK_INSTRUCTIONS.docx
@@ -2521,12 +2521,16 @@
         </w:rPr>
         <w:t>CartItem.jsx</w:t>
       </w:r>
-      <w:r>
-        <w:t>component</w:t>
-      </w:r>
       <w:proofErr w:type="spellEnd"/>
       <w:r>
-        <w:t xml:space="preserve"> which displays the items held in the shopping cart. This component has </w:t>
+        <w:rPr>
+          <w:b/>
+          <w:bCs/>
+        </w:rPr>
+        <w:t xml:space="preserve"> </w:t>
+      </w:r>
+      <w:r>
+        <w:t xml:space="preserve">component which displays the items held in the shopping cart. This component has </w:t>
       </w:r>
       <w:proofErr w:type="gramStart"/>
       <w:r>
@@ -3894,38 +3898,75 @@
           <w:iCs/>
         </w:rPr>
         <w:lastRenderedPageBreak/>
-        <w:t xml:space="preserve">Note: Ensure that these event handlers update the UI in real time. When the user changes the number of a plant type, the following should update </w:t>
-      </w:r>
-      <w:proofErr w:type="gramStart"/>
-      <w:r>
+        <w:t xml:space="preserve">Note: Ensure that these event handlers update the UI in real time. When the user changes the number of a plant type, the following should update accordingly: </w:t>
+      </w:r>
+    </w:p>
+    <w:p>
+      <w:pPr>
         <w:rPr>
           <w:i/>
           <w:iCs/>
         </w:rPr>
-        <w:t>accordingly: •</w:t>
-      </w:r>
-      <w:proofErr w:type="gramEnd"/>
+      </w:pPr>
       <w:r>
         <w:rPr>
           <w:i/>
           <w:iCs/>
         </w:rPr>
-        <w:t xml:space="preserve"> The individual plant quantity. • The item's subtotal. • The overall total cost. </w:t>
-      </w:r>
-      <w:proofErr w:type="gramStart"/>
-      <w:r>
+        <w:t xml:space="preserve">• The individual plant quantity. </w:t>
+      </w:r>
+    </w:p>
+    <w:p>
+      <w:pPr>
         <w:rPr>
           <w:i/>
           <w:iCs/>
         </w:rPr>
-        <w:t xml:space="preserve">• The </w:t>
-      </w:r>
-      <w:proofErr w:type="spellStart"/>
+      </w:pPr>
       <w:r>
         <w:rPr>
           <w:i/>
           <w:iCs/>
         </w:rPr>
+        <w:t xml:space="preserve">• The item's subtotal. </w:t>
+      </w:r>
+    </w:p>
+    <w:p>
+      <w:pPr>
+        <w:rPr>
+          <w:i/>
+          <w:iCs/>
+        </w:rPr>
+      </w:pPr>
+      <w:r>
+        <w:rPr>
+          <w:i/>
+          <w:iCs/>
+        </w:rPr>
+        <w:t xml:space="preserve">• The overall total cost. </w:t>
+      </w:r>
+    </w:p>
+    <w:p>
+      <w:pPr>
+        <w:rPr>
+          <w:i/>
+          <w:iCs/>
+        </w:rPr>
+      </w:pPr>
+      <w:proofErr w:type="gramStart"/>
+      <w:r>
+        <w:rPr>
+          <w:i/>
+          <w:iCs/>
+        </w:rPr>
+        <w:t xml:space="preserve">• The </w:t>
+      </w:r>
+      <w:proofErr w:type="spellStart"/>
+      <w:r>
+        <w:rPr>
+          <w:i/>
+          <w:iCs/>
+        </w:rPr>
         <w:t>the</w:t>
       </w:r>
       <w:proofErr w:type="spellEnd"/>
@@ -3935,7 +3976,22 @@
           <w:i/>
           <w:iCs/>
         </w:rPr>
-        <w:t xml:space="preserve"> total number of items in the cart icon. • After a user clicks the "Add to Cart" button for a plant item, the button should become disabled and grayed out, and its label should update to "Added to Cart" to indicate that the item has already been added.</w:t>
+        <w:t xml:space="preserve"> total number of items in the cart icon. </w:t>
+      </w:r>
+    </w:p>
+    <w:p>
+      <w:pPr>
+        <w:rPr>
+          <w:i/>
+          <w:iCs/>
+        </w:rPr>
+      </w:pPr>
+      <w:r>
+        <w:rPr>
+          <w:i/>
+          <w:iCs/>
+        </w:rPr>
+        <w:t>• After a user clicks the "Add to Cart" button for a plant item, the button should become disabled and grayed out, and its label should update to "Added to Cart" to indicate that the item has already been added.</w:t>
       </w:r>
     </w:p>
     <w:p/>
@@ -4099,6 +4155,7 @@
         </w:numPr>
       </w:pPr>
       <w:r>
+        <w:lastRenderedPageBreak/>
         <w:t>Access the Redux store to retrieve and display the total quantity of items currently in the cart.</w:t>
       </w:r>
     </w:p>
@@ -4137,7 +4194,6 @@
           <w:color w:val="1F2937"/>
           <w:shd w:val="clear" w:color="auto" w:fill="FFFFFF"/>
         </w:rPr>
-        <w:lastRenderedPageBreak/>
         <w:t xml:space="preserve">const </w:t>
       </w:r>
       <w:proofErr w:type="spellStart"/>
@@ -4990,6 +5046,7 @@
         </w:numPr>
       </w:pPr>
       <w:r>
+        <w:lastRenderedPageBreak/>
         <w:t>Inside the configuration object passed to </w:t>
       </w:r>
       <w:proofErr w:type="spellStart"/>
@@ -5213,7 +5270,6 @@
           <w:shd w:val="clear" w:color="auto" w:fill="F9FAFB"/>
           <w14:ligatures w14:val="none"/>
         </w:rPr>
-        <w:lastRenderedPageBreak/>
         <w:t xml:space="preserve">    </w:t>
       </w:r>
       <w:r>
@@ -6100,6 +6156,7 @@
           <w:shd w:val="clear" w:color="auto" w:fill="F9FAFB"/>
           <w14:ligatures w14:val="none"/>
         </w:rPr>
+        <w:lastRenderedPageBreak/>
         <w:t>&lt;</w:t>
       </w:r>
       <w:r>
@@ -6256,7 +6313,6 @@
     </w:p>
     <w:p>
       <w:r>
-        <w:lastRenderedPageBreak/>
         <w:t xml:space="preserve">To deploy your </w:t>
       </w:r>
       <w:proofErr w:type="gramStart"/>

</xml_diff>

<commit_message>
Preparing project to be deployed on gh-pages
</commit_message>
<xml_diff>
--- a/docs/COURSE_TASK_INSTRUCTIONS.docx
+++ b/docs/COURSE_TASK_INSTRUCTIONS.docx
@@ -152,7 +152,6 @@
         <w:t>The </w:t>
       </w:r>
       <w:proofErr w:type="spellStart"/>
-      <w:proofErr w:type="gramStart"/>
       <w:r>
         <w:rPr>
           <w:b/>
@@ -166,15 +165,7 @@
           <w:b/>
           <w:bCs/>
         </w:rPr>
-        <w:t>(</w:t>
-      </w:r>
-      <w:proofErr w:type="gramEnd"/>
-      <w:r>
-        <w:rPr>
-          <w:b/>
-          <w:bCs/>
-        </w:rPr>
-        <w:t>)</w:t>
+        <w:t>()</w:t>
       </w:r>
       <w:r>
         <w:t> function should get called when the user selects an </w:t>
@@ -190,7 +181,6 @@
         <w:t> on the plant listing page. Subsequently, the </w:t>
       </w:r>
       <w:proofErr w:type="spellStart"/>
-      <w:proofErr w:type="gramStart"/>
       <w:r>
         <w:rPr>
           <w:b/>
@@ -204,15 +194,7 @@
           <w:b/>
           <w:bCs/>
         </w:rPr>
-        <w:t>(</w:t>
-      </w:r>
-      <w:proofErr w:type="gramEnd"/>
-      <w:r>
-        <w:rPr>
-          <w:b/>
-          <w:bCs/>
-        </w:rPr>
-        <w:t>)</w:t>
+        <w:t>()</w:t>
       </w:r>
       <w:r>
         <w:t> gets called which has the plant type as a parameter.</w:t>
@@ -229,7 +211,6 @@
         <w:t>The </w:t>
       </w:r>
       <w:proofErr w:type="spellStart"/>
-      <w:proofErr w:type="gramStart"/>
       <w:r>
         <w:rPr>
           <w:b/>
@@ -243,74 +224,843 @@
           <w:b/>
           <w:bCs/>
         </w:rPr>
+        <w:t>()</w:t>
+      </w:r>
+      <w:r>
+        <w:t> function will then dispatch the plant details to the </w:t>
+      </w:r>
+      <w:proofErr w:type="spellStart"/>
+      <w:r>
+        <w:rPr>
+          <w:b/>
+          <w:bCs/>
+        </w:rPr>
+        <w:t>addItem</w:t>
+      </w:r>
+      <w:proofErr w:type="spellEnd"/>
+      <w:r>
+        <w:rPr>
+          <w:b/>
+          <w:bCs/>
+        </w:rPr>
+        <w:t>()</w:t>
+      </w:r>
+      <w:r>
+        <w:t> reducer function in </w:t>
+      </w:r>
+      <w:proofErr w:type="spellStart"/>
+      <w:r>
+        <w:rPr>
+          <w:b/>
+          <w:bCs/>
+        </w:rPr>
+        <w:t>CartSlice.jsx</w:t>
+      </w:r>
+      <w:proofErr w:type="spellEnd"/>
+      <w:r>
+        <w:t>.</w:t>
+      </w:r>
+    </w:p>
+    <w:p>
+      <w:pPr>
+        <w:spacing w:after="0" w:line="240" w:lineRule="auto"/>
+        <w:rPr>
+          <w:rFonts w:ascii="Consolas" w:eastAsia="Times New Roman" w:hAnsi="Consolas" w:cs="Times New Roman"/>
+          <w:color w:val="333333"/>
+          <w:kern w:val="0"/>
+          <w:sz w:val="21"/>
+          <w:szCs w:val="21"/>
+          <w:shd w:val="clear" w:color="auto" w:fill="F9FAFB"/>
+          <w14:ligatures w14:val="none"/>
+        </w:rPr>
+      </w:pPr>
+      <w:proofErr w:type="spellStart"/>
+      <w:r>
+        <w:rPr>
+          <w:rFonts w:ascii="Consolas" w:eastAsia="Times New Roman" w:hAnsi="Consolas" w:cs="Times New Roman"/>
+          <w:color w:val="A31515"/>
+          <w:kern w:val="0"/>
+          <w:sz w:val="21"/>
+          <w:szCs w:val="21"/>
+          <w:bdr w:val="single" w:sz="2" w:space="0" w:color="E2E8F0" w:frame="1"/>
+          <w:shd w:val="clear" w:color="auto" w:fill="F9FAFB"/>
+          <w14:ligatures w14:val="none"/>
+        </w:rPr>
+        <w:t>addItem</w:t>
+      </w:r>
+      <w:proofErr w:type="spellEnd"/>
+      <w:r>
+        <w:rPr>
+          <w:rFonts w:ascii="Consolas" w:eastAsia="Times New Roman" w:hAnsi="Consolas" w:cs="Times New Roman"/>
+          <w:color w:val="333333"/>
+          <w:kern w:val="0"/>
+          <w:sz w:val="21"/>
+          <w:szCs w:val="21"/>
+          <w:shd w:val="clear" w:color="auto" w:fill="F9FAFB"/>
+          <w14:ligatures w14:val="none"/>
+        </w:rPr>
+        <w:t xml:space="preserve">: </w:t>
+      </w:r>
+      <w:r>
+        <w:rPr>
+          <w:rFonts w:ascii="Consolas" w:eastAsia="Times New Roman" w:hAnsi="Consolas" w:cs="Times New Roman"/>
+          <w:color w:val="333333"/>
+          <w:kern w:val="0"/>
+          <w:sz w:val="21"/>
+          <w:szCs w:val="21"/>
+          <w:bdr w:val="single" w:sz="2" w:space="0" w:color="E2E8F0" w:frame="1"/>
+          <w:shd w:val="clear" w:color="auto" w:fill="F9FAFB"/>
+          <w14:ligatures w14:val="none"/>
+        </w:rPr>
         <w:t>(</w:t>
       </w:r>
-      <w:proofErr w:type="gramEnd"/>
-      <w:r>
-        <w:rPr>
-          <w:b/>
-          <w:bCs/>
-        </w:rPr>
-        <w:t>)</w:t>
-      </w:r>
-      <w:r>
-        <w:t> function will then dispatch the plant details to the </w:t>
+      <w:r>
+        <w:rPr>
+          <w:rFonts w:ascii="Consolas" w:eastAsia="Times New Roman" w:hAnsi="Consolas" w:cs="Times New Roman"/>
+          <w:color w:val="001080"/>
+          <w:kern w:val="0"/>
+          <w:sz w:val="21"/>
+          <w:szCs w:val="21"/>
+          <w:bdr w:val="single" w:sz="2" w:space="0" w:color="E2E8F0" w:frame="1"/>
+          <w:shd w:val="clear" w:color="auto" w:fill="F9FAFB"/>
+          <w14:ligatures w14:val="none"/>
+        </w:rPr>
+        <w:t>state, action</w:t>
+      </w:r>
+      <w:r>
+        <w:rPr>
+          <w:rFonts w:ascii="Consolas" w:eastAsia="Times New Roman" w:hAnsi="Consolas" w:cs="Times New Roman"/>
+          <w:color w:val="333333"/>
+          <w:kern w:val="0"/>
+          <w:sz w:val="21"/>
+          <w:szCs w:val="21"/>
+          <w:bdr w:val="single" w:sz="2" w:space="0" w:color="E2E8F0" w:frame="1"/>
+          <w:shd w:val="clear" w:color="auto" w:fill="F9FAFB"/>
+          <w14:ligatures w14:val="none"/>
+        </w:rPr>
+        <w:t>) =&gt;</w:t>
+      </w:r>
+      <w:r>
+        <w:rPr>
+          <w:rFonts w:ascii="Consolas" w:eastAsia="Times New Roman" w:hAnsi="Consolas" w:cs="Times New Roman"/>
+          <w:color w:val="333333"/>
+          <w:kern w:val="0"/>
+          <w:sz w:val="21"/>
+          <w:szCs w:val="21"/>
+          <w:shd w:val="clear" w:color="auto" w:fill="F9FAFB"/>
+          <w14:ligatures w14:val="none"/>
+        </w:rPr>
+        <w:t xml:space="preserve"> {</w:t>
+      </w:r>
+    </w:p>
+    <w:p>
+      <w:pPr>
+        <w:spacing w:after="0" w:line="240" w:lineRule="auto"/>
+        <w:rPr>
+          <w:rFonts w:ascii="Consolas" w:eastAsia="Times New Roman" w:hAnsi="Consolas" w:cs="Times New Roman"/>
+          <w:color w:val="333333"/>
+          <w:kern w:val="0"/>
+          <w:sz w:val="21"/>
+          <w:szCs w:val="21"/>
+          <w:shd w:val="clear" w:color="auto" w:fill="F9FAFB"/>
+          <w14:ligatures w14:val="none"/>
+        </w:rPr>
+      </w:pPr>
+      <w:r>
+        <w:rPr>
+          <w:rFonts w:ascii="Consolas" w:eastAsia="Times New Roman" w:hAnsi="Consolas" w:cs="Times New Roman"/>
+          <w:color w:val="333333"/>
+          <w:kern w:val="0"/>
+          <w:sz w:val="21"/>
+          <w:szCs w:val="21"/>
+          <w:shd w:val="clear" w:color="auto" w:fill="F9FAFB"/>
+          <w14:ligatures w14:val="none"/>
+        </w:rPr>
+        <w:t xml:space="preserve">  </w:t>
+      </w:r>
+      <w:r>
+        <w:rPr>
+          <w:rFonts w:ascii="Consolas" w:eastAsia="Times New Roman" w:hAnsi="Consolas" w:cs="Times New Roman"/>
+          <w:color w:val="0000FF"/>
+          <w:kern w:val="0"/>
+          <w:sz w:val="21"/>
+          <w:szCs w:val="21"/>
+          <w:bdr w:val="single" w:sz="2" w:space="0" w:color="E2E8F0" w:frame="1"/>
+          <w:shd w:val="clear" w:color="auto" w:fill="F9FAFB"/>
+          <w14:ligatures w14:val="none"/>
+        </w:rPr>
+        <w:t>const</w:t>
+      </w:r>
+      <w:r>
+        <w:rPr>
+          <w:rFonts w:ascii="Consolas" w:eastAsia="Times New Roman" w:hAnsi="Consolas" w:cs="Times New Roman"/>
+          <w:color w:val="333333"/>
+          <w:kern w:val="0"/>
+          <w:sz w:val="21"/>
+          <w:szCs w:val="21"/>
+          <w:shd w:val="clear" w:color="auto" w:fill="F9FAFB"/>
+          <w14:ligatures w14:val="none"/>
+        </w:rPr>
+        <w:t xml:space="preserve"> { name, image, cost } = </w:t>
       </w:r>
       <w:proofErr w:type="spellStart"/>
-      <w:proofErr w:type="gramStart"/>
-      <w:r>
-        <w:rPr>
-          <w:b/>
-          <w:bCs/>
-        </w:rPr>
-        <w:t>addItem</w:t>
+      <w:r>
+        <w:rPr>
+          <w:rFonts w:ascii="Consolas" w:eastAsia="Times New Roman" w:hAnsi="Consolas" w:cs="Times New Roman"/>
+          <w:color w:val="333333"/>
+          <w:kern w:val="0"/>
+          <w:sz w:val="21"/>
+          <w:szCs w:val="21"/>
+          <w:shd w:val="clear" w:color="auto" w:fill="F9FAFB"/>
+          <w14:ligatures w14:val="none"/>
+        </w:rPr>
+        <w:t>action.</w:t>
+      </w:r>
+      <w:r>
+        <w:rPr>
+          <w:rFonts w:ascii="Consolas" w:eastAsia="Times New Roman" w:hAnsi="Consolas" w:cs="Times New Roman"/>
+          <w:color w:val="333333"/>
+          <w:kern w:val="0"/>
+          <w:sz w:val="21"/>
+          <w:szCs w:val="21"/>
+          <w:bdr w:val="single" w:sz="2" w:space="0" w:color="E2E8F0" w:frame="1"/>
+          <w:shd w:val="clear" w:color="auto" w:fill="F9FAFB"/>
+          <w14:ligatures w14:val="none"/>
+        </w:rPr>
+        <w:t>payload</w:t>
       </w:r>
       <w:proofErr w:type="spellEnd"/>
       <w:r>
         <w:rPr>
-          <w:b/>
-          <w:bCs/>
+          <w:rFonts w:ascii="Consolas" w:eastAsia="Times New Roman" w:hAnsi="Consolas" w:cs="Times New Roman"/>
+          <w:color w:val="333333"/>
+          <w:kern w:val="0"/>
+          <w:sz w:val="21"/>
+          <w:szCs w:val="21"/>
+          <w:shd w:val="clear" w:color="auto" w:fill="F9FAFB"/>
+          <w14:ligatures w14:val="none"/>
+        </w:rPr>
+        <w:t xml:space="preserve">; </w:t>
+      </w:r>
+      <w:r>
+        <w:rPr>
+          <w:rFonts w:ascii="Consolas" w:eastAsia="Times New Roman" w:hAnsi="Consolas" w:cs="Times New Roman"/>
+          <w:color w:val="608B4E"/>
+          <w:kern w:val="0"/>
+          <w:sz w:val="21"/>
+          <w:szCs w:val="21"/>
+          <w:bdr w:val="single" w:sz="2" w:space="0" w:color="E2E8F0" w:frame="1"/>
+          <w:shd w:val="clear" w:color="auto" w:fill="F9FAFB"/>
+          <w14:ligatures w14:val="none"/>
+        </w:rPr>
+        <w:t xml:space="preserve">// </w:t>
+      </w:r>
+      <w:proofErr w:type="spellStart"/>
+      <w:r>
+        <w:rPr>
+          <w:rFonts w:ascii="Consolas" w:eastAsia="Times New Roman" w:hAnsi="Consolas" w:cs="Times New Roman"/>
+          <w:color w:val="608B4E"/>
+          <w:kern w:val="0"/>
+          <w:sz w:val="21"/>
+          <w:szCs w:val="21"/>
+          <w:bdr w:val="single" w:sz="2" w:space="0" w:color="E2E8F0" w:frame="1"/>
+          <w:shd w:val="clear" w:color="auto" w:fill="F9FAFB"/>
+          <w14:ligatures w14:val="none"/>
+        </w:rPr>
+        <w:t>Destructure</w:t>
+      </w:r>
+      <w:proofErr w:type="spellEnd"/>
+      <w:r>
+        <w:rPr>
+          <w:rFonts w:ascii="Consolas" w:eastAsia="Times New Roman" w:hAnsi="Consolas" w:cs="Times New Roman"/>
+          <w:color w:val="608B4E"/>
+          <w:kern w:val="0"/>
+          <w:sz w:val="21"/>
+          <w:szCs w:val="21"/>
+          <w:bdr w:val="single" w:sz="2" w:space="0" w:color="E2E8F0" w:frame="1"/>
+          <w:shd w:val="clear" w:color="auto" w:fill="F9FAFB"/>
+          <w14:ligatures w14:val="none"/>
+        </w:rPr>
+        <w:t xml:space="preserve"> product details from the action payload</w:t>
+      </w:r>
+    </w:p>
+    <w:p>
+      <w:pPr>
+        <w:spacing w:after="0" w:line="240" w:lineRule="auto"/>
+        <w:rPr>
+          <w:rFonts w:ascii="Consolas" w:eastAsia="Times New Roman" w:hAnsi="Consolas" w:cs="Times New Roman"/>
+          <w:color w:val="333333"/>
+          <w:kern w:val="0"/>
+          <w:sz w:val="21"/>
+          <w:szCs w:val="21"/>
+          <w:shd w:val="clear" w:color="auto" w:fill="F9FAFB"/>
+          <w14:ligatures w14:val="none"/>
+        </w:rPr>
+      </w:pPr>
+      <w:r>
+        <w:rPr>
+          <w:rFonts w:ascii="Consolas" w:eastAsia="Times New Roman" w:hAnsi="Consolas" w:cs="Times New Roman"/>
+          <w:color w:val="333333"/>
+          <w:kern w:val="0"/>
+          <w:sz w:val="21"/>
+          <w:szCs w:val="21"/>
+          <w:shd w:val="clear" w:color="auto" w:fill="F9FAFB"/>
+          <w14:ligatures w14:val="none"/>
+        </w:rPr>
+        <w:t xml:space="preserve">  </w:t>
+      </w:r>
+      <w:r>
+        <w:rPr>
+          <w:rFonts w:ascii="Consolas" w:eastAsia="Times New Roman" w:hAnsi="Consolas" w:cs="Times New Roman"/>
+          <w:color w:val="608B4E"/>
+          <w:kern w:val="0"/>
+          <w:sz w:val="21"/>
+          <w:szCs w:val="21"/>
+          <w:bdr w:val="single" w:sz="2" w:space="0" w:color="E2E8F0" w:frame="1"/>
+          <w:shd w:val="clear" w:color="auto" w:fill="F9FAFB"/>
+          <w14:ligatures w14:val="none"/>
+        </w:rPr>
+        <w:t>// Check if the item already exists in the cart by comparing names</w:t>
+      </w:r>
+    </w:p>
+    <w:p>
+      <w:pPr>
+        <w:spacing w:after="0" w:line="240" w:lineRule="auto"/>
+        <w:rPr>
+          <w:rFonts w:ascii="Consolas" w:eastAsia="Times New Roman" w:hAnsi="Consolas" w:cs="Times New Roman"/>
+          <w:color w:val="333333"/>
+          <w:kern w:val="0"/>
+          <w:sz w:val="21"/>
+          <w:szCs w:val="21"/>
+          <w:shd w:val="clear" w:color="auto" w:fill="F9FAFB"/>
+          <w14:ligatures w14:val="none"/>
+        </w:rPr>
+      </w:pPr>
+      <w:r>
+        <w:rPr>
+          <w:rFonts w:ascii="Consolas" w:eastAsia="Times New Roman" w:hAnsi="Consolas" w:cs="Times New Roman"/>
+          <w:color w:val="333333"/>
+          <w:kern w:val="0"/>
+          <w:sz w:val="21"/>
+          <w:szCs w:val="21"/>
+          <w:shd w:val="clear" w:color="auto" w:fill="F9FAFB"/>
+          <w14:ligatures w14:val="none"/>
+        </w:rPr>
+        <w:t xml:space="preserve">  </w:t>
+      </w:r>
+      <w:r>
+        <w:rPr>
+          <w:rFonts w:ascii="Consolas" w:eastAsia="Times New Roman" w:hAnsi="Consolas" w:cs="Times New Roman"/>
+          <w:color w:val="0000FF"/>
+          <w:kern w:val="0"/>
+          <w:sz w:val="21"/>
+          <w:szCs w:val="21"/>
+          <w:bdr w:val="single" w:sz="2" w:space="0" w:color="E2E8F0" w:frame="1"/>
+          <w:shd w:val="clear" w:color="auto" w:fill="F9FAFB"/>
+          <w14:ligatures w14:val="none"/>
+        </w:rPr>
+        <w:t>const</w:t>
+      </w:r>
+      <w:r>
+        <w:rPr>
+          <w:rFonts w:ascii="Consolas" w:eastAsia="Times New Roman" w:hAnsi="Consolas" w:cs="Times New Roman"/>
+          <w:color w:val="333333"/>
+          <w:kern w:val="0"/>
+          <w:sz w:val="21"/>
+          <w:szCs w:val="21"/>
+          <w:shd w:val="clear" w:color="auto" w:fill="F9FAFB"/>
+          <w14:ligatures w14:val="none"/>
+        </w:rPr>
+        <w:t xml:space="preserve"> </w:t>
+      </w:r>
+      <w:proofErr w:type="spellStart"/>
+      <w:r>
+        <w:rPr>
+          <w:rFonts w:ascii="Consolas" w:eastAsia="Times New Roman" w:hAnsi="Consolas" w:cs="Times New Roman"/>
+          <w:color w:val="333333"/>
+          <w:kern w:val="0"/>
+          <w:sz w:val="21"/>
+          <w:szCs w:val="21"/>
+          <w:shd w:val="clear" w:color="auto" w:fill="F9FAFB"/>
+          <w14:ligatures w14:val="none"/>
+        </w:rPr>
+        <w:t>existingItem</w:t>
+      </w:r>
+      <w:proofErr w:type="spellEnd"/>
+      <w:r>
+        <w:rPr>
+          <w:rFonts w:ascii="Consolas" w:eastAsia="Times New Roman" w:hAnsi="Consolas" w:cs="Times New Roman"/>
+          <w:color w:val="333333"/>
+          <w:kern w:val="0"/>
+          <w:sz w:val="21"/>
+          <w:szCs w:val="21"/>
+          <w:shd w:val="clear" w:color="auto" w:fill="F9FAFB"/>
+          <w14:ligatures w14:val="none"/>
+        </w:rPr>
+        <w:t xml:space="preserve"> = </w:t>
+      </w:r>
+      <w:proofErr w:type="spellStart"/>
+      <w:r>
+        <w:rPr>
+          <w:rFonts w:ascii="Consolas" w:eastAsia="Times New Roman" w:hAnsi="Consolas" w:cs="Times New Roman"/>
+          <w:color w:val="333333"/>
+          <w:kern w:val="0"/>
+          <w:sz w:val="21"/>
+          <w:szCs w:val="21"/>
+          <w:shd w:val="clear" w:color="auto" w:fill="F9FAFB"/>
+          <w14:ligatures w14:val="none"/>
+        </w:rPr>
+        <w:t>state.</w:t>
+      </w:r>
+      <w:r>
+        <w:rPr>
+          <w:rFonts w:ascii="Consolas" w:eastAsia="Times New Roman" w:hAnsi="Consolas" w:cs="Times New Roman"/>
+          <w:color w:val="333333"/>
+          <w:kern w:val="0"/>
+          <w:sz w:val="21"/>
+          <w:szCs w:val="21"/>
+          <w:bdr w:val="single" w:sz="2" w:space="0" w:color="E2E8F0" w:frame="1"/>
+          <w:shd w:val="clear" w:color="auto" w:fill="F9FAFB"/>
+          <w14:ligatures w14:val="none"/>
+        </w:rPr>
+        <w:t>items</w:t>
+      </w:r>
+      <w:r>
+        <w:rPr>
+          <w:rFonts w:ascii="Consolas" w:eastAsia="Times New Roman" w:hAnsi="Consolas" w:cs="Times New Roman"/>
+          <w:color w:val="333333"/>
+          <w:kern w:val="0"/>
+          <w:sz w:val="21"/>
+          <w:szCs w:val="21"/>
+          <w:shd w:val="clear" w:color="auto" w:fill="F9FAFB"/>
+          <w14:ligatures w14:val="none"/>
+        </w:rPr>
+        <w:t>.</w:t>
+      </w:r>
+      <w:r>
+        <w:rPr>
+          <w:rFonts w:ascii="Consolas" w:eastAsia="Times New Roman" w:hAnsi="Consolas" w:cs="Times New Roman"/>
+          <w:color w:val="A31515"/>
+          <w:kern w:val="0"/>
+          <w:sz w:val="21"/>
+          <w:szCs w:val="21"/>
+          <w:bdr w:val="single" w:sz="2" w:space="0" w:color="E2E8F0" w:frame="1"/>
+          <w:shd w:val="clear" w:color="auto" w:fill="F9FAFB"/>
+          <w14:ligatures w14:val="none"/>
+        </w:rPr>
+        <w:t>find</w:t>
+      </w:r>
+      <w:proofErr w:type="spellEnd"/>
+      <w:r>
+        <w:rPr>
+          <w:rFonts w:ascii="Consolas" w:eastAsia="Times New Roman" w:hAnsi="Consolas" w:cs="Times New Roman"/>
+          <w:color w:val="333333"/>
+          <w:kern w:val="0"/>
+          <w:sz w:val="21"/>
+          <w:szCs w:val="21"/>
+          <w:shd w:val="clear" w:color="auto" w:fill="F9FAFB"/>
+          <w14:ligatures w14:val="none"/>
         </w:rPr>
         <w:t>(</w:t>
       </w:r>
-      <w:proofErr w:type="gramEnd"/>
-      <w:r>
-        <w:rPr>
-          <w:b/>
-          <w:bCs/>
-        </w:rPr>
-        <w:t>)</w:t>
-      </w:r>
-      <w:r>
-        <w:t> reducer function in </w:t>
+      <w:r>
+        <w:rPr>
+          <w:rFonts w:ascii="Consolas" w:eastAsia="Times New Roman" w:hAnsi="Consolas" w:cs="Times New Roman"/>
+          <w:color w:val="001080"/>
+          <w:kern w:val="0"/>
+          <w:sz w:val="21"/>
+          <w:szCs w:val="21"/>
+          <w:bdr w:val="single" w:sz="2" w:space="0" w:color="E2E8F0" w:frame="1"/>
+          <w:shd w:val="clear" w:color="auto" w:fill="F9FAFB"/>
+          <w14:ligatures w14:val="none"/>
+        </w:rPr>
+        <w:t>item</w:t>
+      </w:r>
+      <w:r>
+        <w:rPr>
+          <w:rFonts w:ascii="Consolas" w:eastAsia="Times New Roman" w:hAnsi="Consolas" w:cs="Times New Roman"/>
+          <w:color w:val="333333"/>
+          <w:kern w:val="0"/>
+          <w:sz w:val="21"/>
+          <w:szCs w:val="21"/>
+          <w:bdr w:val="single" w:sz="2" w:space="0" w:color="E2E8F0" w:frame="1"/>
+          <w:shd w:val="clear" w:color="auto" w:fill="F9FAFB"/>
+          <w14:ligatures w14:val="none"/>
+        </w:rPr>
+        <w:t xml:space="preserve"> =&gt;</w:t>
+      </w:r>
+      <w:r>
+        <w:rPr>
+          <w:rFonts w:ascii="Consolas" w:eastAsia="Times New Roman" w:hAnsi="Consolas" w:cs="Times New Roman"/>
+          <w:color w:val="333333"/>
+          <w:kern w:val="0"/>
+          <w:sz w:val="21"/>
+          <w:szCs w:val="21"/>
+          <w:shd w:val="clear" w:color="auto" w:fill="F9FAFB"/>
+          <w14:ligatures w14:val="none"/>
+        </w:rPr>
+        <w:t xml:space="preserve"> item.</w:t>
+      </w:r>
+      <w:r>
+        <w:rPr>
+          <w:rFonts w:ascii="Consolas" w:eastAsia="Times New Roman" w:hAnsi="Consolas" w:cs="Times New Roman"/>
+          <w:color w:val="333333"/>
+          <w:kern w:val="0"/>
+          <w:sz w:val="21"/>
+          <w:szCs w:val="21"/>
+          <w:bdr w:val="single" w:sz="2" w:space="0" w:color="E2E8F0" w:frame="1"/>
+          <w:shd w:val="clear" w:color="auto" w:fill="F9FAFB"/>
+          <w14:ligatures w14:val="none"/>
+        </w:rPr>
+        <w:t>name</w:t>
+      </w:r>
+      <w:r>
+        <w:rPr>
+          <w:rFonts w:ascii="Consolas" w:eastAsia="Times New Roman" w:hAnsi="Consolas" w:cs="Times New Roman"/>
+          <w:color w:val="333333"/>
+          <w:kern w:val="0"/>
+          <w:sz w:val="21"/>
+          <w:szCs w:val="21"/>
+          <w:shd w:val="clear" w:color="auto" w:fill="F9FAFB"/>
+          <w14:ligatures w14:val="none"/>
+        </w:rPr>
+        <w:t xml:space="preserve"> === name);</w:t>
+      </w:r>
+    </w:p>
+    <w:p>
+      <w:pPr>
+        <w:spacing w:after="0" w:line="240" w:lineRule="auto"/>
+        <w:rPr>
+          <w:rFonts w:ascii="Consolas" w:eastAsia="Times New Roman" w:hAnsi="Consolas" w:cs="Times New Roman"/>
+          <w:color w:val="333333"/>
+          <w:kern w:val="0"/>
+          <w:sz w:val="21"/>
+          <w:szCs w:val="21"/>
+          <w:shd w:val="clear" w:color="auto" w:fill="F9FAFB"/>
+          <w14:ligatures w14:val="none"/>
+        </w:rPr>
+      </w:pPr>
+      <w:r>
+        <w:rPr>
+          <w:rFonts w:ascii="Consolas" w:eastAsia="Times New Roman" w:hAnsi="Consolas" w:cs="Times New Roman"/>
+          <w:color w:val="333333"/>
+          <w:kern w:val="0"/>
+          <w:sz w:val="21"/>
+          <w:szCs w:val="21"/>
+          <w:shd w:val="clear" w:color="auto" w:fill="F9FAFB"/>
+          <w14:ligatures w14:val="none"/>
+        </w:rPr>
+        <w:t xml:space="preserve">  </w:t>
+      </w:r>
+      <w:r>
+        <w:rPr>
+          <w:rFonts w:ascii="Consolas" w:eastAsia="Times New Roman" w:hAnsi="Consolas" w:cs="Times New Roman"/>
+          <w:color w:val="0000FF"/>
+          <w:kern w:val="0"/>
+          <w:sz w:val="21"/>
+          <w:szCs w:val="21"/>
+          <w:bdr w:val="single" w:sz="2" w:space="0" w:color="E2E8F0" w:frame="1"/>
+          <w:shd w:val="clear" w:color="auto" w:fill="F9FAFB"/>
+          <w14:ligatures w14:val="none"/>
+        </w:rPr>
+        <w:t>if</w:t>
+      </w:r>
+      <w:r>
+        <w:rPr>
+          <w:rFonts w:ascii="Consolas" w:eastAsia="Times New Roman" w:hAnsi="Consolas" w:cs="Times New Roman"/>
+          <w:color w:val="333333"/>
+          <w:kern w:val="0"/>
+          <w:sz w:val="21"/>
+          <w:szCs w:val="21"/>
+          <w:shd w:val="clear" w:color="auto" w:fill="F9FAFB"/>
+          <w14:ligatures w14:val="none"/>
+        </w:rPr>
+        <w:t xml:space="preserve"> (</w:t>
       </w:r>
       <w:proofErr w:type="spellStart"/>
       <w:r>
         <w:rPr>
-          <w:b/>
-          <w:bCs/>
-        </w:rPr>
-        <w:t>CartSlice.jsx</w:t>
+          <w:rFonts w:ascii="Consolas" w:eastAsia="Times New Roman" w:hAnsi="Consolas" w:cs="Times New Roman"/>
+          <w:color w:val="333333"/>
+          <w:kern w:val="0"/>
+          <w:sz w:val="21"/>
+          <w:szCs w:val="21"/>
+          <w:shd w:val="clear" w:color="auto" w:fill="F9FAFB"/>
+          <w14:ligatures w14:val="none"/>
+        </w:rPr>
+        <w:t>existingItem</w:t>
       </w:r>
       <w:proofErr w:type="spellEnd"/>
       <w:r>
+        <w:rPr>
+          <w:rFonts w:ascii="Consolas" w:eastAsia="Times New Roman" w:hAnsi="Consolas" w:cs="Times New Roman"/>
+          <w:color w:val="333333"/>
+          <w:kern w:val="0"/>
+          <w:sz w:val="21"/>
+          <w:szCs w:val="21"/>
+          <w:shd w:val="clear" w:color="auto" w:fill="F9FAFB"/>
+          <w14:ligatures w14:val="none"/>
+        </w:rPr>
+        <w:t>) {</w:t>
+      </w:r>
+    </w:p>
+    <w:p>
+      <w:pPr>
+        <w:spacing w:after="0" w:line="240" w:lineRule="auto"/>
+        <w:rPr>
+          <w:rFonts w:ascii="Consolas" w:eastAsia="Times New Roman" w:hAnsi="Consolas" w:cs="Times New Roman"/>
+          <w:color w:val="333333"/>
+          <w:kern w:val="0"/>
+          <w:sz w:val="21"/>
+          <w:szCs w:val="21"/>
+          <w:shd w:val="clear" w:color="auto" w:fill="F9FAFB"/>
+          <w14:ligatures w14:val="none"/>
+        </w:rPr>
+      </w:pPr>
+      <w:r>
+        <w:rPr>
+          <w:rFonts w:ascii="Consolas" w:eastAsia="Times New Roman" w:hAnsi="Consolas" w:cs="Times New Roman"/>
+          <w:color w:val="333333"/>
+          <w:kern w:val="0"/>
+          <w:sz w:val="21"/>
+          <w:szCs w:val="21"/>
+          <w:shd w:val="clear" w:color="auto" w:fill="F9FAFB"/>
+          <w14:ligatures w14:val="none"/>
+        </w:rPr>
+        <w:t xml:space="preserve">    </w:t>
+      </w:r>
+      <w:r>
+        <w:rPr>
+          <w:rFonts w:ascii="Consolas" w:eastAsia="Times New Roman" w:hAnsi="Consolas" w:cs="Times New Roman"/>
+          <w:color w:val="608B4E"/>
+          <w:kern w:val="0"/>
+          <w:sz w:val="21"/>
+          <w:szCs w:val="21"/>
+          <w:bdr w:val="single" w:sz="2" w:space="0" w:color="E2E8F0" w:frame="1"/>
+          <w:shd w:val="clear" w:color="auto" w:fill="F9FAFB"/>
+          <w14:ligatures w14:val="none"/>
+        </w:rPr>
+        <w:t>// If item already exists in the cart, increase its quantity</w:t>
+      </w:r>
+    </w:p>
+    <w:p>
+      <w:pPr>
+        <w:spacing w:after="0" w:line="240" w:lineRule="auto"/>
+        <w:rPr>
+          <w:rFonts w:ascii="Consolas" w:eastAsia="Times New Roman" w:hAnsi="Consolas" w:cs="Times New Roman"/>
+          <w:color w:val="333333"/>
+          <w:kern w:val="0"/>
+          <w:sz w:val="21"/>
+          <w:szCs w:val="21"/>
+          <w:shd w:val="clear" w:color="auto" w:fill="F9FAFB"/>
+          <w14:ligatures w14:val="none"/>
+        </w:rPr>
+      </w:pPr>
+      <w:r>
+        <w:rPr>
+          <w:rFonts w:ascii="Consolas" w:eastAsia="Times New Roman" w:hAnsi="Consolas" w:cs="Times New Roman"/>
+          <w:color w:val="333333"/>
+          <w:kern w:val="0"/>
+          <w:sz w:val="21"/>
+          <w:szCs w:val="21"/>
+          <w:shd w:val="clear" w:color="auto" w:fill="F9FAFB"/>
+          <w14:ligatures w14:val="none"/>
+        </w:rPr>
+        <w:t xml:space="preserve">    </w:t>
+      </w:r>
+      <w:proofErr w:type="spellStart"/>
+      <w:r>
+        <w:rPr>
+          <w:rFonts w:ascii="Consolas" w:eastAsia="Times New Roman" w:hAnsi="Consolas" w:cs="Times New Roman"/>
+          <w:color w:val="333333"/>
+          <w:kern w:val="0"/>
+          <w:sz w:val="21"/>
+          <w:szCs w:val="21"/>
+          <w:shd w:val="clear" w:color="auto" w:fill="F9FAFB"/>
+          <w14:ligatures w14:val="none"/>
+        </w:rPr>
+        <w:t>existingItem.</w:t>
+      </w:r>
+      <w:r>
+        <w:rPr>
+          <w:rFonts w:ascii="Consolas" w:eastAsia="Times New Roman" w:hAnsi="Consolas" w:cs="Times New Roman"/>
+          <w:color w:val="333333"/>
+          <w:kern w:val="0"/>
+          <w:sz w:val="21"/>
+          <w:szCs w:val="21"/>
+          <w:bdr w:val="single" w:sz="2" w:space="0" w:color="E2E8F0" w:frame="1"/>
+          <w:shd w:val="clear" w:color="auto" w:fill="F9FAFB"/>
+          <w14:ligatures w14:val="none"/>
+        </w:rPr>
+        <w:t>quantity</w:t>
+      </w:r>
+      <w:proofErr w:type="spellEnd"/>
+      <w:r>
+        <w:rPr>
+          <w:rFonts w:ascii="Consolas" w:eastAsia="Times New Roman" w:hAnsi="Consolas" w:cs="Times New Roman"/>
+          <w:color w:val="333333"/>
+          <w:kern w:val="0"/>
+          <w:sz w:val="21"/>
+          <w:szCs w:val="21"/>
+          <w:shd w:val="clear" w:color="auto" w:fill="F9FAFB"/>
+          <w14:ligatures w14:val="none"/>
+        </w:rPr>
+        <w:t>++;</w:t>
+      </w:r>
+    </w:p>
+    <w:p>
+      <w:pPr>
+        <w:spacing w:after="0" w:line="240" w:lineRule="auto"/>
+        <w:rPr>
+          <w:rFonts w:ascii="Consolas" w:eastAsia="Times New Roman" w:hAnsi="Consolas" w:cs="Times New Roman"/>
+          <w:color w:val="333333"/>
+          <w:kern w:val="0"/>
+          <w:sz w:val="21"/>
+          <w:szCs w:val="21"/>
+          <w:shd w:val="clear" w:color="auto" w:fill="F9FAFB"/>
+          <w14:ligatures w14:val="none"/>
+        </w:rPr>
+      </w:pPr>
+      <w:r>
+        <w:rPr>
+          <w:rFonts w:ascii="Consolas" w:eastAsia="Times New Roman" w:hAnsi="Consolas" w:cs="Times New Roman"/>
+          <w:color w:val="333333"/>
+          <w:kern w:val="0"/>
+          <w:sz w:val="21"/>
+          <w:szCs w:val="21"/>
+          <w:shd w:val="clear" w:color="auto" w:fill="F9FAFB"/>
+          <w14:ligatures w14:val="none"/>
+        </w:rPr>
+        <w:t xml:space="preserve">  } </w:t>
+      </w:r>
+      <w:r>
+        <w:rPr>
+          <w:rFonts w:ascii="Consolas" w:eastAsia="Times New Roman" w:hAnsi="Consolas" w:cs="Times New Roman"/>
+          <w:color w:val="0000FF"/>
+          <w:kern w:val="0"/>
+          <w:sz w:val="21"/>
+          <w:szCs w:val="21"/>
+          <w:bdr w:val="single" w:sz="2" w:space="0" w:color="E2E8F0" w:frame="1"/>
+          <w:shd w:val="clear" w:color="auto" w:fill="F9FAFB"/>
+          <w14:ligatures w14:val="none"/>
+        </w:rPr>
+        <w:t>else</w:t>
+      </w:r>
+      <w:r>
+        <w:rPr>
+          <w:rFonts w:ascii="Consolas" w:eastAsia="Times New Roman" w:hAnsi="Consolas" w:cs="Times New Roman"/>
+          <w:color w:val="333333"/>
+          <w:kern w:val="0"/>
+          <w:sz w:val="21"/>
+          <w:szCs w:val="21"/>
+          <w:shd w:val="clear" w:color="auto" w:fill="F9FAFB"/>
+          <w14:ligatures w14:val="none"/>
+        </w:rPr>
+        <w:t xml:space="preserve"> {</w:t>
+      </w:r>
+    </w:p>
+    <w:p>
+      <w:pPr>
+        <w:spacing w:after="0" w:line="240" w:lineRule="auto"/>
+        <w:rPr>
+          <w:rFonts w:ascii="Consolas" w:eastAsia="Times New Roman" w:hAnsi="Consolas" w:cs="Times New Roman"/>
+          <w:color w:val="333333"/>
+          <w:kern w:val="0"/>
+          <w:sz w:val="21"/>
+          <w:szCs w:val="21"/>
+          <w:shd w:val="clear" w:color="auto" w:fill="F9FAFB"/>
+          <w14:ligatures w14:val="none"/>
+        </w:rPr>
+      </w:pPr>
+      <w:r>
+        <w:rPr>
+          <w:rFonts w:ascii="Consolas" w:eastAsia="Times New Roman" w:hAnsi="Consolas" w:cs="Times New Roman"/>
+          <w:color w:val="333333"/>
+          <w:kern w:val="0"/>
+          <w:sz w:val="21"/>
+          <w:szCs w:val="21"/>
+          <w:shd w:val="clear" w:color="auto" w:fill="F9FAFB"/>
+          <w14:ligatures w14:val="none"/>
+        </w:rPr>
+        <w:t xml:space="preserve">    </w:t>
+      </w:r>
+      <w:r>
+        <w:rPr>
+          <w:rFonts w:ascii="Consolas" w:eastAsia="Times New Roman" w:hAnsi="Consolas" w:cs="Times New Roman"/>
+          <w:color w:val="608B4E"/>
+          <w:kern w:val="0"/>
+          <w:sz w:val="21"/>
+          <w:szCs w:val="21"/>
+          <w:bdr w:val="single" w:sz="2" w:space="0" w:color="E2E8F0" w:frame="1"/>
+          <w:shd w:val="clear" w:color="auto" w:fill="F9FAFB"/>
+          <w14:ligatures w14:val="none"/>
+        </w:rPr>
+        <w:t>// If item does not exist, add it to the cart with quantity 1</w:t>
+      </w:r>
+    </w:p>
+    <w:p>
+      <w:pPr>
+        <w:spacing w:after="0" w:line="240" w:lineRule="auto"/>
+        <w:rPr>
+          <w:rFonts w:ascii="Consolas" w:eastAsia="Times New Roman" w:hAnsi="Consolas" w:cs="Times New Roman"/>
+          <w:color w:val="333333"/>
+          <w:kern w:val="0"/>
+          <w:sz w:val="21"/>
+          <w:szCs w:val="21"/>
+          <w:shd w:val="clear" w:color="auto" w:fill="F9FAFB"/>
+          <w14:ligatures w14:val="none"/>
+        </w:rPr>
+      </w:pPr>
+      <w:r>
+        <w:rPr>
+          <w:rFonts w:ascii="Consolas" w:eastAsia="Times New Roman" w:hAnsi="Consolas" w:cs="Times New Roman"/>
+          <w:color w:val="333333"/>
+          <w:kern w:val="0"/>
+          <w:sz w:val="21"/>
+          <w:szCs w:val="21"/>
+          <w:shd w:val="clear" w:color="auto" w:fill="F9FAFB"/>
+          <w14:ligatures w14:val="none"/>
+        </w:rPr>
+        <w:t xml:space="preserve">    </w:t>
+      </w:r>
+      <w:proofErr w:type="spellStart"/>
+      <w:r>
+        <w:rPr>
+          <w:rFonts w:ascii="Consolas" w:eastAsia="Times New Roman" w:hAnsi="Consolas" w:cs="Times New Roman"/>
+          <w:color w:val="333333"/>
+          <w:kern w:val="0"/>
+          <w:sz w:val="21"/>
+          <w:szCs w:val="21"/>
+          <w:shd w:val="clear" w:color="auto" w:fill="F9FAFB"/>
+          <w14:ligatures w14:val="none"/>
+        </w:rPr>
+        <w:t>state.</w:t>
+      </w:r>
+      <w:r>
+        <w:rPr>
+          <w:rFonts w:ascii="Consolas" w:eastAsia="Times New Roman" w:hAnsi="Consolas" w:cs="Times New Roman"/>
+          <w:color w:val="333333"/>
+          <w:kern w:val="0"/>
+          <w:sz w:val="21"/>
+          <w:szCs w:val="21"/>
+          <w:bdr w:val="single" w:sz="2" w:space="0" w:color="E2E8F0" w:frame="1"/>
+          <w:shd w:val="clear" w:color="auto" w:fill="F9FAFB"/>
+          <w14:ligatures w14:val="none"/>
+        </w:rPr>
+        <w:t>items</w:t>
+      </w:r>
+      <w:r>
+        <w:rPr>
+          <w:rFonts w:ascii="Consolas" w:eastAsia="Times New Roman" w:hAnsi="Consolas" w:cs="Times New Roman"/>
+          <w:color w:val="333333"/>
+          <w:kern w:val="0"/>
+          <w:sz w:val="21"/>
+          <w:szCs w:val="21"/>
+          <w:shd w:val="clear" w:color="auto" w:fill="F9FAFB"/>
+          <w14:ligatures w14:val="none"/>
+        </w:rPr>
         <w:t>.</w:t>
       </w:r>
-    </w:p>
-    <w:p>
-      <w:pPr>
-        <w:spacing w:after="0" w:line="240" w:lineRule="auto"/>
-        <w:rPr>
-          <w:rFonts w:ascii="Consolas" w:eastAsia="Times New Roman" w:hAnsi="Consolas" w:cs="Times New Roman"/>
-          <w:color w:val="333333"/>
-          <w:kern w:val="0"/>
-          <w:sz w:val="21"/>
-          <w:szCs w:val="21"/>
-          <w:shd w:val="clear" w:color="auto" w:fill="F9FAFB"/>
-          <w14:ligatures w14:val="none"/>
-        </w:rPr>
-      </w:pPr>
-      <w:proofErr w:type="spellStart"/>
       <w:r>
         <w:rPr>
           <w:rFonts w:ascii="Consolas" w:eastAsia="Times New Roman" w:hAnsi="Consolas" w:cs="Times New Roman"/>
@@ -322,7 +1072,7 @@
           <w:shd w:val="clear" w:color="auto" w:fill="F9FAFB"/>
           <w14:ligatures w14:val="none"/>
         </w:rPr>
-        <w:t>addItem</w:t>
+        <w:t>push</w:t>
       </w:r>
       <w:proofErr w:type="spellEnd"/>
       <w:r>
@@ -335,12 +1085,37 @@
           <w:shd w:val="clear" w:color="auto" w:fill="F9FAFB"/>
           <w14:ligatures w14:val="none"/>
         </w:rPr>
+        <w:t xml:space="preserve">({ name, image, cost, </w:t>
+      </w:r>
+      <w:r>
+        <w:rPr>
+          <w:rFonts w:ascii="Consolas" w:eastAsia="Times New Roman" w:hAnsi="Consolas" w:cs="Times New Roman"/>
+          <w:color w:val="A31515"/>
+          <w:kern w:val="0"/>
+          <w:sz w:val="21"/>
+          <w:szCs w:val="21"/>
+          <w:bdr w:val="single" w:sz="2" w:space="0" w:color="E2E8F0" w:frame="1"/>
+          <w:shd w:val="clear" w:color="auto" w:fill="F9FAFB"/>
+          <w14:ligatures w14:val="none"/>
+        </w:rPr>
+        <w:t>quantity</w:t>
+      </w:r>
+      <w:r>
+        <w:rPr>
+          <w:rFonts w:ascii="Consolas" w:eastAsia="Times New Roman" w:hAnsi="Consolas" w:cs="Times New Roman"/>
+          <w:color w:val="333333"/>
+          <w:kern w:val="0"/>
+          <w:sz w:val="21"/>
+          <w:szCs w:val="21"/>
+          <w:shd w:val="clear" w:color="auto" w:fill="F9FAFB"/>
+          <w14:ligatures w14:val="none"/>
+        </w:rPr>
         <w:t xml:space="preserve">: </w:t>
       </w:r>
       <w:r>
         <w:rPr>
           <w:rFonts w:ascii="Consolas" w:eastAsia="Times New Roman" w:hAnsi="Consolas" w:cs="Times New Roman"/>
-          <w:color w:val="333333"/>
+          <w:color w:val="B5CEA8"/>
           <w:kern w:val="0"/>
           <w:sz w:val="21"/>
           <w:szCs w:val="21"/>
@@ -348,922 +1123,6 @@
           <w:shd w:val="clear" w:color="auto" w:fill="F9FAFB"/>
           <w14:ligatures w14:val="none"/>
         </w:rPr>
-        <w:t>(</w:t>
-      </w:r>
-      <w:r>
-        <w:rPr>
-          <w:rFonts w:ascii="Consolas" w:eastAsia="Times New Roman" w:hAnsi="Consolas" w:cs="Times New Roman"/>
-          <w:color w:val="001080"/>
-          <w:kern w:val="0"/>
-          <w:sz w:val="21"/>
-          <w:szCs w:val="21"/>
-          <w:bdr w:val="single" w:sz="2" w:space="0" w:color="E2E8F0" w:frame="1"/>
-          <w:shd w:val="clear" w:color="auto" w:fill="F9FAFB"/>
-          <w14:ligatures w14:val="none"/>
-        </w:rPr>
-        <w:t>state, action</w:t>
-      </w:r>
-      <w:r>
-        <w:rPr>
-          <w:rFonts w:ascii="Consolas" w:eastAsia="Times New Roman" w:hAnsi="Consolas" w:cs="Times New Roman"/>
-          <w:color w:val="333333"/>
-          <w:kern w:val="0"/>
-          <w:sz w:val="21"/>
-          <w:szCs w:val="21"/>
-          <w:bdr w:val="single" w:sz="2" w:space="0" w:color="E2E8F0" w:frame="1"/>
-          <w:shd w:val="clear" w:color="auto" w:fill="F9FAFB"/>
-          <w14:ligatures w14:val="none"/>
-        </w:rPr>
-        <w:t>) =&gt;</w:t>
-      </w:r>
-      <w:r>
-        <w:rPr>
-          <w:rFonts w:ascii="Consolas" w:eastAsia="Times New Roman" w:hAnsi="Consolas" w:cs="Times New Roman"/>
-          <w:color w:val="333333"/>
-          <w:kern w:val="0"/>
-          <w:sz w:val="21"/>
-          <w:szCs w:val="21"/>
-          <w:shd w:val="clear" w:color="auto" w:fill="F9FAFB"/>
-          <w14:ligatures w14:val="none"/>
-        </w:rPr>
-        <w:t xml:space="preserve"> {</w:t>
-      </w:r>
-    </w:p>
-    <w:p>
-      <w:pPr>
-        <w:spacing w:after="0" w:line="240" w:lineRule="auto"/>
-        <w:rPr>
-          <w:rFonts w:ascii="Consolas" w:eastAsia="Times New Roman" w:hAnsi="Consolas" w:cs="Times New Roman"/>
-          <w:color w:val="333333"/>
-          <w:kern w:val="0"/>
-          <w:sz w:val="21"/>
-          <w:szCs w:val="21"/>
-          <w:shd w:val="clear" w:color="auto" w:fill="F9FAFB"/>
-          <w14:ligatures w14:val="none"/>
-        </w:rPr>
-      </w:pPr>
-      <w:r>
-        <w:rPr>
-          <w:rFonts w:ascii="Consolas" w:eastAsia="Times New Roman" w:hAnsi="Consolas" w:cs="Times New Roman"/>
-          <w:color w:val="333333"/>
-          <w:kern w:val="0"/>
-          <w:sz w:val="21"/>
-          <w:szCs w:val="21"/>
-          <w:shd w:val="clear" w:color="auto" w:fill="F9FAFB"/>
-          <w14:ligatures w14:val="none"/>
-        </w:rPr>
-        <w:t xml:space="preserve">  </w:t>
-      </w:r>
-      <w:r>
-        <w:rPr>
-          <w:rFonts w:ascii="Consolas" w:eastAsia="Times New Roman" w:hAnsi="Consolas" w:cs="Times New Roman"/>
-          <w:color w:val="0000FF"/>
-          <w:kern w:val="0"/>
-          <w:sz w:val="21"/>
-          <w:szCs w:val="21"/>
-          <w:bdr w:val="single" w:sz="2" w:space="0" w:color="E2E8F0" w:frame="1"/>
-          <w:shd w:val="clear" w:color="auto" w:fill="F9FAFB"/>
-          <w14:ligatures w14:val="none"/>
-        </w:rPr>
-        <w:t>const</w:t>
-      </w:r>
-      <w:r>
-        <w:rPr>
-          <w:rFonts w:ascii="Consolas" w:eastAsia="Times New Roman" w:hAnsi="Consolas" w:cs="Times New Roman"/>
-          <w:color w:val="333333"/>
-          <w:kern w:val="0"/>
-          <w:sz w:val="21"/>
-          <w:szCs w:val="21"/>
-          <w:shd w:val="clear" w:color="auto" w:fill="F9FAFB"/>
-          <w14:ligatures w14:val="none"/>
-        </w:rPr>
-        <w:t xml:space="preserve"> </w:t>
-      </w:r>
-      <w:proofErr w:type="gramStart"/>
-      <w:r>
-        <w:rPr>
-          <w:rFonts w:ascii="Consolas" w:eastAsia="Times New Roman" w:hAnsi="Consolas" w:cs="Times New Roman"/>
-          <w:color w:val="333333"/>
-          <w:kern w:val="0"/>
-          <w:sz w:val="21"/>
-          <w:szCs w:val="21"/>
-          <w:shd w:val="clear" w:color="auto" w:fill="F9FAFB"/>
-          <w14:ligatures w14:val="none"/>
-        </w:rPr>
-        <w:t>{ name</w:t>
-      </w:r>
-      <w:proofErr w:type="gramEnd"/>
-      <w:r>
-        <w:rPr>
-          <w:rFonts w:ascii="Consolas" w:eastAsia="Times New Roman" w:hAnsi="Consolas" w:cs="Times New Roman"/>
-          <w:color w:val="333333"/>
-          <w:kern w:val="0"/>
-          <w:sz w:val="21"/>
-          <w:szCs w:val="21"/>
-          <w:shd w:val="clear" w:color="auto" w:fill="F9FAFB"/>
-          <w14:ligatures w14:val="none"/>
-        </w:rPr>
-        <w:t xml:space="preserve">, image, </w:t>
-      </w:r>
-      <w:proofErr w:type="gramStart"/>
-      <w:r>
-        <w:rPr>
-          <w:rFonts w:ascii="Consolas" w:eastAsia="Times New Roman" w:hAnsi="Consolas" w:cs="Times New Roman"/>
-          <w:color w:val="333333"/>
-          <w:kern w:val="0"/>
-          <w:sz w:val="21"/>
-          <w:szCs w:val="21"/>
-          <w:shd w:val="clear" w:color="auto" w:fill="F9FAFB"/>
-          <w14:ligatures w14:val="none"/>
-        </w:rPr>
-        <w:t>cost }</w:t>
-      </w:r>
-      <w:proofErr w:type="gramEnd"/>
-      <w:r>
-        <w:rPr>
-          <w:rFonts w:ascii="Consolas" w:eastAsia="Times New Roman" w:hAnsi="Consolas" w:cs="Times New Roman"/>
-          <w:color w:val="333333"/>
-          <w:kern w:val="0"/>
-          <w:sz w:val="21"/>
-          <w:szCs w:val="21"/>
-          <w:shd w:val="clear" w:color="auto" w:fill="F9FAFB"/>
-          <w14:ligatures w14:val="none"/>
-        </w:rPr>
-        <w:t xml:space="preserve"> = </w:t>
-      </w:r>
-      <w:proofErr w:type="spellStart"/>
-      <w:proofErr w:type="gramStart"/>
-      <w:r>
-        <w:rPr>
-          <w:rFonts w:ascii="Consolas" w:eastAsia="Times New Roman" w:hAnsi="Consolas" w:cs="Times New Roman"/>
-          <w:color w:val="333333"/>
-          <w:kern w:val="0"/>
-          <w:sz w:val="21"/>
-          <w:szCs w:val="21"/>
-          <w:shd w:val="clear" w:color="auto" w:fill="F9FAFB"/>
-          <w14:ligatures w14:val="none"/>
-        </w:rPr>
-        <w:t>action.</w:t>
-      </w:r>
-      <w:r>
-        <w:rPr>
-          <w:rFonts w:ascii="Consolas" w:eastAsia="Times New Roman" w:hAnsi="Consolas" w:cs="Times New Roman"/>
-          <w:color w:val="333333"/>
-          <w:kern w:val="0"/>
-          <w:sz w:val="21"/>
-          <w:szCs w:val="21"/>
-          <w:bdr w:val="single" w:sz="2" w:space="0" w:color="E2E8F0" w:frame="1"/>
-          <w:shd w:val="clear" w:color="auto" w:fill="F9FAFB"/>
-          <w14:ligatures w14:val="none"/>
-        </w:rPr>
-        <w:t>payload</w:t>
-      </w:r>
-      <w:proofErr w:type="spellEnd"/>
-      <w:proofErr w:type="gramEnd"/>
-      <w:r>
-        <w:rPr>
-          <w:rFonts w:ascii="Consolas" w:eastAsia="Times New Roman" w:hAnsi="Consolas" w:cs="Times New Roman"/>
-          <w:color w:val="333333"/>
-          <w:kern w:val="0"/>
-          <w:sz w:val="21"/>
-          <w:szCs w:val="21"/>
-          <w:shd w:val="clear" w:color="auto" w:fill="F9FAFB"/>
-          <w14:ligatures w14:val="none"/>
-        </w:rPr>
-        <w:t xml:space="preserve">; </w:t>
-      </w:r>
-      <w:r>
-        <w:rPr>
-          <w:rFonts w:ascii="Consolas" w:eastAsia="Times New Roman" w:hAnsi="Consolas" w:cs="Times New Roman"/>
-          <w:color w:val="608B4E"/>
-          <w:kern w:val="0"/>
-          <w:sz w:val="21"/>
-          <w:szCs w:val="21"/>
-          <w:bdr w:val="single" w:sz="2" w:space="0" w:color="E2E8F0" w:frame="1"/>
-          <w:shd w:val="clear" w:color="auto" w:fill="F9FAFB"/>
-          <w14:ligatures w14:val="none"/>
-        </w:rPr>
-        <w:t xml:space="preserve">// </w:t>
-      </w:r>
-      <w:proofErr w:type="spellStart"/>
-      <w:r>
-        <w:rPr>
-          <w:rFonts w:ascii="Consolas" w:eastAsia="Times New Roman" w:hAnsi="Consolas" w:cs="Times New Roman"/>
-          <w:color w:val="608B4E"/>
-          <w:kern w:val="0"/>
-          <w:sz w:val="21"/>
-          <w:szCs w:val="21"/>
-          <w:bdr w:val="single" w:sz="2" w:space="0" w:color="E2E8F0" w:frame="1"/>
-          <w:shd w:val="clear" w:color="auto" w:fill="F9FAFB"/>
-          <w14:ligatures w14:val="none"/>
-        </w:rPr>
-        <w:t>Destructure</w:t>
-      </w:r>
-      <w:proofErr w:type="spellEnd"/>
-      <w:r>
-        <w:rPr>
-          <w:rFonts w:ascii="Consolas" w:eastAsia="Times New Roman" w:hAnsi="Consolas" w:cs="Times New Roman"/>
-          <w:color w:val="608B4E"/>
-          <w:kern w:val="0"/>
-          <w:sz w:val="21"/>
-          <w:szCs w:val="21"/>
-          <w:bdr w:val="single" w:sz="2" w:space="0" w:color="E2E8F0" w:frame="1"/>
-          <w:shd w:val="clear" w:color="auto" w:fill="F9FAFB"/>
-          <w14:ligatures w14:val="none"/>
-        </w:rPr>
-        <w:t xml:space="preserve"> product details from the action payload</w:t>
-      </w:r>
-    </w:p>
-    <w:p>
-      <w:pPr>
-        <w:spacing w:after="0" w:line="240" w:lineRule="auto"/>
-        <w:rPr>
-          <w:rFonts w:ascii="Consolas" w:eastAsia="Times New Roman" w:hAnsi="Consolas" w:cs="Times New Roman"/>
-          <w:color w:val="333333"/>
-          <w:kern w:val="0"/>
-          <w:sz w:val="21"/>
-          <w:szCs w:val="21"/>
-          <w:shd w:val="clear" w:color="auto" w:fill="F9FAFB"/>
-          <w14:ligatures w14:val="none"/>
-        </w:rPr>
-      </w:pPr>
-      <w:r>
-        <w:rPr>
-          <w:rFonts w:ascii="Consolas" w:eastAsia="Times New Roman" w:hAnsi="Consolas" w:cs="Times New Roman"/>
-          <w:color w:val="333333"/>
-          <w:kern w:val="0"/>
-          <w:sz w:val="21"/>
-          <w:szCs w:val="21"/>
-          <w:shd w:val="clear" w:color="auto" w:fill="F9FAFB"/>
-          <w14:ligatures w14:val="none"/>
-        </w:rPr>
-        <w:t xml:space="preserve">  </w:t>
-      </w:r>
-      <w:r>
-        <w:rPr>
-          <w:rFonts w:ascii="Consolas" w:eastAsia="Times New Roman" w:hAnsi="Consolas" w:cs="Times New Roman"/>
-          <w:color w:val="608B4E"/>
-          <w:kern w:val="0"/>
-          <w:sz w:val="21"/>
-          <w:szCs w:val="21"/>
-          <w:bdr w:val="single" w:sz="2" w:space="0" w:color="E2E8F0" w:frame="1"/>
-          <w:shd w:val="clear" w:color="auto" w:fill="F9FAFB"/>
-          <w14:ligatures w14:val="none"/>
-        </w:rPr>
-        <w:t>// Check if the item already exists in the cart by comparing names</w:t>
-      </w:r>
-    </w:p>
-    <w:p>
-      <w:pPr>
-        <w:spacing w:after="0" w:line="240" w:lineRule="auto"/>
-        <w:rPr>
-          <w:rFonts w:ascii="Consolas" w:eastAsia="Times New Roman" w:hAnsi="Consolas" w:cs="Times New Roman"/>
-          <w:color w:val="333333"/>
-          <w:kern w:val="0"/>
-          <w:sz w:val="21"/>
-          <w:szCs w:val="21"/>
-          <w:shd w:val="clear" w:color="auto" w:fill="F9FAFB"/>
-          <w14:ligatures w14:val="none"/>
-        </w:rPr>
-      </w:pPr>
-      <w:r>
-        <w:rPr>
-          <w:rFonts w:ascii="Consolas" w:eastAsia="Times New Roman" w:hAnsi="Consolas" w:cs="Times New Roman"/>
-          <w:color w:val="333333"/>
-          <w:kern w:val="0"/>
-          <w:sz w:val="21"/>
-          <w:szCs w:val="21"/>
-          <w:shd w:val="clear" w:color="auto" w:fill="F9FAFB"/>
-          <w14:ligatures w14:val="none"/>
-        </w:rPr>
-        <w:t xml:space="preserve">  </w:t>
-      </w:r>
-      <w:r>
-        <w:rPr>
-          <w:rFonts w:ascii="Consolas" w:eastAsia="Times New Roman" w:hAnsi="Consolas" w:cs="Times New Roman"/>
-          <w:color w:val="0000FF"/>
-          <w:kern w:val="0"/>
-          <w:sz w:val="21"/>
-          <w:szCs w:val="21"/>
-          <w:bdr w:val="single" w:sz="2" w:space="0" w:color="E2E8F0" w:frame="1"/>
-          <w:shd w:val="clear" w:color="auto" w:fill="F9FAFB"/>
-          <w14:ligatures w14:val="none"/>
-        </w:rPr>
-        <w:t>const</w:t>
-      </w:r>
-      <w:r>
-        <w:rPr>
-          <w:rFonts w:ascii="Consolas" w:eastAsia="Times New Roman" w:hAnsi="Consolas" w:cs="Times New Roman"/>
-          <w:color w:val="333333"/>
-          <w:kern w:val="0"/>
-          <w:sz w:val="21"/>
-          <w:szCs w:val="21"/>
-          <w:shd w:val="clear" w:color="auto" w:fill="F9FAFB"/>
-          <w14:ligatures w14:val="none"/>
-        </w:rPr>
-        <w:t xml:space="preserve"> </w:t>
-      </w:r>
-      <w:proofErr w:type="spellStart"/>
-      <w:r>
-        <w:rPr>
-          <w:rFonts w:ascii="Consolas" w:eastAsia="Times New Roman" w:hAnsi="Consolas" w:cs="Times New Roman"/>
-          <w:color w:val="333333"/>
-          <w:kern w:val="0"/>
-          <w:sz w:val="21"/>
-          <w:szCs w:val="21"/>
-          <w:shd w:val="clear" w:color="auto" w:fill="F9FAFB"/>
-          <w14:ligatures w14:val="none"/>
-        </w:rPr>
-        <w:t>existingItem</w:t>
-      </w:r>
-      <w:proofErr w:type="spellEnd"/>
-      <w:r>
-        <w:rPr>
-          <w:rFonts w:ascii="Consolas" w:eastAsia="Times New Roman" w:hAnsi="Consolas" w:cs="Times New Roman"/>
-          <w:color w:val="333333"/>
-          <w:kern w:val="0"/>
-          <w:sz w:val="21"/>
-          <w:szCs w:val="21"/>
-          <w:shd w:val="clear" w:color="auto" w:fill="F9FAFB"/>
-          <w14:ligatures w14:val="none"/>
-        </w:rPr>
-        <w:t xml:space="preserve"> = </w:t>
-      </w:r>
-      <w:proofErr w:type="spellStart"/>
-      <w:proofErr w:type="gramStart"/>
-      <w:r>
-        <w:rPr>
-          <w:rFonts w:ascii="Consolas" w:eastAsia="Times New Roman" w:hAnsi="Consolas" w:cs="Times New Roman"/>
-          <w:color w:val="333333"/>
-          <w:kern w:val="0"/>
-          <w:sz w:val="21"/>
-          <w:szCs w:val="21"/>
-          <w:shd w:val="clear" w:color="auto" w:fill="F9FAFB"/>
-          <w14:ligatures w14:val="none"/>
-        </w:rPr>
-        <w:t>state.</w:t>
-      </w:r>
-      <w:r>
-        <w:rPr>
-          <w:rFonts w:ascii="Consolas" w:eastAsia="Times New Roman" w:hAnsi="Consolas" w:cs="Times New Roman"/>
-          <w:color w:val="333333"/>
-          <w:kern w:val="0"/>
-          <w:sz w:val="21"/>
-          <w:szCs w:val="21"/>
-          <w:bdr w:val="single" w:sz="2" w:space="0" w:color="E2E8F0" w:frame="1"/>
-          <w:shd w:val="clear" w:color="auto" w:fill="F9FAFB"/>
-          <w14:ligatures w14:val="none"/>
-        </w:rPr>
-        <w:t>items</w:t>
-      </w:r>
-      <w:proofErr w:type="gramEnd"/>
-      <w:r>
-        <w:rPr>
-          <w:rFonts w:ascii="Consolas" w:eastAsia="Times New Roman" w:hAnsi="Consolas" w:cs="Times New Roman"/>
-          <w:color w:val="333333"/>
-          <w:kern w:val="0"/>
-          <w:sz w:val="21"/>
-          <w:szCs w:val="21"/>
-          <w:shd w:val="clear" w:color="auto" w:fill="F9FAFB"/>
-          <w14:ligatures w14:val="none"/>
-        </w:rPr>
-        <w:t>.</w:t>
-      </w:r>
-      <w:proofErr w:type="gramStart"/>
-      <w:r>
-        <w:rPr>
-          <w:rFonts w:ascii="Consolas" w:eastAsia="Times New Roman" w:hAnsi="Consolas" w:cs="Times New Roman"/>
-          <w:color w:val="A31515"/>
-          <w:kern w:val="0"/>
-          <w:sz w:val="21"/>
-          <w:szCs w:val="21"/>
-          <w:bdr w:val="single" w:sz="2" w:space="0" w:color="E2E8F0" w:frame="1"/>
-          <w:shd w:val="clear" w:color="auto" w:fill="F9FAFB"/>
-          <w14:ligatures w14:val="none"/>
-        </w:rPr>
-        <w:t>find</w:t>
-      </w:r>
-      <w:proofErr w:type="spellEnd"/>
-      <w:r>
-        <w:rPr>
-          <w:rFonts w:ascii="Consolas" w:eastAsia="Times New Roman" w:hAnsi="Consolas" w:cs="Times New Roman"/>
-          <w:color w:val="333333"/>
-          <w:kern w:val="0"/>
-          <w:sz w:val="21"/>
-          <w:szCs w:val="21"/>
-          <w:shd w:val="clear" w:color="auto" w:fill="F9FAFB"/>
-          <w14:ligatures w14:val="none"/>
-        </w:rPr>
-        <w:t>(</w:t>
-      </w:r>
-      <w:proofErr w:type="gramEnd"/>
-      <w:r>
-        <w:rPr>
-          <w:rFonts w:ascii="Consolas" w:eastAsia="Times New Roman" w:hAnsi="Consolas" w:cs="Times New Roman"/>
-          <w:color w:val="001080"/>
-          <w:kern w:val="0"/>
-          <w:sz w:val="21"/>
-          <w:szCs w:val="21"/>
-          <w:bdr w:val="single" w:sz="2" w:space="0" w:color="E2E8F0" w:frame="1"/>
-          <w:shd w:val="clear" w:color="auto" w:fill="F9FAFB"/>
-          <w14:ligatures w14:val="none"/>
-        </w:rPr>
-        <w:t>item</w:t>
-      </w:r>
-      <w:r>
-        <w:rPr>
-          <w:rFonts w:ascii="Consolas" w:eastAsia="Times New Roman" w:hAnsi="Consolas" w:cs="Times New Roman"/>
-          <w:color w:val="333333"/>
-          <w:kern w:val="0"/>
-          <w:sz w:val="21"/>
-          <w:szCs w:val="21"/>
-          <w:bdr w:val="single" w:sz="2" w:space="0" w:color="E2E8F0" w:frame="1"/>
-          <w:shd w:val="clear" w:color="auto" w:fill="F9FAFB"/>
-          <w14:ligatures w14:val="none"/>
-        </w:rPr>
-        <w:t xml:space="preserve"> =&gt;</w:t>
-      </w:r>
-      <w:r>
-        <w:rPr>
-          <w:rFonts w:ascii="Consolas" w:eastAsia="Times New Roman" w:hAnsi="Consolas" w:cs="Times New Roman"/>
-          <w:color w:val="333333"/>
-          <w:kern w:val="0"/>
-          <w:sz w:val="21"/>
-          <w:szCs w:val="21"/>
-          <w:shd w:val="clear" w:color="auto" w:fill="F9FAFB"/>
-          <w14:ligatures w14:val="none"/>
-        </w:rPr>
-        <w:t xml:space="preserve"> item.</w:t>
-      </w:r>
-      <w:r>
-        <w:rPr>
-          <w:rFonts w:ascii="Consolas" w:eastAsia="Times New Roman" w:hAnsi="Consolas" w:cs="Times New Roman"/>
-          <w:color w:val="333333"/>
-          <w:kern w:val="0"/>
-          <w:sz w:val="21"/>
-          <w:szCs w:val="21"/>
-          <w:bdr w:val="single" w:sz="2" w:space="0" w:color="E2E8F0" w:frame="1"/>
-          <w:shd w:val="clear" w:color="auto" w:fill="F9FAFB"/>
-          <w14:ligatures w14:val="none"/>
-        </w:rPr>
-        <w:t>name</w:t>
-      </w:r>
-      <w:r>
-        <w:rPr>
-          <w:rFonts w:ascii="Consolas" w:eastAsia="Times New Roman" w:hAnsi="Consolas" w:cs="Times New Roman"/>
-          <w:color w:val="333333"/>
-          <w:kern w:val="0"/>
-          <w:sz w:val="21"/>
-          <w:szCs w:val="21"/>
-          <w:shd w:val="clear" w:color="auto" w:fill="F9FAFB"/>
-          <w14:ligatures w14:val="none"/>
-        </w:rPr>
-        <w:t xml:space="preserve"> === name</w:t>
-      </w:r>
-      <w:proofErr w:type="gramStart"/>
-      <w:r>
-        <w:rPr>
-          <w:rFonts w:ascii="Consolas" w:eastAsia="Times New Roman" w:hAnsi="Consolas" w:cs="Times New Roman"/>
-          <w:color w:val="333333"/>
-          <w:kern w:val="0"/>
-          <w:sz w:val="21"/>
-          <w:szCs w:val="21"/>
-          <w:shd w:val="clear" w:color="auto" w:fill="F9FAFB"/>
-          <w14:ligatures w14:val="none"/>
-        </w:rPr>
-        <w:t>);</w:t>
-      </w:r>
-      <w:proofErr w:type="gramEnd"/>
-    </w:p>
-    <w:p>
-      <w:pPr>
-        <w:spacing w:after="0" w:line="240" w:lineRule="auto"/>
-        <w:rPr>
-          <w:rFonts w:ascii="Consolas" w:eastAsia="Times New Roman" w:hAnsi="Consolas" w:cs="Times New Roman"/>
-          <w:color w:val="333333"/>
-          <w:kern w:val="0"/>
-          <w:sz w:val="21"/>
-          <w:szCs w:val="21"/>
-          <w:shd w:val="clear" w:color="auto" w:fill="F9FAFB"/>
-          <w14:ligatures w14:val="none"/>
-        </w:rPr>
-      </w:pPr>
-      <w:r>
-        <w:rPr>
-          <w:rFonts w:ascii="Consolas" w:eastAsia="Times New Roman" w:hAnsi="Consolas" w:cs="Times New Roman"/>
-          <w:color w:val="333333"/>
-          <w:kern w:val="0"/>
-          <w:sz w:val="21"/>
-          <w:szCs w:val="21"/>
-          <w:shd w:val="clear" w:color="auto" w:fill="F9FAFB"/>
-          <w14:ligatures w14:val="none"/>
-        </w:rPr>
-        <w:t xml:space="preserve">  </w:t>
-      </w:r>
-      <w:r>
-        <w:rPr>
-          <w:rFonts w:ascii="Consolas" w:eastAsia="Times New Roman" w:hAnsi="Consolas" w:cs="Times New Roman"/>
-          <w:color w:val="0000FF"/>
-          <w:kern w:val="0"/>
-          <w:sz w:val="21"/>
-          <w:szCs w:val="21"/>
-          <w:bdr w:val="single" w:sz="2" w:space="0" w:color="E2E8F0" w:frame="1"/>
-          <w:shd w:val="clear" w:color="auto" w:fill="F9FAFB"/>
-          <w14:ligatures w14:val="none"/>
-        </w:rPr>
-        <w:t>if</w:t>
-      </w:r>
-      <w:r>
-        <w:rPr>
-          <w:rFonts w:ascii="Consolas" w:eastAsia="Times New Roman" w:hAnsi="Consolas" w:cs="Times New Roman"/>
-          <w:color w:val="333333"/>
-          <w:kern w:val="0"/>
-          <w:sz w:val="21"/>
-          <w:szCs w:val="21"/>
-          <w:shd w:val="clear" w:color="auto" w:fill="F9FAFB"/>
-          <w14:ligatures w14:val="none"/>
-        </w:rPr>
-        <w:t xml:space="preserve"> (</w:t>
-      </w:r>
-      <w:proofErr w:type="spellStart"/>
-      <w:proofErr w:type="gramStart"/>
-      <w:r>
-        <w:rPr>
-          <w:rFonts w:ascii="Consolas" w:eastAsia="Times New Roman" w:hAnsi="Consolas" w:cs="Times New Roman"/>
-          <w:color w:val="333333"/>
-          <w:kern w:val="0"/>
-          <w:sz w:val="21"/>
-          <w:szCs w:val="21"/>
-          <w:shd w:val="clear" w:color="auto" w:fill="F9FAFB"/>
-          <w14:ligatures w14:val="none"/>
-        </w:rPr>
-        <w:t>existingItem</w:t>
-      </w:r>
-      <w:proofErr w:type="spellEnd"/>
-      <w:r>
-        <w:rPr>
-          <w:rFonts w:ascii="Consolas" w:eastAsia="Times New Roman" w:hAnsi="Consolas" w:cs="Times New Roman"/>
-          <w:color w:val="333333"/>
-          <w:kern w:val="0"/>
-          <w:sz w:val="21"/>
-          <w:szCs w:val="21"/>
-          <w:shd w:val="clear" w:color="auto" w:fill="F9FAFB"/>
-          <w14:ligatures w14:val="none"/>
-        </w:rPr>
-        <w:t>) {</w:t>
-      </w:r>
-      <w:proofErr w:type="gramEnd"/>
-    </w:p>
-    <w:p>
-      <w:pPr>
-        <w:spacing w:after="0" w:line="240" w:lineRule="auto"/>
-        <w:rPr>
-          <w:rFonts w:ascii="Consolas" w:eastAsia="Times New Roman" w:hAnsi="Consolas" w:cs="Times New Roman"/>
-          <w:color w:val="333333"/>
-          <w:kern w:val="0"/>
-          <w:sz w:val="21"/>
-          <w:szCs w:val="21"/>
-          <w:shd w:val="clear" w:color="auto" w:fill="F9FAFB"/>
-          <w14:ligatures w14:val="none"/>
-        </w:rPr>
-      </w:pPr>
-      <w:r>
-        <w:rPr>
-          <w:rFonts w:ascii="Consolas" w:eastAsia="Times New Roman" w:hAnsi="Consolas" w:cs="Times New Roman"/>
-          <w:color w:val="333333"/>
-          <w:kern w:val="0"/>
-          <w:sz w:val="21"/>
-          <w:szCs w:val="21"/>
-          <w:shd w:val="clear" w:color="auto" w:fill="F9FAFB"/>
-          <w14:ligatures w14:val="none"/>
-        </w:rPr>
-        <w:t xml:space="preserve">    </w:t>
-      </w:r>
-      <w:r>
-        <w:rPr>
-          <w:rFonts w:ascii="Consolas" w:eastAsia="Times New Roman" w:hAnsi="Consolas" w:cs="Times New Roman"/>
-          <w:color w:val="608B4E"/>
-          <w:kern w:val="0"/>
-          <w:sz w:val="21"/>
-          <w:szCs w:val="21"/>
-          <w:bdr w:val="single" w:sz="2" w:space="0" w:color="E2E8F0" w:frame="1"/>
-          <w:shd w:val="clear" w:color="auto" w:fill="F9FAFB"/>
-          <w14:ligatures w14:val="none"/>
-        </w:rPr>
-        <w:t>// If item already exists in the cart, increase its quantity</w:t>
-      </w:r>
-    </w:p>
-    <w:p>
-      <w:pPr>
-        <w:spacing w:after="0" w:line="240" w:lineRule="auto"/>
-        <w:rPr>
-          <w:rFonts w:ascii="Consolas" w:eastAsia="Times New Roman" w:hAnsi="Consolas" w:cs="Times New Roman"/>
-          <w:color w:val="333333"/>
-          <w:kern w:val="0"/>
-          <w:sz w:val="21"/>
-          <w:szCs w:val="21"/>
-          <w:shd w:val="clear" w:color="auto" w:fill="F9FAFB"/>
-          <w14:ligatures w14:val="none"/>
-        </w:rPr>
-      </w:pPr>
-      <w:r>
-        <w:rPr>
-          <w:rFonts w:ascii="Consolas" w:eastAsia="Times New Roman" w:hAnsi="Consolas" w:cs="Times New Roman"/>
-          <w:color w:val="333333"/>
-          <w:kern w:val="0"/>
-          <w:sz w:val="21"/>
-          <w:szCs w:val="21"/>
-          <w:shd w:val="clear" w:color="auto" w:fill="F9FAFB"/>
-          <w14:ligatures w14:val="none"/>
-        </w:rPr>
-        <w:t xml:space="preserve">    </w:t>
-      </w:r>
-      <w:proofErr w:type="spellStart"/>
-      <w:r>
-        <w:rPr>
-          <w:rFonts w:ascii="Consolas" w:eastAsia="Times New Roman" w:hAnsi="Consolas" w:cs="Times New Roman"/>
-          <w:color w:val="333333"/>
-          <w:kern w:val="0"/>
-          <w:sz w:val="21"/>
-          <w:szCs w:val="21"/>
-          <w:shd w:val="clear" w:color="auto" w:fill="F9FAFB"/>
-          <w14:ligatures w14:val="none"/>
-        </w:rPr>
-        <w:t>existingItem.</w:t>
-      </w:r>
-      <w:r>
-        <w:rPr>
-          <w:rFonts w:ascii="Consolas" w:eastAsia="Times New Roman" w:hAnsi="Consolas" w:cs="Times New Roman"/>
-          <w:color w:val="333333"/>
-          <w:kern w:val="0"/>
-          <w:sz w:val="21"/>
-          <w:szCs w:val="21"/>
-          <w:bdr w:val="single" w:sz="2" w:space="0" w:color="E2E8F0" w:frame="1"/>
-          <w:shd w:val="clear" w:color="auto" w:fill="F9FAFB"/>
-          <w14:ligatures w14:val="none"/>
-        </w:rPr>
-        <w:t>quantity</w:t>
-      </w:r>
-      <w:proofErr w:type="spellEnd"/>
-      <w:r>
-        <w:rPr>
-          <w:rFonts w:ascii="Consolas" w:eastAsia="Times New Roman" w:hAnsi="Consolas" w:cs="Times New Roman"/>
-          <w:color w:val="333333"/>
-          <w:kern w:val="0"/>
-          <w:sz w:val="21"/>
-          <w:szCs w:val="21"/>
-          <w:shd w:val="clear" w:color="auto" w:fill="F9FAFB"/>
-          <w14:ligatures w14:val="none"/>
-        </w:rPr>
-        <w:t>+</w:t>
-      </w:r>
-      <w:proofErr w:type="gramStart"/>
-      <w:r>
-        <w:rPr>
-          <w:rFonts w:ascii="Consolas" w:eastAsia="Times New Roman" w:hAnsi="Consolas" w:cs="Times New Roman"/>
-          <w:color w:val="333333"/>
-          <w:kern w:val="0"/>
-          <w:sz w:val="21"/>
-          <w:szCs w:val="21"/>
-          <w:shd w:val="clear" w:color="auto" w:fill="F9FAFB"/>
-          <w14:ligatures w14:val="none"/>
-        </w:rPr>
-        <w:t>+;</w:t>
-      </w:r>
-      <w:proofErr w:type="gramEnd"/>
-    </w:p>
-    <w:p>
-      <w:pPr>
-        <w:spacing w:after="0" w:line="240" w:lineRule="auto"/>
-        <w:rPr>
-          <w:rFonts w:ascii="Consolas" w:eastAsia="Times New Roman" w:hAnsi="Consolas" w:cs="Times New Roman"/>
-          <w:color w:val="333333"/>
-          <w:kern w:val="0"/>
-          <w:sz w:val="21"/>
-          <w:szCs w:val="21"/>
-          <w:shd w:val="clear" w:color="auto" w:fill="F9FAFB"/>
-          <w14:ligatures w14:val="none"/>
-        </w:rPr>
-      </w:pPr>
-      <w:r>
-        <w:rPr>
-          <w:rFonts w:ascii="Consolas" w:eastAsia="Times New Roman" w:hAnsi="Consolas" w:cs="Times New Roman"/>
-          <w:color w:val="333333"/>
-          <w:kern w:val="0"/>
-          <w:sz w:val="21"/>
-          <w:szCs w:val="21"/>
-          <w:shd w:val="clear" w:color="auto" w:fill="F9FAFB"/>
-          <w14:ligatures w14:val="none"/>
-        </w:rPr>
-        <w:t xml:space="preserve">  } </w:t>
-      </w:r>
-      <w:r>
-        <w:rPr>
-          <w:rFonts w:ascii="Consolas" w:eastAsia="Times New Roman" w:hAnsi="Consolas" w:cs="Times New Roman"/>
-          <w:color w:val="0000FF"/>
-          <w:kern w:val="0"/>
-          <w:sz w:val="21"/>
-          <w:szCs w:val="21"/>
-          <w:bdr w:val="single" w:sz="2" w:space="0" w:color="E2E8F0" w:frame="1"/>
-          <w:shd w:val="clear" w:color="auto" w:fill="F9FAFB"/>
-          <w14:ligatures w14:val="none"/>
-        </w:rPr>
-        <w:t>else</w:t>
-      </w:r>
-      <w:r>
-        <w:rPr>
-          <w:rFonts w:ascii="Consolas" w:eastAsia="Times New Roman" w:hAnsi="Consolas" w:cs="Times New Roman"/>
-          <w:color w:val="333333"/>
-          <w:kern w:val="0"/>
-          <w:sz w:val="21"/>
-          <w:szCs w:val="21"/>
-          <w:shd w:val="clear" w:color="auto" w:fill="F9FAFB"/>
-          <w14:ligatures w14:val="none"/>
-        </w:rPr>
-        <w:t xml:space="preserve"> {</w:t>
-      </w:r>
-    </w:p>
-    <w:p>
-      <w:pPr>
-        <w:spacing w:after="0" w:line="240" w:lineRule="auto"/>
-        <w:rPr>
-          <w:rFonts w:ascii="Consolas" w:eastAsia="Times New Roman" w:hAnsi="Consolas" w:cs="Times New Roman"/>
-          <w:color w:val="333333"/>
-          <w:kern w:val="0"/>
-          <w:sz w:val="21"/>
-          <w:szCs w:val="21"/>
-          <w:shd w:val="clear" w:color="auto" w:fill="F9FAFB"/>
-          <w14:ligatures w14:val="none"/>
-        </w:rPr>
-      </w:pPr>
-      <w:r>
-        <w:rPr>
-          <w:rFonts w:ascii="Consolas" w:eastAsia="Times New Roman" w:hAnsi="Consolas" w:cs="Times New Roman"/>
-          <w:color w:val="333333"/>
-          <w:kern w:val="0"/>
-          <w:sz w:val="21"/>
-          <w:szCs w:val="21"/>
-          <w:shd w:val="clear" w:color="auto" w:fill="F9FAFB"/>
-          <w14:ligatures w14:val="none"/>
-        </w:rPr>
-        <w:t xml:space="preserve">    </w:t>
-      </w:r>
-      <w:r>
-        <w:rPr>
-          <w:rFonts w:ascii="Consolas" w:eastAsia="Times New Roman" w:hAnsi="Consolas" w:cs="Times New Roman"/>
-          <w:color w:val="608B4E"/>
-          <w:kern w:val="0"/>
-          <w:sz w:val="21"/>
-          <w:szCs w:val="21"/>
-          <w:bdr w:val="single" w:sz="2" w:space="0" w:color="E2E8F0" w:frame="1"/>
-          <w:shd w:val="clear" w:color="auto" w:fill="F9FAFB"/>
-          <w14:ligatures w14:val="none"/>
-        </w:rPr>
-        <w:t>// If item does not exist, add it to the cart with quantity 1</w:t>
-      </w:r>
-    </w:p>
-    <w:p>
-      <w:pPr>
-        <w:spacing w:after="0" w:line="240" w:lineRule="auto"/>
-        <w:rPr>
-          <w:rFonts w:ascii="Consolas" w:eastAsia="Times New Roman" w:hAnsi="Consolas" w:cs="Times New Roman"/>
-          <w:color w:val="333333"/>
-          <w:kern w:val="0"/>
-          <w:sz w:val="21"/>
-          <w:szCs w:val="21"/>
-          <w:shd w:val="clear" w:color="auto" w:fill="F9FAFB"/>
-          <w14:ligatures w14:val="none"/>
-        </w:rPr>
-      </w:pPr>
-      <w:r>
-        <w:rPr>
-          <w:rFonts w:ascii="Consolas" w:eastAsia="Times New Roman" w:hAnsi="Consolas" w:cs="Times New Roman"/>
-          <w:color w:val="333333"/>
-          <w:kern w:val="0"/>
-          <w:sz w:val="21"/>
-          <w:szCs w:val="21"/>
-          <w:shd w:val="clear" w:color="auto" w:fill="F9FAFB"/>
-          <w14:ligatures w14:val="none"/>
-        </w:rPr>
-        <w:t xml:space="preserve">    </w:t>
-      </w:r>
-      <w:proofErr w:type="spellStart"/>
-      <w:proofErr w:type="gramStart"/>
-      <w:r>
-        <w:rPr>
-          <w:rFonts w:ascii="Consolas" w:eastAsia="Times New Roman" w:hAnsi="Consolas" w:cs="Times New Roman"/>
-          <w:color w:val="333333"/>
-          <w:kern w:val="0"/>
-          <w:sz w:val="21"/>
-          <w:szCs w:val="21"/>
-          <w:shd w:val="clear" w:color="auto" w:fill="F9FAFB"/>
-          <w14:ligatures w14:val="none"/>
-        </w:rPr>
-        <w:t>state.</w:t>
-      </w:r>
-      <w:r>
-        <w:rPr>
-          <w:rFonts w:ascii="Consolas" w:eastAsia="Times New Roman" w:hAnsi="Consolas" w:cs="Times New Roman"/>
-          <w:color w:val="333333"/>
-          <w:kern w:val="0"/>
-          <w:sz w:val="21"/>
-          <w:szCs w:val="21"/>
-          <w:bdr w:val="single" w:sz="2" w:space="0" w:color="E2E8F0" w:frame="1"/>
-          <w:shd w:val="clear" w:color="auto" w:fill="F9FAFB"/>
-          <w14:ligatures w14:val="none"/>
-        </w:rPr>
-        <w:t>items</w:t>
-      </w:r>
-      <w:proofErr w:type="gramEnd"/>
-      <w:r>
-        <w:rPr>
-          <w:rFonts w:ascii="Consolas" w:eastAsia="Times New Roman" w:hAnsi="Consolas" w:cs="Times New Roman"/>
-          <w:color w:val="333333"/>
-          <w:kern w:val="0"/>
-          <w:sz w:val="21"/>
-          <w:szCs w:val="21"/>
-          <w:shd w:val="clear" w:color="auto" w:fill="F9FAFB"/>
-          <w14:ligatures w14:val="none"/>
-        </w:rPr>
-        <w:t>.</w:t>
-      </w:r>
-      <w:proofErr w:type="gramStart"/>
-      <w:r>
-        <w:rPr>
-          <w:rFonts w:ascii="Consolas" w:eastAsia="Times New Roman" w:hAnsi="Consolas" w:cs="Times New Roman"/>
-          <w:color w:val="A31515"/>
-          <w:kern w:val="0"/>
-          <w:sz w:val="21"/>
-          <w:szCs w:val="21"/>
-          <w:bdr w:val="single" w:sz="2" w:space="0" w:color="E2E8F0" w:frame="1"/>
-          <w:shd w:val="clear" w:color="auto" w:fill="F9FAFB"/>
-          <w14:ligatures w14:val="none"/>
-        </w:rPr>
-        <w:t>push</w:t>
-      </w:r>
-      <w:proofErr w:type="spellEnd"/>
-      <w:r>
-        <w:rPr>
-          <w:rFonts w:ascii="Consolas" w:eastAsia="Times New Roman" w:hAnsi="Consolas" w:cs="Times New Roman"/>
-          <w:color w:val="333333"/>
-          <w:kern w:val="0"/>
-          <w:sz w:val="21"/>
-          <w:szCs w:val="21"/>
-          <w:shd w:val="clear" w:color="auto" w:fill="F9FAFB"/>
-          <w14:ligatures w14:val="none"/>
-        </w:rPr>
-        <w:t>({ name</w:t>
-      </w:r>
-      <w:proofErr w:type="gramEnd"/>
-      <w:r>
-        <w:rPr>
-          <w:rFonts w:ascii="Consolas" w:eastAsia="Times New Roman" w:hAnsi="Consolas" w:cs="Times New Roman"/>
-          <w:color w:val="333333"/>
-          <w:kern w:val="0"/>
-          <w:sz w:val="21"/>
-          <w:szCs w:val="21"/>
-          <w:shd w:val="clear" w:color="auto" w:fill="F9FAFB"/>
-          <w14:ligatures w14:val="none"/>
-        </w:rPr>
-        <w:t xml:space="preserve">, image, cost, </w:t>
-      </w:r>
-      <w:r>
-        <w:rPr>
-          <w:rFonts w:ascii="Consolas" w:eastAsia="Times New Roman" w:hAnsi="Consolas" w:cs="Times New Roman"/>
-          <w:color w:val="A31515"/>
-          <w:kern w:val="0"/>
-          <w:sz w:val="21"/>
-          <w:szCs w:val="21"/>
-          <w:bdr w:val="single" w:sz="2" w:space="0" w:color="E2E8F0" w:frame="1"/>
-          <w:shd w:val="clear" w:color="auto" w:fill="F9FAFB"/>
-          <w14:ligatures w14:val="none"/>
-        </w:rPr>
-        <w:t>quantity</w:t>
-      </w:r>
-      <w:r>
-        <w:rPr>
-          <w:rFonts w:ascii="Consolas" w:eastAsia="Times New Roman" w:hAnsi="Consolas" w:cs="Times New Roman"/>
-          <w:color w:val="333333"/>
-          <w:kern w:val="0"/>
-          <w:sz w:val="21"/>
-          <w:szCs w:val="21"/>
-          <w:shd w:val="clear" w:color="auto" w:fill="F9FAFB"/>
-          <w14:ligatures w14:val="none"/>
-        </w:rPr>
-        <w:t xml:space="preserve">: </w:t>
-      </w:r>
-      <w:proofErr w:type="gramStart"/>
-      <w:r>
-        <w:rPr>
-          <w:rFonts w:ascii="Consolas" w:eastAsia="Times New Roman" w:hAnsi="Consolas" w:cs="Times New Roman"/>
-          <w:color w:val="B5CEA8"/>
-          <w:kern w:val="0"/>
-          <w:sz w:val="21"/>
-          <w:szCs w:val="21"/>
-          <w:bdr w:val="single" w:sz="2" w:space="0" w:color="E2E8F0" w:frame="1"/>
-          <w:shd w:val="clear" w:color="auto" w:fill="F9FAFB"/>
-          <w14:ligatures w14:val="none"/>
-        </w:rPr>
         <w:t>1</w:t>
       </w:r>
       <w:r>
@@ -1278,7 +1137,6 @@
         </w:rPr>
         <w:t xml:space="preserve"> });</w:t>
       </w:r>
-      <w:proofErr w:type="gramEnd"/>
     </w:p>
     <w:p>
       <w:pPr>
@@ -1342,7 +1200,6 @@
         <w:t>Now you need to complete code for the </w:t>
       </w:r>
       <w:proofErr w:type="spellStart"/>
-      <w:proofErr w:type="gramStart"/>
       <w:r>
         <w:rPr>
           <w:b/>
@@ -1356,21 +1213,12 @@
           <w:b/>
           <w:bCs/>
         </w:rPr>
-        <w:t>(</w:t>
-      </w:r>
-      <w:proofErr w:type="gramEnd"/>
-      <w:r>
-        <w:rPr>
-          <w:b/>
-          <w:bCs/>
-        </w:rPr>
-        <w:t>)</w:t>
+        <w:t>()</w:t>
       </w:r>
       <w:r>
         <w:t> and </w:t>
       </w:r>
       <w:proofErr w:type="spellStart"/>
-      <w:proofErr w:type="gramStart"/>
       <w:r>
         <w:rPr>
           <w:b/>
@@ -1384,15 +1232,7 @@
           <w:b/>
           <w:bCs/>
         </w:rPr>
-        <w:t>(</w:t>
-      </w:r>
-      <w:proofErr w:type="gramEnd"/>
-      <w:r>
-        <w:rPr>
-          <w:b/>
-          <w:bCs/>
-        </w:rPr>
-        <w:t>)</w:t>
+        <w:t>()</w:t>
       </w:r>
       <w:r>
         <w:t> reducers.</w:t>
@@ -1406,7 +1246,6 @@
         </w:numPr>
       </w:pPr>
       <w:proofErr w:type="spellStart"/>
-      <w:proofErr w:type="gramStart"/>
       <w:r>
         <w:rPr>
           <w:b/>
@@ -1420,15 +1259,7 @@
           <w:b/>
           <w:bCs/>
         </w:rPr>
-        <w:t>(</w:t>
-      </w:r>
-      <w:proofErr w:type="gramEnd"/>
-      <w:r>
-        <w:rPr>
-          <w:b/>
-          <w:bCs/>
-        </w:rPr>
-        <w:t>)</w:t>
+        <w:t>()</w:t>
       </w:r>
       <w:r>
         <w:t>: This reducer removes an item from the cart based on its name and gets called when the user wants to remove products from the cart.</w:t>
@@ -1446,7 +1277,6 @@
         </w:rPr>
       </w:pPr>
       <w:proofErr w:type="spellStart"/>
-      <w:proofErr w:type="gramStart"/>
       <w:r>
         <w:rPr>
           <w:rFonts w:ascii="Consolas" w:hAnsi="Consolas"/>
@@ -1470,7 +1300,6 @@
         <w:t>items</w:t>
       </w:r>
       <w:proofErr w:type="spellEnd"/>
-      <w:proofErr w:type="gramEnd"/>
       <w:r>
         <w:rPr>
           <w:rFonts w:ascii="Consolas" w:hAnsi="Consolas"/>
@@ -1482,7 +1311,6 @@
         <w:t xml:space="preserve"> = </w:t>
       </w:r>
       <w:proofErr w:type="spellStart"/>
-      <w:proofErr w:type="gramStart"/>
       <w:r>
         <w:rPr>
           <w:rFonts w:ascii="Consolas" w:hAnsi="Consolas"/>
@@ -1505,7 +1333,6 @@
         </w:rPr>
         <w:t>items</w:t>
       </w:r>
-      <w:proofErr w:type="gramEnd"/>
       <w:r>
         <w:rPr>
           <w:rFonts w:ascii="Consolas" w:hAnsi="Consolas"/>
@@ -1516,7 +1343,6 @@
         </w:rPr>
         <w:t>.</w:t>
       </w:r>
-      <w:proofErr w:type="gramStart"/>
       <w:r>
         <w:rPr>
           <w:rStyle w:val="hljs-title"/>
@@ -1540,7 +1366,6 @@
         </w:rPr>
         <w:t>(</w:t>
       </w:r>
-      <w:proofErr w:type="gramEnd"/>
       <w:r>
         <w:rPr>
           <w:rStyle w:val="hljs-params"/>
@@ -1573,18 +1398,7 @@
           <w:szCs w:val="21"/>
           <w:shd w:val="clear" w:color="auto" w:fill="F9FAFB"/>
         </w:rPr>
-        <w:t xml:space="preserve"> </w:t>
-      </w:r>
-      <w:proofErr w:type="gramStart"/>
-      <w:r>
-        <w:rPr>
-          <w:rFonts w:ascii="Consolas" w:hAnsi="Consolas"/>
-          <w:color w:val="333333"/>
-          <w:sz w:val="21"/>
-          <w:szCs w:val="21"/>
-          <w:shd w:val="clear" w:color="auto" w:fill="F9FAFB"/>
-        </w:rPr>
-        <w:t>item.</w:t>
+        <w:t xml:space="preserve"> item.</w:t>
       </w:r>
       <w:r>
         <w:rPr>
@@ -1606,21 +1420,9 @@
           <w:szCs w:val="21"/>
           <w:shd w:val="clear" w:color="auto" w:fill="F9FAFB"/>
         </w:rPr>
-        <w:t xml:space="preserve"> !</w:t>
-      </w:r>
-      <w:proofErr w:type="gramEnd"/>
-      <w:r>
-        <w:rPr>
-          <w:rFonts w:ascii="Consolas" w:hAnsi="Consolas"/>
-          <w:color w:val="333333"/>
-          <w:sz w:val="21"/>
-          <w:szCs w:val="21"/>
-          <w:shd w:val="clear" w:color="auto" w:fill="F9FAFB"/>
-        </w:rPr>
-        <w:t xml:space="preserve">== </w:t>
+        <w:t xml:space="preserve"> !== </w:t>
       </w:r>
       <w:proofErr w:type="spellStart"/>
-      <w:proofErr w:type="gramStart"/>
       <w:r>
         <w:rPr>
           <w:rFonts w:ascii="Consolas" w:hAnsi="Consolas"/>
@@ -1654,7 +1456,6 @@
         </w:rPr>
         <w:t>);</w:t>
       </w:r>
-      <w:proofErr w:type="gramEnd"/>
     </w:p>
     <w:p>
       <w:pPr>
@@ -1675,7 +1476,6 @@
         </w:numPr>
       </w:pPr>
       <w:proofErr w:type="spellStart"/>
-      <w:proofErr w:type="gramStart"/>
       <w:r>
         <w:rPr>
           <w:b/>
@@ -1689,21 +1489,12 @@
           <w:b/>
           <w:bCs/>
         </w:rPr>
-        <w:t>(</w:t>
-      </w:r>
-      <w:proofErr w:type="gramEnd"/>
-      <w:r>
-        <w:rPr>
-          <w:b/>
-          <w:bCs/>
-        </w:rPr>
-        <w:t>)</w:t>
+        <w:t>()</w:t>
       </w:r>
       <w:r>
         <w:t>: To create this function, start by extracting the item's name and amount from the </w:t>
       </w:r>
       <w:proofErr w:type="spellStart"/>
-      <w:proofErr w:type="gramStart"/>
       <w:r>
         <w:rPr>
           <w:b/>
@@ -1712,12 +1503,10 @@
         <w:t>action.payload</w:t>
       </w:r>
       <w:proofErr w:type="spellEnd"/>
-      <w:proofErr w:type="gramEnd"/>
       <w:r>
         <w:t>. Then, look for the item in the </w:t>
       </w:r>
       <w:proofErr w:type="spellStart"/>
-      <w:proofErr w:type="gramStart"/>
       <w:r>
         <w:rPr>
           <w:b/>
@@ -1726,7 +1515,6 @@
         <w:t>state.items</w:t>
       </w:r>
       <w:proofErr w:type="spellEnd"/>
-      <w:proofErr w:type="gramEnd"/>
       <w:r>
         <w:t xml:space="preserve"> array that </w:t>
       </w:r>
@@ -1771,48 +1559,168 @@
           <w:shd w:val="clear" w:color="auto" w:fill="F9FAFB"/>
           <w14:ligatures w14:val="none"/>
         </w:rPr>
+        <w:t xml:space="preserve"> { name, quantity } = </w:t>
+      </w:r>
+      <w:proofErr w:type="spellStart"/>
+      <w:r>
+        <w:rPr>
+          <w:rFonts w:ascii="Consolas" w:eastAsia="Times New Roman" w:hAnsi="Consolas" w:cs="Times New Roman"/>
+          <w:color w:val="333333"/>
+          <w:kern w:val="0"/>
+          <w:sz w:val="21"/>
+          <w:szCs w:val="21"/>
+          <w:shd w:val="clear" w:color="auto" w:fill="F9FAFB"/>
+          <w14:ligatures w14:val="none"/>
+        </w:rPr>
+        <w:t>action.</w:t>
+      </w:r>
+      <w:r>
+        <w:rPr>
+          <w:rFonts w:ascii="Consolas" w:eastAsia="Times New Roman" w:hAnsi="Consolas" w:cs="Times New Roman"/>
+          <w:color w:val="333333"/>
+          <w:kern w:val="0"/>
+          <w:sz w:val="21"/>
+          <w:szCs w:val="21"/>
+          <w:bdr w:val="single" w:sz="2" w:space="0" w:color="E2E8F0" w:frame="1"/>
+          <w:shd w:val="clear" w:color="auto" w:fill="F9FAFB"/>
+          <w14:ligatures w14:val="none"/>
+        </w:rPr>
+        <w:t>payload</w:t>
+      </w:r>
+      <w:proofErr w:type="spellEnd"/>
+      <w:r>
+        <w:rPr>
+          <w:rFonts w:ascii="Consolas" w:eastAsia="Times New Roman" w:hAnsi="Consolas" w:cs="Times New Roman"/>
+          <w:color w:val="333333"/>
+          <w:kern w:val="0"/>
+          <w:sz w:val="21"/>
+          <w:szCs w:val="21"/>
+          <w:shd w:val="clear" w:color="auto" w:fill="F9FAFB"/>
+          <w14:ligatures w14:val="none"/>
+        </w:rPr>
+        <w:t xml:space="preserve">; </w:t>
+      </w:r>
+      <w:r>
+        <w:rPr>
+          <w:rFonts w:ascii="Consolas" w:eastAsia="Times New Roman" w:hAnsi="Consolas" w:cs="Times New Roman"/>
+          <w:color w:val="608B4E"/>
+          <w:kern w:val="0"/>
+          <w:sz w:val="21"/>
+          <w:szCs w:val="21"/>
+          <w:bdr w:val="single" w:sz="2" w:space="0" w:color="E2E8F0" w:frame="1"/>
+          <w:shd w:val="clear" w:color="auto" w:fill="F9FAFB"/>
+          <w14:ligatures w14:val="none"/>
+        </w:rPr>
+        <w:t xml:space="preserve">// </w:t>
+      </w:r>
+      <w:proofErr w:type="spellStart"/>
+      <w:r>
+        <w:rPr>
+          <w:rFonts w:ascii="Consolas" w:eastAsia="Times New Roman" w:hAnsi="Consolas" w:cs="Times New Roman"/>
+          <w:color w:val="608B4E"/>
+          <w:kern w:val="0"/>
+          <w:sz w:val="21"/>
+          <w:szCs w:val="21"/>
+          <w:bdr w:val="single" w:sz="2" w:space="0" w:color="E2E8F0" w:frame="1"/>
+          <w:shd w:val="clear" w:color="auto" w:fill="F9FAFB"/>
+          <w14:ligatures w14:val="none"/>
+        </w:rPr>
+        <w:t>Destructure</w:t>
+      </w:r>
+      <w:proofErr w:type="spellEnd"/>
+      <w:r>
+        <w:rPr>
+          <w:rFonts w:ascii="Consolas" w:eastAsia="Times New Roman" w:hAnsi="Consolas" w:cs="Times New Roman"/>
+          <w:color w:val="608B4E"/>
+          <w:kern w:val="0"/>
+          <w:sz w:val="21"/>
+          <w:szCs w:val="21"/>
+          <w:bdr w:val="single" w:sz="2" w:space="0" w:color="E2E8F0" w:frame="1"/>
+          <w:shd w:val="clear" w:color="auto" w:fill="F9FAFB"/>
+          <w14:ligatures w14:val="none"/>
+        </w:rPr>
+        <w:t xml:space="preserve"> the product name and new quantity from the action payload</w:t>
+      </w:r>
+    </w:p>
+    <w:p>
+      <w:pPr>
+        <w:spacing w:after="0" w:line="240" w:lineRule="auto"/>
+        <w:rPr>
+          <w:rFonts w:ascii="Consolas" w:eastAsia="Times New Roman" w:hAnsi="Consolas" w:cs="Times New Roman"/>
+          <w:color w:val="333333"/>
+          <w:kern w:val="0"/>
+          <w:sz w:val="21"/>
+          <w:szCs w:val="21"/>
+          <w:shd w:val="clear" w:color="auto" w:fill="F9FAFB"/>
+          <w14:ligatures w14:val="none"/>
+        </w:rPr>
+      </w:pPr>
+      <w:r>
+        <w:rPr>
+          <w:rFonts w:ascii="Consolas" w:eastAsia="Times New Roman" w:hAnsi="Consolas" w:cs="Times New Roman"/>
+          <w:color w:val="608B4E"/>
+          <w:kern w:val="0"/>
+          <w:sz w:val="21"/>
+          <w:szCs w:val="21"/>
+          <w:bdr w:val="single" w:sz="2" w:space="0" w:color="E2E8F0" w:frame="1"/>
+          <w:shd w:val="clear" w:color="auto" w:fill="F9FAFB"/>
+          <w14:ligatures w14:val="none"/>
+        </w:rPr>
+        <w:t>// Find the item in the cart that matches the given name</w:t>
+      </w:r>
+    </w:p>
+    <w:p>
+      <w:pPr>
+        <w:spacing w:after="0" w:line="240" w:lineRule="auto"/>
+        <w:rPr>
+          <w:rFonts w:ascii="Consolas" w:eastAsia="Times New Roman" w:hAnsi="Consolas" w:cs="Times New Roman"/>
+          <w:color w:val="333333"/>
+          <w:kern w:val="0"/>
+          <w:sz w:val="21"/>
+          <w:szCs w:val="21"/>
+          <w:shd w:val="clear" w:color="auto" w:fill="F9FAFB"/>
+          <w14:ligatures w14:val="none"/>
+        </w:rPr>
+      </w:pPr>
+      <w:r>
+        <w:rPr>
+          <w:rFonts w:ascii="Consolas" w:eastAsia="Times New Roman" w:hAnsi="Consolas" w:cs="Times New Roman"/>
+          <w:color w:val="0000FF"/>
+          <w:kern w:val="0"/>
+          <w:sz w:val="21"/>
+          <w:szCs w:val="21"/>
+          <w:bdr w:val="single" w:sz="2" w:space="0" w:color="E2E8F0" w:frame="1"/>
+          <w:shd w:val="clear" w:color="auto" w:fill="F9FAFB"/>
+          <w14:ligatures w14:val="none"/>
+        </w:rPr>
+        <w:t>const</w:t>
+      </w:r>
+      <w:r>
+        <w:rPr>
+          <w:rFonts w:ascii="Consolas" w:eastAsia="Times New Roman" w:hAnsi="Consolas" w:cs="Times New Roman"/>
+          <w:color w:val="333333"/>
+          <w:kern w:val="0"/>
+          <w:sz w:val="21"/>
+          <w:szCs w:val="21"/>
+          <w:shd w:val="clear" w:color="auto" w:fill="F9FAFB"/>
+          <w14:ligatures w14:val="none"/>
+        </w:rPr>
         <w:t xml:space="preserve"> </w:t>
       </w:r>
-      <w:proofErr w:type="gramStart"/>
-      <w:r>
-        <w:rPr>
-          <w:rFonts w:ascii="Consolas" w:eastAsia="Times New Roman" w:hAnsi="Consolas" w:cs="Times New Roman"/>
-          <w:color w:val="333333"/>
-          <w:kern w:val="0"/>
-          <w:sz w:val="21"/>
-          <w:szCs w:val="21"/>
-          <w:shd w:val="clear" w:color="auto" w:fill="F9FAFB"/>
-          <w14:ligatures w14:val="none"/>
-        </w:rPr>
-        <w:t>{ name</w:t>
-      </w:r>
-      <w:proofErr w:type="gramEnd"/>
-      <w:r>
-        <w:rPr>
-          <w:rFonts w:ascii="Consolas" w:eastAsia="Times New Roman" w:hAnsi="Consolas" w:cs="Times New Roman"/>
-          <w:color w:val="333333"/>
-          <w:kern w:val="0"/>
-          <w:sz w:val="21"/>
-          <w:szCs w:val="21"/>
-          <w:shd w:val="clear" w:color="auto" w:fill="F9FAFB"/>
-          <w14:ligatures w14:val="none"/>
-        </w:rPr>
-        <w:t xml:space="preserve">, </w:t>
-      </w:r>
-      <w:proofErr w:type="gramStart"/>
-      <w:r>
-        <w:rPr>
-          <w:rFonts w:ascii="Consolas" w:eastAsia="Times New Roman" w:hAnsi="Consolas" w:cs="Times New Roman"/>
-          <w:color w:val="333333"/>
-          <w:kern w:val="0"/>
-          <w:sz w:val="21"/>
-          <w:szCs w:val="21"/>
-          <w:shd w:val="clear" w:color="auto" w:fill="F9FAFB"/>
-          <w14:ligatures w14:val="none"/>
-        </w:rPr>
-        <w:t>quantity }</w:t>
-      </w:r>
-      <w:proofErr w:type="gramEnd"/>
+      <w:proofErr w:type="spellStart"/>
+      <w:r>
+        <w:rPr>
+          <w:rFonts w:ascii="Consolas" w:eastAsia="Times New Roman" w:hAnsi="Consolas" w:cs="Times New Roman"/>
+          <w:color w:val="333333"/>
+          <w:kern w:val="0"/>
+          <w:sz w:val="21"/>
+          <w:szCs w:val="21"/>
+          <w:shd w:val="clear" w:color="auto" w:fill="F9FAFB"/>
+          <w14:ligatures w14:val="none"/>
+        </w:rPr>
+        <w:t>itemToUpdate</w:t>
+      </w:r>
+      <w:proofErr w:type="spellEnd"/>
       <w:r>
         <w:rPr>
           <w:rFonts w:ascii="Consolas" w:eastAsia="Times New Roman" w:hAnsi="Consolas" w:cs="Times New Roman"/>
@@ -1826,18 +1734,17 @@
         <w:t xml:space="preserve"> = </w:t>
       </w:r>
       <w:proofErr w:type="spellStart"/>
-      <w:proofErr w:type="gramStart"/>
-      <w:r>
-        <w:rPr>
-          <w:rFonts w:ascii="Consolas" w:eastAsia="Times New Roman" w:hAnsi="Consolas" w:cs="Times New Roman"/>
-          <w:color w:val="333333"/>
-          <w:kern w:val="0"/>
-          <w:sz w:val="21"/>
-          <w:szCs w:val="21"/>
-          <w:shd w:val="clear" w:color="auto" w:fill="F9FAFB"/>
-          <w14:ligatures w14:val="none"/>
-        </w:rPr>
-        <w:t>action.</w:t>
+      <w:r>
+        <w:rPr>
+          <w:rFonts w:ascii="Consolas" w:eastAsia="Times New Roman" w:hAnsi="Consolas" w:cs="Times New Roman"/>
+          <w:color w:val="333333"/>
+          <w:kern w:val="0"/>
+          <w:sz w:val="21"/>
+          <w:szCs w:val="21"/>
+          <w:shd w:val="clear" w:color="auto" w:fill="F9FAFB"/>
+          <w14:ligatures w14:val="none"/>
+        </w:rPr>
+        <w:t>state.</w:t>
       </w:r>
       <w:r>
         <w:rPr>
@@ -1850,26 +1757,50 @@
           <w:shd w:val="clear" w:color="auto" w:fill="F9FAFB"/>
           <w14:ligatures w14:val="none"/>
         </w:rPr>
-        <w:t>payload</w:t>
+        <w:t>items</w:t>
+      </w:r>
+      <w:r>
+        <w:rPr>
+          <w:rFonts w:ascii="Consolas" w:eastAsia="Times New Roman" w:hAnsi="Consolas" w:cs="Times New Roman"/>
+          <w:color w:val="333333"/>
+          <w:kern w:val="0"/>
+          <w:sz w:val="21"/>
+          <w:szCs w:val="21"/>
+          <w:shd w:val="clear" w:color="auto" w:fill="F9FAFB"/>
+          <w14:ligatures w14:val="none"/>
+        </w:rPr>
+        <w:t>.</w:t>
+      </w:r>
+      <w:r>
+        <w:rPr>
+          <w:rFonts w:ascii="Consolas" w:eastAsia="Times New Roman" w:hAnsi="Consolas" w:cs="Times New Roman"/>
+          <w:color w:val="A31515"/>
+          <w:kern w:val="0"/>
+          <w:sz w:val="21"/>
+          <w:szCs w:val="21"/>
+          <w:bdr w:val="single" w:sz="2" w:space="0" w:color="E2E8F0" w:frame="1"/>
+          <w:shd w:val="clear" w:color="auto" w:fill="F9FAFB"/>
+          <w14:ligatures w14:val="none"/>
+        </w:rPr>
+        <w:t>find</w:t>
       </w:r>
       <w:proofErr w:type="spellEnd"/>
-      <w:proofErr w:type="gramEnd"/>
-      <w:r>
-        <w:rPr>
-          <w:rFonts w:ascii="Consolas" w:eastAsia="Times New Roman" w:hAnsi="Consolas" w:cs="Times New Roman"/>
-          <w:color w:val="333333"/>
-          <w:kern w:val="0"/>
-          <w:sz w:val="21"/>
-          <w:szCs w:val="21"/>
-          <w:shd w:val="clear" w:color="auto" w:fill="F9FAFB"/>
-          <w14:ligatures w14:val="none"/>
-        </w:rPr>
-        <w:t xml:space="preserve">; </w:t>
-      </w:r>
-      <w:r>
-        <w:rPr>
-          <w:rFonts w:ascii="Consolas" w:eastAsia="Times New Roman" w:hAnsi="Consolas" w:cs="Times New Roman"/>
-          <w:color w:val="608B4E"/>
+      <w:r>
+        <w:rPr>
+          <w:rFonts w:ascii="Consolas" w:eastAsia="Times New Roman" w:hAnsi="Consolas" w:cs="Times New Roman"/>
+          <w:color w:val="333333"/>
+          <w:kern w:val="0"/>
+          <w:sz w:val="21"/>
+          <w:szCs w:val="21"/>
+          <w:shd w:val="clear" w:color="auto" w:fill="F9FAFB"/>
+          <w14:ligatures w14:val="none"/>
+        </w:rPr>
+        <w:t>(</w:t>
+      </w:r>
+      <w:r>
+        <w:rPr>
+          <w:rFonts w:ascii="Consolas" w:eastAsia="Times New Roman" w:hAnsi="Consolas" w:cs="Times New Roman"/>
+          <w:color w:val="001080"/>
           <w:kern w:val="0"/>
           <w:sz w:val="21"/>
           <w:szCs w:val="21"/>
@@ -1877,330 +1808,114 @@
           <w:shd w:val="clear" w:color="auto" w:fill="F9FAFB"/>
           <w14:ligatures w14:val="none"/>
         </w:rPr>
-        <w:t xml:space="preserve">// </w:t>
+        <w:t>item</w:t>
+      </w:r>
+      <w:r>
+        <w:rPr>
+          <w:rFonts w:ascii="Consolas" w:eastAsia="Times New Roman" w:hAnsi="Consolas" w:cs="Times New Roman"/>
+          <w:color w:val="333333"/>
+          <w:kern w:val="0"/>
+          <w:sz w:val="21"/>
+          <w:szCs w:val="21"/>
+          <w:bdr w:val="single" w:sz="2" w:space="0" w:color="E2E8F0" w:frame="1"/>
+          <w:shd w:val="clear" w:color="auto" w:fill="F9FAFB"/>
+          <w14:ligatures w14:val="none"/>
+        </w:rPr>
+        <w:t xml:space="preserve"> =&gt;</w:t>
+      </w:r>
+      <w:r>
+        <w:rPr>
+          <w:rFonts w:ascii="Consolas" w:eastAsia="Times New Roman" w:hAnsi="Consolas" w:cs="Times New Roman"/>
+          <w:color w:val="333333"/>
+          <w:kern w:val="0"/>
+          <w:sz w:val="21"/>
+          <w:szCs w:val="21"/>
+          <w:shd w:val="clear" w:color="auto" w:fill="F9FAFB"/>
+          <w14:ligatures w14:val="none"/>
+        </w:rPr>
+        <w:t xml:space="preserve"> item.</w:t>
+      </w:r>
+      <w:r>
+        <w:rPr>
+          <w:rFonts w:ascii="Consolas" w:eastAsia="Times New Roman" w:hAnsi="Consolas" w:cs="Times New Roman"/>
+          <w:color w:val="333333"/>
+          <w:kern w:val="0"/>
+          <w:sz w:val="21"/>
+          <w:szCs w:val="21"/>
+          <w:bdr w:val="single" w:sz="2" w:space="0" w:color="E2E8F0" w:frame="1"/>
+          <w:shd w:val="clear" w:color="auto" w:fill="F9FAFB"/>
+          <w14:ligatures w14:val="none"/>
+        </w:rPr>
+        <w:t>name</w:t>
+      </w:r>
+      <w:r>
+        <w:rPr>
+          <w:rFonts w:ascii="Consolas" w:eastAsia="Times New Roman" w:hAnsi="Consolas" w:cs="Times New Roman"/>
+          <w:color w:val="333333"/>
+          <w:kern w:val="0"/>
+          <w:sz w:val="21"/>
+          <w:szCs w:val="21"/>
+          <w:shd w:val="clear" w:color="auto" w:fill="F9FAFB"/>
+          <w14:ligatures w14:val="none"/>
+        </w:rPr>
+        <w:t xml:space="preserve"> === name);</w:t>
+      </w:r>
+    </w:p>
+    <w:p>
+      <w:pPr>
+        <w:spacing w:after="0" w:line="240" w:lineRule="auto"/>
+        <w:rPr>
+          <w:rFonts w:ascii="Consolas" w:eastAsia="Times New Roman" w:hAnsi="Consolas" w:cs="Times New Roman"/>
+          <w:color w:val="333333"/>
+          <w:kern w:val="0"/>
+          <w:sz w:val="21"/>
+          <w:szCs w:val="21"/>
+          <w:shd w:val="clear" w:color="auto" w:fill="F9FAFB"/>
+          <w14:ligatures w14:val="none"/>
+        </w:rPr>
+      </w:pPr>
+      <w:r>
+        <w:rPr>
+          <w:rFonts w:ascii="Consolas" w:eastAsia="Times New Roman" w:hAnsi="Consolas" w:cs="Times New Roman"/>
+          <w:color w:val="0000FF"/>
+          <w:kern w:val="0"/>
+          <w:sz w:val="21"/>
+          <w:szCs w:val="21"/>
+          <w:bdr w:val="single" w:sz="2" w:space="0" w:color="E2E8F0" w:frame="1"/>
+          <w:shd w:val="clear" w:color="auto" w:fill="F9FAFB"/>
+          <w14:ligatures w14:val="none"/>
+        </w:rPr>
+        <w:t>if</w:t>
+      </w:r>
+      <w:r>
+        <w:rPr>
+          <w:rFonts w:ascii="Consolas" w:eastAsia="Times New Roman" w:hAnsi="Consolas" w:cs="Times New Roman"/>
+          <w:color w:val="333333"/>
+          <w:kern w:val="0"/>
+          <w:sz w:val="21"/>
+          <w:szCs w:val="21"/>
+          <w:shd w:val="clear" w:color="auto" w:fill="F9FAFB"/>
+          <w14:ligatures w14:val="none"/>
+        </w:rPr>
+        <w:t xml:space="preserve"> (</w:t>
       </w:r>
       <w:proofErr w:type="spellStart"/>
       <w:r>
         <w:rPr>
           <w:rFonts w:ascii="Consolas" w:eastAsia="Times New Roman" w:hAnsi="Consolas" w:cs="Times New Roman"/>
-          <w:color w:val="608B4E"/>
-          <w:kern w:val="0"/>
-          <w:sz w:val="21"/>
-          <w:szCs w:val="21"/>
-          <w:bdr w:val="single" w:sz="2" w:space="0" w:color="E2E8F0" w:frame="1"/>
-          <w:shd w:val="clear" w:color="auto" w:fill="F9FAFB"/>
-          <w14:ligatures w14:val="none"/>
-        </w:rPr>
-        <w:t>Destructure</w:t>
+          <w:color w:val="333333"/>
+          <w:kern w:val="0"/>
+          <w:sz w:val="21"/>
+          <w:szCs w:val="21"/>
+          <w:shd w:val="clear" w:color="auto" w:fill="F9FAFB"/>
+          <w14:ligatures w14:val="none"/>
+        </w:rPr>
+        <w:t>itemToUpdate</w:t>
       </w:r>
       <w:proofErr w:type="spellEnd"/>
       <w:r>
         <w:rPr>
           <w:rFonts w:ascii="Consolas" w:eastAsia="Times New Roman" w:hAnsi="Consolas" w:cs="Times New Roman"/>
-          <w:color w:val="608B4E"/>
-          <w:kern w:val="0"/>
-          <w:sz w:val="21"/>
-          <w:szCs w:val="21"/>
-          <w:bdr w:val="single" w:sz="2" w:space="0" w:color="E2E8F0" w:frame="1"/>
-          <w:shd w:val="clear" w:color="auto" w:fill="F9FAFB"/>
-          <w14:ligatures w14:val="none"/>
-        </w:rPr>
-        <w:t xml:space="preserve"> the product name and new quantity from the action payload</w:t>
-      </w:r>
-    </w:p>
-    <w:p>
-      <w:pPr>
-        <w:spacing w:after="0" w:line="240" w:lineRule="auto"/>
-        <w:rPr>
-          <w:rFonts w:ascii="Consolas" w:eastAsia="Times New Roman" w:hAnsi="Consolas" w:cs="Times New Roman"/>
-          <w:color w:val="333333"/>
-          <w:kern w:val="0"/>
-          <w:sz w:val="21"/>
-          <w:szCs w:val="21"/>
-          <w:shd w:val="clear" w:color="auto" w:fill="F9FAFB"/>
-          <w14:ligatures w14:val="none"/>
-        </w:rPr>
-      </w:pPr>
-      <w:r>
-        <w:rPr>
-          <w:rFonts w:ascii="Consolas" w:eastAsia="Times New Roman" w:hAnsi="Consolas" w:cs="Times New Roman"/>
-          <w:color w:val="608B4E"/>
-          <w:kern w:val="0"/>
-          <w:sz w:val="21"/>
-          <w:szCs w:val="21"/>
-          <w:bdr w:val="single" w:sz="2" w:space="0" w:color="E2E8F0" w:frame="1"/>
-          <w:shd w:val="clear" w:color="auto" w:fill="F9FAFB"/>
-          <w14:ligatures w14:val="none"/>
-        </w:rPr>
-        <w:t>// Find the item in the cart that matches the given name</w:t>
-      </w:r>
-    </w:p>
-    <w:p>
-      <w:pPr>
-        <w:spacing w:after="0" w:line="240" w:lineRule="auto"/>
-        <w:rPr>
-          <w:rFonts w:ascii="Consolas" w:eastAsia="Times New Roman" w:hAnsi="Consolas" w:cs="Times New Roman"/>
-          <w:color w:val="333333"/>
-          <w:kern w:val="0"/>
-          <w:sz w:val="21"/>
-          <w:szCs w:val="21"/>
-          <w:shd w:val="clear" w:color="auto" w:fill="F9FAFB"/>
-          <w14:ligatures w14:val="none"/>
-        </w:rPr>
-      </w:pPr>
-      <w:r>
-        <w:rPr>
-          <w:rFonts w:ascii="Consolas" w:eastAsia="Times New Roman" w:hAnsi="Consolas" w:cs="Times New Roman"/>
-          <w:color w:val="0000FF"/>
-          <w:kern w:val="0"/>
-          <w:sz w:val="21"/>
-          <w:szCs w:val="21"/>
-          <w:bdr w:val="single" w:sz="2" w:space="0" w:color="E2E8F0" w:frame="1"/>
-          <w:shd w:val="clear" w:color="auto" w:fill="F9FAFB"/>
-          <w14:ligatures w14:val="none"/>
-        </w:rPr>
-        <w:t>const</w:t>
-      </w:r>
-      <w:r>
-        <w:rPr>
-          <w:rFonts w:ascii="Consolas" w:eastAsia="Times New Roman" w:hAnsi="Consolas" w:cs="Times New Roman"/>
-          <w:color w:val="333333"/>
-          <w:kern w:val="0"/>
-          <w:sz w:val="21"/>
-          <w:szCs w:val="21"/>
-          <w:shd w:val="clear" w:color="auto" w:fill="F9FAFB"/>
-          <w14:ligatures w14:val="none"/>
-        </w:rPr>
-        <w:t xml:space="preserve"> </w:t>
-      </w:r>
-      <w:proofErr w:type="spellStart"/>
-      <w:r>
-        <w:rPr>
-          <w:rFonts w:ascii="Consolas" w:eastAsia="Times New Roman" w:hAnsi="Consolas" w:cs="Times New Roman"/>
-          <w:color w:val="333333"/>
-          <w:kern w:val="0"/>
-          <w:sz w:val="21"/>
-          <w:szCs w:val="21"/>
-          <w:shd w:val="clear" w:color="auto" w:fill="F9FAFB"/>
-          <w14:ligatures w14:val="none"/>
-        </w:rPr>
-        <w:t>itemToUpdate</w:t>
-      </w:r>
-      <w:proofErr w:type="spellEnd"/>
-      <w:r>
-        <w:rPr>
-          <w:rFonts w:ascii="Consolas" w:eastAsia="Times New Roman" w:hAnsi="Consolas" w:cs="Times New Roman"/>
-          <w:color w:val="333333"/>
-          <w:kern w:val="0"/>
-          <w:sz w:val="21"/>
-          <w:szCs w:val="21"/>
-          <w:shd w:val="clear" w:color="auto" w:fill="F9FAFB"/>
-          <w14:ligatures w14:val="none"/>
-        </w:rPr>
-        <w:t xml:space="preserve"> = </w:t>
-      </w:r>
-      <w:proofErr w:type="spellStart"/>
-      <w:proofErr w:type="gramStart"/>
-      <w:r>
-        <w:rPr>
-          <w:rFonts w:ascii="Consolas" w:eastAsia="Times New Roman" w:hAnsi="Consolas" w:cs="Times New Roman"/>
-          <w:color w:val="333333"/>
-          <w:kern w:val="0"/>
-          <w:sz w:val="21"/>
-          <w:szCs w:val="21"/>
-          <w:shd w:val="clear" w:color="auto" w:fill="F9FAFB"/>
-          <w14:ligatures w14:val="none"/>
-        </w:rPr>
-        <w:t>state.</w:t>
-      </w:r>
-      <w:r>
-        <w:rPr>
-          <w:rFonts w:ascii="Consolas" w:eastAsia="Times New Roman" w:hAnsi="Consolas" w:cs="Times New Roman"/>
-          <w:color w:val="333333"/>
-          <w:kern w:val="0"/>
-          <w:sz w:val="21"/>
-          <w:szCs w:val="21"/>
-          <w:bdr w:val="single" w:sz="2" w:space="0" w:color="E2E8F0" w:frame="1"/>
-          <w:shd w:val="clear" w:color="auto" w:fill="F9FAFB"/>
-          <w14:ligatures w14:val="none"/>
-        </w:rPr>
-        <w:t>items</w:t>
-      </w:r>
-      <w:proofErr w:type="gramEnd"/>
-      <w:r>
-        <w:rPr>
-          <w:rFonts w:ascii="Consolas" w:eastAsia="Times New Roman" w:hAnsi="Consolas" w:cs="Times New Roman"/>
-          <w:color w:val="333333"/>
-          <w:kern w:val="0"/>
-          <w:sz w:val="21"/>
-          <w:szCs w:val="21"/>
-          <w:shd w:val="clear" w:color="auto" w:fill="F9FAFB"/>
-          <w14:ligatures w14:val="none"/>
-        </w:rPr>
-        <w:t>.</w:t>
-      </w:r>
-      <w:proofErr w:type="gramStart"/>
-      <w:r>
-        <w:rPr>
-          <w:rFonts w:ascii="Consolas" w:eastAsia="Times New Roman" w:hAnsi="Consolas" w:cs="Times New Roman"/>
-          <w:color w:val="A31515"/>
-          <w:kern w:val="0"/>
-          <w:sz w:val="21"/>
-          <w:szCs w:val="21"/>
-          <w:bdr w:val="single" w:sz="2" w:space="0" w:color="E2E8F0" w:frame="1"/>
-          <w:shd w:val="clear" w:color="auto" w:fill="F9FAFB"/>
-          <w14:ligatures w14:val="none"/>
-        </w:rPr>
-        <w:t>find</w:t>
-      </w:r>
-      <w:proofErr w:type="spellEnd"/>
-      <w:r>
-        <w:rPr>
-          <w:rFonts w:ascii="Consolas" w:eastAsia="Times New Roman" w:hAnsi="Consolas" w:cs="Times New Roman"/>
-          <w:color w:val="333333"/>
-          <w:kern w:val="0"/>
-          <w:sz w:val="21"/>
-          <w:szCs w:val="21"/>
-          <w:shd w:val="clear" w:color="auto" w:fill="F9FAFB"/>
-          <w14:ligatures w14:val="none"/>
-        </w:rPr>
-        <w:t>(</w:t>
-      </w:r>
-      <w:proofErr w:type="gramEnd"/>
-      <w:r>
-        <w:rPr>
-          <w:rFonts w:ascii="Consolas" w:eastAsia="Times New Roman" w:hAnsi="Consolas" w:cs="Times New Roman"/>
-          <w:color w:val="001080"/>
-          <w:kern w:val="0"/>
-          <w:sz w:val="21"/>
-          <w:szCs w:val="21"/>
-          <w:bdr w:val="single" w:sz="2" w:space="0" w:color="E2E8F0" w:frame="1"/>
-          <w:shd w:val="clear" w:color="auto" w:fill="F9FAFB"/>
-          <w14:ligatures w14:val="none"/>
-        </w:rPr>
-        <w:t>item</w:t>
-      </w:r>
-      <w:r>
-        <w:rPr>
-          <w:rFonts w:ascii="Consolas" w:eastAsia="Times New Roman" w:hAnsi="Consolas" w:cs="Times New Roman"/>
-          <w:color w:val="333333"/>
-          <w:kern w:val="0"/>
-          <w:sz w:val="21"/>
-          <w:szCs w:val="21"/>
-          <w:bdr w:val="single" w:sz="2" w:space="0" w:color="E2E8F0" w:frame="1"/>
-          <w:shd w:val="clear" w:color="auto" w:fill="F9FAFB"/>
-          <w14:ligatures w14:val="none"/>
-        </w:rPr>
-        <w:t xml:space="preserve"> =&gt;</w:t>
-      </w:r>
-      <w:r>
-        <w:rPr>
-          <w:rFonts w:ascii="Consolas" w:eastAsia="Times New Roman" w:hAnsi="Consolas" w:cs="Times New Roman"/>
-          <w:color w:val="333333"/>
-          <w:kern w:val="0"/>
-          <w:sz w:val="21"/>
-          <w:szCs w:val="21"/>
-          <w:shd w:val="clear" w:color="auto" w:fill="F9FAFB"/>
-          <w14:ligatures w14:val="none"/>
-        </w:rPr>
-        <w:t xml:space="preserve"> item.</w:t>
-      </w:r>
-      <w:r>
-        <w:rPr>
-          <w:rFonts w:ascii="Consolas" w:eastAsia="Times New Roman" w:hAnsi="Consolas" w:cs="Times New Roman"/>
-          <w:color w:val="333333"/>
-          <w:kern w:val="0"/>
-          <w:sz w:val="21"/>
-          <w:szCs w:val="21"/>
-          <w:bdr w:val="single" w:sz="2" w:space="0" w:color="E2E8F0" w:frame="1"/>
-          <w:shd w:val="clear" w:color="auto" w:fill="F9FAFB"/>
-          <w14:ligatures w14:val="none"/>
-        </w:rPr>
-        <w:t>name</w:t>
-      </w:r>
-      <w:r>
-        <w:rPr>
-          <w:rFonts w:ascii="Consolas" w:eastAsia="Times New Roman" w:hAnsi="Consolas" w:cs="Times New Roman"/>
-          <w:color w:val="333333"/>
-          <w:kern w:val="0"/>
-          <w:sz w:val="21"/>
-          <w:szCs w:val="21"/>
-          <w:shd w:val="clear" w:color="auto" w:fill="F9FAFB"/>
-          <w14:ligatures w14:val="none"/>
-        </w:rPr>
-        <w:t xml:space="preserve"> === name</w:t>
-      </w:r>
-      <w:proofErr w:type="gramStart"/>
-      <w:r>
-        <w:rPr>
-          <w:rFonts w:ascii="Consolas" w:eastAsia="Times New Roman" w:hAnsi="Consolas" w:cs="Times New Roman"/>
-          <w:color w:val="333333"/>
-          <w:kern w:val="0"/>
-          <w:sz w:val="21"/>
-          <w:szCs w:val="21"/>
-          <w:shd w:val="clear" w:color="auto" w:fill="F9FAFB"/>
-          <w14:ligatures w14:val="none"/>
-        </w:rPr>
-        <w:t>);</w:t>
-      </w:r>
-      <w:proofErr w:type="gramEnd"/>
-    </w:p>
-    <w:p>
-      <w:pPr>
-        <w:spacing w:after="0" w:line="240" w:lineRule="auto"/>
-        <w:rPr>
-          <w:rFonts w:ascii="Consolas" w:eastAsia="Times New Roman" w:hAnsi="Consolas" w:cs="Times New Roman"/>
-          <w:color w:val="333333"/>
-          <w:kern w:val="0"/>
-          <w:sz w:val="21"/>
-          <w:szCs w:val="21"/>
-          <w:shd w:val="clear" w:color="auto" w:fill="F9FAFB"/>
-          <w14:ligatures w14:val="none"/>
-        </w:rPr>
-      </w:pPr>
-      <w:r>
-        <w:rPr>
-          <w:rFonts w:ascii="Consolas" w:eastAsia="Times New Roman" w:hAnsi="Consolas" w:cs="Times New Roman"/>
-          <w:color w:val="0000FF"/>
-          <w:kern w:val="0"/>
-          <w:sz w:val="21"/>
-          <w:szCs w:val="21"/>
-          <w:bdr w:val="single" w:sz="2" w:space="0" w:color="E2E8F0" w:frame="1"/>
-          <w:shd w:val="clear" w:color="auto" w:fill="F9FAFB"/>
-          <w14:ligatures w14:val="none"/>
-        </w:rPr>
-        <w:t>if</w:t>
-      </w:r>
-      <w:r>
-        <w:rPr>
-          <w:rFonts w:ascii="Consolas" w:eastAsia="Times New Roman" w:hAnsi="Consolas" w:cs="Times New Roman"/>
-          <w:color w:val="333333"/>
-          <w:kern w:val="0"/>
-          <w:sz w:val="21"/>
-          <w:szCs w:val="21"/>
-          <w:shd w:val="clear" w:color="auto" w:fill="F9FAFB"/>
-          <w14:ligatures w14:val="none"/>
-        </w:rPr>
-        <w:t xml:space="preserve"> (</w:t>
-      </w:r>
-      <w:proofErr w:type="spellStart"/>
-      <w:proofErr w:type="gramStart"/>
-      <w:r>
-        <w:rPr>
-          <w:rFonts w:ascii="Consolas" w:eastAsia="Times New Roman" w:hAnsi="Consolas" w:cs="Times New Roman"/>
-          <w:color w:val="333333"/>
-          <w:kern w:val="0"/>
-          <w:sz w:val="21"/>
-          <w:szCs w:val="21"/>
-          <w:shd w:val="clear" w:color="auto" w:fill="F9FAFB"/>
-          <w14:ligatures w14:val="none"/>
-        </w:rPr>
-        <w:t>itemToUpdate</w:t>
-      </w:r>
-      <w:proofErr w:type="spellEnd"/>
-      <w:r>
-        <w:rPr>
-          <w:rFonts w:ascii="Consolas" w:eastAsia="Times New Roman" w:hAnsi="Consolas" w:cs="Times New Roman"/>
           <w:color w:val="333333"/>
           <w:kern w:val="0"/>
           <w:sz w:val="21"/>
@@ -2210,7 +1925,6 @@
         </w:rPr>
         <w:t>) {</w:t>
       </w:r>
-      <w:proofErr w:type="gramEnd"/>
     </w:p>
     <w:p>
       <w:pPr>
@@ -2337,7 +2051,6 @@
         <w:t>Export the action creators, </w:t>
       </w:r>
       <w:proofErr w:type="spellStart"/>
-      <w:proofErr w:type="gramStart"/>
       <w:r>
         <w:rPr>
           <w:b/>
@@ -2351,15 +2064,7 @@
           <w:b/>
           <w:bCs/>
         </w:rPr>
-        <w:t>(</w:t>
-      </w:r>
-      <w:proofErr w:type="gramEnd"/>
-      <w:r>
-        <w:rPr>
-          <w:b/>
-          <w:bCs/>
-        </w:rPr>
-        <w:t>)</w:t>
+        <w:t>()</w:t>
       </w:r>
       <w:r>
         <w:t> to use in </w:t>
@@ -2377,7 +2082,6 @@
         <w:t>, </w:t>
       </w:r>
       <w:proofErr w:type="spellStart"/>
-      <w:proofErr w:type="gramStart"/>
       <w:r>
         <w:rPr>
           <w:b/>
@@ -2391,21 +2095,12 @@
           <w:b/>
           <w:bCs/>
         </w:rPr>
-        <w:t>(</w:t>
-      </w:r>
-      <w:proofErr w:type="gramEnd"/>
-      <w:r>
-        <w:rPr>
-          <w:b/>
-          <w:bCs/>
-        </w:rPr>
-        <w:t>)</w:t>
+        <w:t>()</w:t>
       </w:r>
       <w:r>
         <w:t>, and </w:t>
       </w:r>
       <w:proofErr w:type="spellStart"/>
-      <w:proofErr w:type="gramStart"/>
       <w:r>
         <w:rPr>
           <w:b/>
@@ -2419,15 +2114,7 @@
           <w:b/>
           <w:bCs/>
         </w:rPr>
-        <w:t>(</w:t>
-      </w:r>
-      <w:proofErr w:type="gramEnd"/>
-      <w:r>
-        <w:rPr>
-          <w:b/>
-          <w:bCs/>
-        </w:rPr>
-        <w:t>)</w:t>
+        <w:t>()</w:t>
       </w:r>
       <w:r>
         <w:t>, to use in the </w:t>
@@ -2530,15 +2217,7 @@
         <w:t xml:space="preserve"> </w:t>
       </w:r>
       <w:r>
-        <w:t xml:space="preserve">component which displays the items held in the shopping cart. This component has </w:t>
-      </w:r>
-      <w:proofErr w:type="gramStart"/>
-      <w:r>
-        <w:t>a number of</w:t>
-      </w:r>
-      <w:proofErr w:type="gramEnd"/>
-      <w:r>
-        <w:t xml:space="preserve"> functionalities that you find in a typical shopping cart:</w:t>
+        <w:t>component which displays the items held in the shopping cart. This component has a number of functionalities that you find in a typical shopping cart:</w:t>
       </w:r>
     </w:p>
     <w:p>
@@ -2603,15 +2282,7 @@
     </w:p>
     <w:p>
       <w:r>
-        <w:t xml:space="preserve">When you are done, the cart page should look </w:t>
-      </w:r>
-      <w:proofErr w:type="gramStart"/>
-      <w:r>
-        <w:t>similar to</w:t>
-      </w:r>
-      <w:proofErr w:type="gramEnd"/>
-      <w:r>
-        <w:t xml:space="preserve"> the following:</w:t>
+        <w:t>When you are done, the cart page should look similar to the following:</w:t>
       </w:r>
     </w:p>
     <w:p>
@@ -2682,7 +2353,6 @@
         <w:t>In the </w:t>
       </w:r>
       <w:proofErr w:type="spellStart"/>
-      <w:proofErr w:type="gramStart"/>
       <w:r>
         <w:rPr>
           <w:b/>
@@ -2696,34 +2366,10 @@
           <w:b/>
           <w:bCs/>
         </w:rPr>
-        <w:t>(</w:t>
-      </w:r>
-      <w:proofErr w:type="gramEnd"/>
-      <w:r>
-        <w:rPr>
-          <w:b/>
-          <w:bCs/>
-        </w:rPr>
-        <w:t>)</w:t>
-      </w:r>
-      <w:r>
-        <w:t xml:space="preserve"> you need a function to calculate the cost of </w:t>
-      </w:r>
-      <w:proofErr w:type="gramStart"/>
-      <w:r>
-        <w:t>all of</w:t>
-      </w:r>
-      <w:proofErr w:type="gramEnd"/>
-      <w:r>
-        <w:t xml:space="preserve"> the items in the cart. There are </w:t>
-      </w:r>
-      <w:proofErr w:type="gramStart"/>
-      <w:r>
-        <w:t>a number of</w:t>
-      </w:r>
-      <w:proofErr w:type="gramEnd"/>
-      <w:r>
-        <w:t xml:space="preserve"> ways you can calculate this.</w:t>
+        <w:t>()</w:t>
+      </w:r>
+      <w:r>
+        <w:t> you need a function to calculate the cost of all of the items in the cart. There are a number of ways you can calculate this.</w:t>
       </w:r>
     </w:p>
     <w:p>
@@ -2783,7 +2429,6 @@
         <w:t> array using </w:t>
       </w:r>
       <w:proofErr w:type="spellStart"/>
-      <w:proofErr w:type="gramStart"/>
       <w:r>
         <w:rPr>
           <w:b/>
@@ -2792,7 +2437,6 @@
         <w:t>cart.forEach</w:t>
       </w:r>
       <w:proofErr w:type="spellEnd"/>
-      <w:proofErr w:type="gramEnd"/>
       <w:r>
         <w:rPr>
           <w:b/>
@@ -2882,29 +2526,12 @@
         <w:t>(</w:t>
       </w:r>
       <w:proofErr w:type="spellStart"/>
-      <w:proofErr w:type="gramStart"/>
-      <w:r>
-        <w:rPr>
-          <w:b/>
-          <w:bCs/>
-        </w:rPr>
-        <w:t>item.cost</w:t>
-      </w:r>
-      <w:proofErr w:type="gramEnd"/>
-      <w:r>
-        <w:rPr>
-          <w:b/>
-          <w:bCs/>
-        </w:rPr>
-        <w:t>.</w:t>
-      </w:r>
-      <w:proofErr w:type="gramStart"/>
-      <w:r>
-        <w:rPr>
-          <w:b/>
-          <w:bCs/>
-        </w:rPr>
-        <w:t>substring</w:t>
+      <w:r>
+        <w:rPr>
+          <w:b/>
+          <w:bCs/>
+        </w:rPr>
+        <w:t>item.cost.substring</w:t>
       </w:r>
       <w:proofErr w:type="spellEnd"/>
       <w:r>
@@ -2912,15 +2539,7 @@
           <w:b/>
           <w:bCs/>
         </w:rPr>
-        <w:t>(</w:t>
-      </w:r>
-      <w:proofErr w:type="gramEnd"/>
-      <w:r>
-        <w:rPr>
-          <w:b/>
-          <w:bCs/>
-        </w:rPr>
-        <w:t>1))</w:t>
+        <w:t>(1))</w:t>
       </w:r>
       <w:r>
         <w:t>, then multiply it by the </w:t>
@@ -3001,7 +2620,6 @@
         <w:t>Users should be able to return to the plant listing page to continue shopping while on the shopping cart page. So, in the </w:t>
       </w:r>
       <w:proofErr w:type="spellStart"/>
-      <w:proofErr w:type="gramStart"/>
       <w:r>
         <w:rPr>
           <w:b/>
@@ -3015,15 +2633,7 @@
           <w:b/>
           <w:bCs/>
         </w:rPr>
-        <w:t>(</w:t>
-      </w:r>
-      <w:proofErr w:type="gramEnd"/>
-      <w:r>
-        <w:rPr>
-          <w:b/>
-          <w:bCs/>
-        </w:rPr>
-        <w:t>)</w:t>
+        <w:t>()</w:t>
       </w:r>
       <w:r>
         <w:t> function, call the </w:t>
@@ -3071,7 +2681,6 @@
         <w:t>In this project, you are not required to provide the </w:t>
       </w:r>
       <w:proofErr w:type="spellStart"/>
-      <w:proofErr w:type="gramStart"/>
       <w:r>
         <w:rPr>
           <w:b/>
@@ -3085,45 +2694,157 @@
           <w:b/>
           <w:bCs/>
         </w:rPr>
+        <w:t>()</w:t>
+      </w:r>
+      <w:r>
+        <w:t> function, but you may wish to for further exploration and practice. For now, just add in the following code to alert the user this function will get added at a later date.</w:t>
+      </w:r>
+    </w:p>
+    <w:p>
+      <w:pPr>
+        <w:spacing w:after="0" w:line="240" w:lineRule="auto"/>
+        <w:rPr>
+          <w:rFonts w:ascii="Consolas" w:eastAsia="Times New Roman" w:hAnsi="Consolas" w:cs="Times New Roman"/>
+          <w:color w:val="333333"/>
+          <w:kern w:val="0"/>
+          <w:sz w:val="21"/>
+          <w:szCs w:val="21"/>
+          <w:shd w:val="clear" w:color="auto" w:fill="F9FAFB"/>
+          <w14:ligatures w14:val="none"/>
+        </w:rPr>
+      </w:pPr>
+      <w:r>
+        <w:rPr>
+          <w:rFonts w:ascii="Consolas" w:eastAsia="Times New Roman" w:hAnsi="Consolas" w:cs="Times New Roman"/>
+          <w:color w:val="0000FF"/>
+          <w:kern w:val="0"/>
+          <w:sz w:val="21"/>
+          <w:szCs w:val="21"/>
+          <w:bdr w:val="single" w:sz="2" w:space="0" w:color="E2E8F0" w:frame="1"/>
+          <w:shd w:val="clear" w:color="auto" w:fill="F9FAFB"/>
+          <w14:ligatures w14:val="none"/>
+        </w:rPr>
+        <w:t>const</w:t>
+      </w:r>
+      <w:r>
+        <w:rPr>
+          <w:rFonts w:ascii="Consolas" w:eastAsia="Times New Roman" w:hAnsi="Consolas" w:cs="Times New Roman"/>
+          <w:color w:val="333333"/>
+          <w:kern w:val="0"/>
+          <w:sz w:val="21"/>
+          <w:szCs w:val="21"/>
+          <w:shd w:val="clear" w:color="auto" w:fill="F9FAFB"/>
+          <w14:ligatures w14:val="none"/>
+        </w:rPr>
+        <w:t xml:space="preserve"> </w:t>
+      </w:r>
+      <w:proofErr w:type="spellStart"/>
+      <w:r>
+        <w:rPr>
+          <w:rFonts w:ascii="Consolas" w:eastAsia="Times New Roman" w:hAnsi="Consolas" w:cs="Times New Roman"/>
+          <w:color w:val="A31515"/>
+          <w:kern w:val="0"/>
+          <w:sz w:val="21"/>
+          <w:szCs w:val="21"/>
+          <w:bdr w:val="single" w:sz="2" w:space="0" w:color="E2E8F0" w:frame="1"/>
+          <w:shd w:val="clear" w:color="auto" w:fill="F9FAFB"/>
+          <w14:ligatures w14:val="none"/>
+        </w:rPr>
+        <w:t>handleCheckoutShopping</w:t>
+      </w:r>
+      <w:proofErr w:type="spellEnd"/>
+      <w:r>
+        <w:rPr>
+          <w:rFonts w:ascii="Consolas" w:eastAsia="Times New Roman" w:hAnsi="Consolas" w:cs="Times New Roman"/>
+          <w:color w:val="333333"/>
+          <w:kern w:val="0"/>
+          <w:sz w:val="21"/>
+          <w:szCs w:val="21"/>
+          <w:shd w:val="clear" w:color="auto" w:fill="F9FAFB"/>
+          <w14:ligatures w14:val="none"/>
+        </w:rPr>
+        <w:t xml:space="preserve"> = (</w:t>
+      </w:r>
+      <w:r>
+        <w:rPr>
+          <w:rFonts w:ascii="Consolas" w:eastAsia="Times New Roman" w:hAnsi="Consolas" w:cs="Times New Roman"/>
+          <w:color w:val="001080"/>
+          <w:kern w:val="0"/>
+          <w:sz w:val="21"/>
+          <w:szCs w:val="21"/>
+          <w:bdr w:val="single" w:sz="2" w:space="0" w:color="E2E8F0" w:frame="1"/>
+          <w:shd w:val="clear" w:color="auto" w:fill="F9FAFB"/>
+          <w14:ligatures w14:val="none"/>
+        </w:rPr>
+        <w:t>e</w:t>
+      </w:r>
+      <w:r>
+        <w:rPr>
+          <w:rFonts w:ascii="Consolas" w:eastAsia="Times New Roman" w:hAnsi="Consolas" w:cs="Times New Roman"/>
+          <w:color w:val="333333"/>
+          <w:kern w:val="0"/>
+          <w:sz w:val="21"/>
+          <w:szCs w:val="21"/>
+          <w:shd w:val="clear" w:color="auto" w:fill="F9FAFB"/>
+          <w14:ligatures w14:val="none"/>
+        </w:rPr>
+        <w:t>) =&gt; {</w:t>
+      </w:r>
+    </w:p>
+    <w:p>
+      <w:pPr>
+        <w:spacing w:after="0" w:line="240" w:lineRule="auto"/>
+        <w:rPr>
+          <w:rFonts w:ascii="Consolas" w:eastAsia="Times New Roman" w:hAnsi="Consolas" w:cs="Times New Roman"/>
+          <w:color w:val="333333"/>
+          <w:kern w:val="0"/>
+          <w:sz w:val="21"/>
+          <w:szCs w:val="21"/>
+          <w:shd w:val="clear" w:color="auto" w:fill="F9FAFB"/>
+          <w14:ligatures w14:val="none"/>
+        </w:rPr>
+      </w:pPr>
+      <w:r>
+        <w:rPr>
+          <w:rFonts w:ascii="Consolas" w:eastAsia="Times New Roman" w:hAnsi="Consolas" w:cs="Times New Roman"/>
+          <w:color w:val="333333"/>
+          <w:kern w:val="0"/>
+          <w:sz w:val="21"/>
+          <w:szCs w:val="21"/>
+          <w:shd w:val="clear" w:color="auto" w:fill="F9FAFB"/>
+          <w14:ligatures w14:val="none"/>
+        </w:rPr>
+        <w:t xml:space="preserve">  </w:t>
+      </w:r>
+      <w:r>
+        <w:rPr>
+          <w:rFonts w:ascii="Consolas" w:eastAsia="Times New Roman" w:hAnsi="Consolas" w:cs="Times New Roman"/>
+          <w:color w:val="A31515"/>
+          <w:kern w:val="0"/>
+          <w:sz w:val="21"/>
+          <w:szCs w:val="21"/>
+          <w:bdr w:val="single" w:sz="2" w:space="0" w:color="E2E8F0" w:frame="1"/>
+          <w:shd w:val="clear" w:color="auto" w:fill="F9FAFB"/>
+          <w14:ligatures w14:val="none"/>
+        </w:rPr>
+        <w:t>alert</w:t>
+      </w:r>
+      <w:r>
+        <w:rPr>
+          <w:rFonts w:ascii="Consolas" w:eastAsia="Times New Roman" w:hAnsi="Consolas" w:cs="Times New Roman"/>
+          <w:color w:val="333333"/>
+          <w:kern w:val="0"/>
+          <w:sz w:val="21"/>
+          <w:szCs w:val="21"/>
+          <w:shd w:val="clear" w:color="auto" w:fill="F9FAFB"/>
+          <w14:ligatures w14:val="none"/>
+        </w:rPr>
         <w:t>(</w:t>
       </w:r>
-      <w:proofErr w:type="gramEnd"/>
-      <w:r>
-        <w:rPr>
-          <w:b/>
-          <w:bCs/>
-        </w:rPr>
-        <w:t>)</w:t>
-      </w:r>
-      <w:r>
-        <w:t xml:space="preserve"> function, but you may wish to for further exploration and practice. For now, just add in the following code to alert the user this function will get added </w:t>
-      </w:r>
-      <w:proofErr w:type="gramStart"/>
-      <w:r>
-        <w:t>at a later date</w:t>
-      </w:r>
-      <w:proofErr w:type="gramEnd"/>
-      <w:r>
-        <w:t>.</w:t>
-      </w:r>
-    </w:p>
-    <w:p>
-      <w:pPr>
-        <w:spacing w:after="0" w:line="240" w:lineRule="auto"/>
-        <w:rPr>
-          <w:rFonts w:ascii="Consolas" w:eastAsia="Times New Roman" w:hAnsi="Consolas" w:cs="Times New Roman"/>
-          <w:color w:val="333333"/>
-          <w:kern w:val="0"/>
-          <w:sz w:val="21"/>
-          <w:szCs w:val="21"/>
-          <w:shd w:val="clear" w:color="auto" w:fill="F9FAFB"/>
-          <w14:ligatures w14:val="none"/>
-        </w:rPr>
-      </w:pPr>
-      <w:r>
-        <w:rPr>
-          <w:rFonts w:ascii="Consolas" w:eastAsia="Times New Roman" w:hAnsi="Consolas" w:cs="Times New Roman"/>
-          <w:color w:val="0000FF"/>
+      <w:r>
+        <w:rPr>
+          <w:rFonts w:ascii="Consolas" w:eastAsia="Times New Roman" w:hAnsi="Consolas" w:cs="Times New Roman"/>
+          <w:color w:val="A31515"/>
           <w:kern w:val="0"/>
           <w:sz w:val="21"/>
           <w:szCs w:val="21"/>
@@ -3131,139 +2852,8 @@
           <w:shd w:val="clear" w:color="auto" w:fill="F9FAFB"/>
           <w14:ligatures w14:val="none"/>
         </w:rPr>
-        <w:t>const</w:t>
-      </w:r>
-      <w:r>
-        <w:rPr>
-          <w:rFonts w:ascii="Consolas" w:eastAsia="Times New Roman" w:hAnsi="Consolas" w:cs="Times New Roman"/>
-          <w:color w:val="333333"/>
-          <w:kern w:val="0"/>
-          <w:sz w:val="21"/>
-          <w:szCs w:val="21"/>
-          <w:shd w:val="clear" w:color="auto" w:fill="F9FAFB"/>
-          <w14:ligatures w14:val="none"/>
-        </w:rPr>
-        <w:t xml:space="preserve"> </w:t>
-      </w:r>
-      <w:proofErr w:type="spellStart"/>
-      <w:r>
-        <w:rPr>
-          <w:rFonts w:ascii="Consolas" w:eastAsia="Times New Roman" w:hAnsi="Consolas" w:cs="Times New Roman"/>
-          <w:color w:val="A31515"/>
-          <w:kern w:val="0"/>
-          <w:sz w:val="21"/>
-          <w:szCs w:val="21"/>
-          <w:bdr w:val="single" w:sz="2" w:space="0" w:color="E2E8F0" w:frame="1"/>
-          <w:shd w:val="clear" w:color="auto" w:fill="F9FAFB"/>
-          <w14:ligatures w14:val="none"/>
-        </w:rPr>
-        <w:t>handleCheckoutShopping</w:t>
-      </w:r>
-      <w:proofErr w:type="spellEnd"/>
-      <w:r>
-        <w:rPr>
-          <w:rFonts w:ascii="Consolas" w:eastAsia="Times New Roman" w:hAnsi="Consolas" w:cs="Times New Roman"/>
-          <w:color w:val="333333"/>
-          <w:kern w:val="0"/>
-          <w:sz w:val="21"/>
-          <w:szCs w:val="21"/>
-          <w:shd w:val="clear" w:color="auto" w:fill="F9FAFB"/>
-          <w14:ligatures w14:val="none"/>
-        </w:rPr>
-        <w:t xml:space="preserve"> = (</w:t>
-      </w:r>
-      <w:r>
-        <w:rPr>
-          <w:rFonts w:ascii="Consolas" w:eastAsia="Times New Roman" w:hAnsi="Consolas" w:cs="Times New Roman"/>
-          <w:color w:val="001080"/>
-          <w:kern w:val="0"/>
-          <w:sz w:val="21"/>
-          <w:szCs w:val="21"/>
-          <w:bdr w:val="single" w:sz="2" w:space="0" w:color="E2E8F0" w:frame="1"/>
-          <w:shd w:val="clear" w:color="auto" w:fill="F9FAFB"/>
-          <w14:ligatures w14:val="none"/>
-        </w:rPr>
-        <w:t>e</w:t>
-      </w:r>
-      <w:r>
-        <w:rPr>
-          <w:rFonts w:ascii="Consolas" w:eastAsia="Times New Roman" w:hAnsi="Consolas" w:cs="Times New Roman"/>
-          <w:color w:val="333333"/>
-          <w:kern w:val="0"/>
-          <w:sz w:val="21"/>
-          <w:szCs w:val="21"/>
-          <w:shd w:val="clear" w:color="auto" w:fill="F9FAFB"/>
-          <w14:ligatures w14:val="none"/>
-        </w:rPr>
-        <w:t>) =&gt; {</w:t>
-      </w:r>
-    </w:p>
-    <w:p>
-      <w:pPr>
-        <w:spacing w:after="0" w:line="240" w:lineRule="auto"/>
-        <w:rPr>
-          <w:rFonts w:ascii="Consolas" w:eastAsia="Times New Roman" w:hAnsi="Consolas" w:cs="Times New Roman"/>
-          <w:color w:val="333333"/>
-          <w:kern w:val="0"/>
-          <w:sz w:val="21"/>
-          <w:szCs w:val="21"/>
-          <w:shd w:val="clear" w:color="auto" w:fill="F9FAFB"/>
-          <w14:ligatures w14:val="none"/>
-        </w:rPr>
-      </w:pPr>
-      <w:r>
-        <w:rPr>
-          <w:rFonts w:ascii="Consolas" w:eastAsia="Times New Roman" w:hAnsi="Consolas" w:cs="Times New Roman"/>
-          <w:color w:val="333333"/>
-          <w:kern w:val="0"/>
-          <w:sz w:val="21"/>
-          <w:szCs w:val="21"/>
-          <w:shd w:val="clear" w:color="auto" w:fill="F9FAFB"/>
-          <w14:ligatures w14:val="none"/>
-        </w:rPr>
-        <w:t xml:space="preserve">  </w:t>
-      </w:r>
-      <w:proofErr w:type="gramStart"/>
-      <w:r>
-        <w:rPr>
-          <w:rFonts w:ascii="Consolas" w:eastAsia="Times New Roman" w:hAnsi="Consolas" w:cs="Times New Roman"/>
-          <w:color w:val="A31515"/>
-          <w:kern w:val="0"/>
-          <w:sz w:val="21"/>
-          <w:szCs w:val="21"/>
-          <w:bdr w:val="single" w:sz="2" w:space="0" w:color="E2E8F0" w:frame="1"/>
-          <w:shd w:val="clear" w:color="auto" w:fill="F9FAFB"/>
-          <w14:ligatures w14:val="none"/>
-        </w:rPr>
-        <w:t>alert</w:t>
-      </w:r>
-      <w:r>
-        <w:rPr>
-          <w:rFonts w:ascii="Consolas" w:eastAsia="Times New Roman" w:hAnsi="Consolas" w:cs="Times New Roman"/>
-          <w:color w:val="333333"/>
-          <w:kern w:val="0"/>
-          <w:sz w:val="21"/>
-          <w:szCs w:val="21"/>
-          <w:shd w:val="clear" w:color="auto" w:fill="F9FAFB"/>
-          <w14:ligatures w14:val="none"/>
-        </w:rPr>
-        <w:t>(</w:t>
-      </w:r>
-      <w:proofErr w:type="gramEnd"/>
-      <w:r>
-        <w:rPr>
-          <w:rFonts w:ascii="Consolas" w:eastAsia="Times New Roman" w:hAnsi="Consolas" w:cs="Times New Roman"/>
-          <w:color w:val="A31515"/>
-          <w:kern w:val="0"/>
-          <w:sz w:val="21"/>
-          <w:szCs w:val="21"/>
-          <w:bdr w:val="single" w:sz="2" w:space="0" w:color="E2E8F0" w:frame="1"/>
-          <w:shd w:val="clear" w:color="auto" w:fill="F9FAFB"/>
-          <w14:ligatures w14:val="none"/>
-        </w:rPr>
         <w:t>'Functionality to be added for future reference'</w:t>
       </w:r>
-      <w:proofErr w:type="gramStart"/>
       <w:r>
         <w:rPr>
           <w:rFonts w:ascii="Consolas" w:eastAsia="Times New Roman" w:hAnsi="Consolas" w:cs="Times New Roman"/>
@@ -3276,21 +2866,19 @@
         </w:rPr>
         <w:t>);</w:t>
       </w:r>
-      <w:proofErr w:type="gramEnd"/>
-    </w:p>
-    <w:p>
-      <w:pPr>
-        <w:rPr>
-          <w:rFonts w:ascii="Consolas" w:eastAsia="Times New Roman" w:hAnsi="Consolas" w:cs="Times New Roman"/>
-          <w:color w:val="333333"/>
-          <w:kern w:val="0"/>
-          <w:sz w:val="21"/>
-          <w:szCs w:val="21"/>
-          <w:shd w:val="clear" w:color="auto" w:fill="F9FAFB"/>
-          <w14:ligatures w14:val="none"/>
-        </w:rPr>
-      </w:pPr>
-      <w:proofErr w:type="gramStart"/>
+    </w:p>
+    <w:p>
+      <w:pPr>
+        <w:rPr>
+          <w:rFonts w:ascii="Consolas" w:eastAsia="Times New Roman" w:hAnsi="Consolas" w:cs="Times New Roman"/>
+          <w:color w:val="333333"/>
+          <w:kern w:val="0"/>
+          <w:sz w:val="21"/>
+          <w:szCs w:val="21"/>
+          <w:shd w:val="clear" w:color="auto" w:fill="F9FAFB"/>
+          <w14:ligatures w14:val="none"/>
+        </w:rPr>
+      </w:pPr>
       <w:r>
         <w:rPr>
           <w:rFonts w:ascii="Consolas" w:eastAsia="Times New Roman" w:hAnsi="Consolas" w:cs="Times New Roman"/>
@@ -3303,7 +2891,6 @@
         </w:rPr>
         <w:t>};</w:t>
       </w:r>
-      <w:proofErr w:type="gramEnd"/>
     </w:p>
     <w:p>
       <w:pPr>
@@ -3327,7 +2914,6 @@
         <w:t>For the </w:t>
       </w:r>
       <w:proofErr w:type="spellStart"/>
-      <w:proofErr w:type="gramStart"/>
       <w:r>
         <w:rPr>
           <w:b/>
@@ -3341,21 +2927,12 @@
           <w:b/>
           <w:bCs/>
         </w:rPr>
-        <w:t>(</w:t>
-      </w:r>
-      <w:proofErr w:type="gramEnd"/>
-      <w:r>
-        <w:rPr>
-          <w:b/>
-          <w:bCs/>
-        </w:rPr>
-        <w:t>)</w:t>
+        <w:t>()</w:t>
       </w:r>
       <w:r>
         <w:t> and </w:t>
       </w:r>
       <w:proofErr w:type="spellStart"/>
-      <w:proofErr w:type="gramStart"/>
       <w:r>
         <w:rPr>
           <w:b/>
@@ -3369,21 +2946,12 @@
           <w:b/>
           <w:bCs/>
         </w:rPr>
-        <w:t>(</w:t>
-      </w:r>
-      <w:proofErr w:type="gramEnd"/>
-      <w:r>
-        <w:rPr>
-          <w:b/>
-          <w:bCs/>
-        </w:rPr>
-        <w:t>)</w:t>
+        <w:t>()</w:t>
       </w:r>
       <w:r>
         <w:t> functions, you need to dispatch the </w:t>
       </w:r>
       <w:proofErr w:type="spellStart"/>
-      <w:proofErr w:type="gramStart"/>
       <w:r>
         <w:rPr>
           <w:b/>
@@ -3397,26 +2965,10 @@
           <w:b/>
           <w:bCs/>
         </w:rPr>
-        <w:t>(</w:t>
-      </w:r>
-      <w:proofErr w:type="gramEnd"/>
-      <w:r>
-        <w:rPr>
-          <w:b/>
-          <w:bCs/>
-        </w:rPr>
-        <w:t>)</w:t>
-      </w:r>
-      <w:r>
-        <w:t xml:space="preserve"> reducer </w:t>
-      </w:r>
-      <w:proofErr w:type="gramStart"/>
-      <w:r>
-        <w:t>in</w:t>
-      </w:r>
-      <w:proofErr w:type="gramEnd"/>
-      <w:r>
-        <w:t xml:space="preserve"> the </w:t>
+        <w:t>()</w:t>
+      </w:r>
+      <w:r>
+        <w:t> reducer in the </w:t>
       </w:r>
       <w:proofErr w:type="spellStart"/>
       <w:r>
@@ -3431,7 +2983,6 @@
         <w:t> file. In the function argument, either add one to the </w:t>
       </w:r>
       <w:proofErr w:type="spellStart"/>
-      <w:proofErr w:type="gramStart"/>
       <w:r>
         <w:rPr>
           <w:b/>
@@ -3440,7 +2991,6 @@
         <w:t>item.quantity</w:t>
       </w:r>
       <w:proofErr w:type="spellEnd"/>
-      <w:proofErr w:type="gramEnd"/>
       <w:r>
         <w:t> value or subtract one, respectively.</w:t>
       </w:r>
@@ -3456,7 +3006,6 @@
         <w:t>Also, for the </w:t>
       </w:r>
       <w:proofErr w:type="spellStart"/>
-      <w:proofErr w:type="gramStart"/>
       <w:r>
         <w:rPr>
           <w:b/>
@@ -3470,15 +3019,7 @@
           <w:b/>
           <w:bCs/>
         </w:rPr>
-        <w:t>(</w:t>
-      </w:r>
-      <w:proofErr w:type="gramEnd"/>
-      <w:r>
-        <w:rPr>
-          <w:b/>
-          <w:bCs/>
-        </w:rPr>
-        <w:t>)</w:t>
+        <w:t>()</w:t>
       </w:r>
       <w:r>
         <w:t> you will need an if-else to handle the case. -- If the item's quantity is greater than 1, dispatch </w:t>
@@ -3588,7 +3129,6 @@
           <w:shd w:val="clear" w:color="auto" w:fill="F9FAFB"/>
         </w:rPr>
       </w:pPr>
-      <w:proofErr w:type="gramStart"/>
       <w:r>
         <w:rPr>
           <w:rFonts w:ascii="Consolas" w:hAnsi="Consolas"/>
@@ -3619,9 +3159,9 @@
           <w:szCs w:val="21"/>
           <w:shd w:val="clear" w:color="auto" w:fill="F9FAFB"/>
         </w:rPr>
-        <w:t>({ name</w:t>
-      </w:r>
-      <w:proofErr w:type="gramEnd"/>
+        <w:t xml:space="preserve">({ name: item.name, quantity: </w:t>
+      </w:r>
+      <w:proofErr w:type="spellStart"/>
       <w:r>
         <w:rPr>
           <w:rFonts w:ascii="Consolas" w:hAnsi="Consolas"/>
@@ -3630,10 +3170,9 @@
           <w:szCs w:val="21"/>
           <w:shd w:val="clear" w:color="auto" w:fill="F9FAFB"/>
         </w:rPr>
-        <w:t xml:space="preserve">: item.name, quantity: </w:t>
-      </w:r>
-      <w:proofErr w:type="spellStart"/>
-      <w:proofErr w:type="gramStart"/>
+        <w:t>item.quantity</w:t>
+      </w:r>
+      <w:proofErr w:type="spellEnd"/>
       <w:r>
         <w:rPr>
           <w:rFonts w:ascii="Consolas" w:hAnsi="Consolas"/>
@@ -3642,54 +3181,8 @@
           <w:szCs w:val="21"/>
           <w:shd w:val="clear" w:color="auto" w:fill="F9FAFB"/>
         </w:rPr>
-        <w:t>item.quantity</w:t>
-      </w:r>
-      <w:proofErr w:type="spellEnd"/>
-      <w:proofErr w:type="gramEnd"/>
-      <w:r>
-        <w:rPr>
-          <w:rFonts w:ascii="Consolas" w:hAnsi="Consolas"/>
-          <w:color w:val="333333"/>
-          <w:sz w:val="21"/>
-          <w:szCs w:val="21"/>
-          <w:shd w:val="clear" w:color="auto" w:fill="F9FAFB"/>
-        </w:rPr>
-        <w:t xml:space="preserve"> + </w:t>
-      </w:r>
-      <w:proofErr w:type="gramStart"/>
-      <w:r>
-        <w:rPr>
-          <w:rFonts w:ascii="Consolas" w:hAnsi="Consolas"/>
-          <w:color w:val="333333"/>
-          <w:sz w:val="21"/>
-          <w:szCs w:val="21"/>
-          <w:shd w:val="clear" w:color="auto" w:fill="F9FAFB"/>
-        </w:rPr>
-        <w:t>1 }</w:t>
-      </w:r>
-      <w:proofErr w:type="gramEnd"/>
-      <w:r>
-        <w:rPr>
-          <w:rFonts w:ascii="Consolas" w:hAnsi="Consolas"/>
-          <w:color w:val="333333"/>
-          <w:sz w:val="21"/>
-          <w:szCs w:val="21"/>
-          <w:shd w:val="clear" w:color="auto" w:fill="F9FAFB"/>
-        </w:rPr>
-        <w:t>)</w:t>
-      </w:r>
-      <w:proofErr w:type="gramStart"/>
-      <w:r>
-        <w:rPr>
-          <w:rFonts w:ascii="Consolas" w:hAnsi="Consolas"/>
-          <w:color w:val="333333"/>
-          <w:sz w:val="21"/>
-          <w:szCs w:val="21"/>
-          <w:shd w:val="clear" w:color="auto" w:fill="F9FAFB"/>
-        </w:rPr>
-        <w:t>);</w:t>
-      </w:r>
-      <w:proofErr w:type="gramEnd"/>
+        <w:t xml:space="preserve"> + 1 }));</w:t>
+      </w:r>
     </w:p>
     <w:p>
       <w:pPr>
@@ -3724,7 +3217,6 @@
         <w:t>For the </w:t>
       </w:r>
       <w:proofErr w:type="spellStart"/>
-      <w:proofErr w:type="gramStart"/>
       <w:r>
         <w:rPr>
           <w:b/>
@@ -3738,15 +3230,7 @@
           <w:b/>
           <w:bCs/>
         </w:rPr>
-        <w:t>(</w:t>
-      </w:r>
-      <w:proofErr w:type="gramEnd"/>
-      <w:r>
-        <w:rPr>
-          <w:b/>
-          <w:bCs/>
-        </w:rPr>
-        <w:t>)</w:t>
+        <w:t>()</w:t>
       </w:r>
       <w:r>
         <w:t> function you need to dispatch the </w:t>
@@ -3786,7 +3270,6 @@
         <w:t>Calculate the total cost for an item by multiplying its quantity with its unit price in the </w:t>
       </w:r>
       <w:proofErr w:type="spellStart"/>
-      <w:proofErr w:type="gramStart"/>
       <w:r>
         <w:rPr>
           <w:b/>
@@ -3800,15 +3283,7 @@
           <w:b/>
           <w:bCs/>
         </w:rPr>
-        <w:t>(</w:t>
-      </w:r>
-      <w:proofErr w:type="gramEnd"/>
-      <w:r>
-        <w:rPr>
-          <w:b/>
-          <w:bCs/>
-        </w:rPr>
-        <w:t>)</w:t>
+        <w:t>()</w:t>
       </w:r>
       <w:r>
         <w:t> function.</w:t>
@@ -3841,29 +3316,12 @@
         <w:t>(</w:t>
       </w:r>
       <w:proofErr w:type="spellStart"/>
-      <w:proofErr w:type="gramStart"/>
-      <w:r>
-        <w:rPr>
-          <w:b/>
-          <w:bCs/>
-        </w:rPr>
-        <w:t>item.cost</w:t>
-      </w:r>
-      <w:proofErr w:type="gramEnd"/>
-      <w:r>
-        <w:rPr>
-          <w:b/>
-          <w:bCs/>
-        </w:rPr>
-        <w:t>.</w:t>
-      </w:r>
-      <w:proofErr w:type="gramStart"/>
-      <w:r>
-        <w:rPr>
-          <w:b/>
-          <w:bCs/>
-        </w:rPr>
-        <w:t>substring</w:t>
+      <w:r>
+        <w:rPr>
+          <w:b/>
+          <w:bCs/>
+        </w:rPr>
+        <w:t>item.cost.substring</w:t>
       </w:r>
       <w:proofErr w:type="spellEnd"/>
       <w:r>
@@ -3871,15 +3329,7 @@
           <w:b/>
           <w:bCs/>
         </w:rPr>
-        <w:t>(</w:t>
-      </w:r>
-      <w:proofErr w:type="gramEnd"/>
-      <w:r>
-        <w:rPr>
-          <w:b/>
-          <w:bCs/>
-        </w:rPr>
-        <w:t>1))</w:t>
+        <w:t>(1))</w:t>
       </w:r>
       <w:r>
         <w:t> before performing the multiplication.</w:t>
@@ -3953,7 +3403,6 @@
           <w:iCs/>
         </w:rPr>
       </w:pPr>
-      <w:proofErr w:type="gramStart"/>
       <w:r>
         <w:rPr>
           <w:i/>
@@ -3970,7 +3419,6 @@
         <w:t>the</w:t>
       </w:r>
       <w:proofErr w:type="spellEnd"/>
-      <w:proofErr w:type="gramEnd"/>
       <w:r>
         <w:rPr>
           <w:i/>
@@ -4115,13 +3563,8 @@
       </w:r>
       <w:proofErr w:type="spellEnd"/>
       <w:r>
-        <w:t>(product)</w:t>
-      </w:r>
-      <w:proofErr w:type="gramStart"/>
-      <w:r>
-        <w:t>);</w:t>
-      </w:r>
-      <w:proofErr w:type="gramEnd"/>
+        <w:t>(product));</w:t>
+      </w:r>
     </w:p>
     <w:p/>
     <w:p>
@@ -4212,35 +3655,34 @@
           <w:color w:val="1F2937"/>
           <w:shd w:val="clear" w:color="auto" w:fill="FFFFFF"/>
         </w:rPr>
-        <w:t xml:space="preserve"> = () =&gt; </w:t>
-      </w:r>
-      <w:proofErr w:type="gramStart"/>
+        <w:t xml:space="preserve"> = () =&gt; { return </w:t>
+      </w:r>
+      <w:proofErr w:type="spellStart"/>
       <w:r>
         <w:rPr>
           <w:rFonts w:ascii="__IBM_Plex_Sans_Fallback_c8daab" w:hAnsi="__IBM_Plex_Sans_Fallback_c8daab"/>
           <w:color w:val="1F2937"/>
           <w:shd w:val="clear" w:color="auto" w:fill="FFFFFF"/>
         </w:rPr>
-        <w:t>{ return</w:t>
-      </w:r>
-      <w:proofErr w:type="gramEnd"/>
+        <w:t>CartItems</w:t>
+      </w:r>
+      <w:proofErr w:type="spellEnd"/>
       <w:r>
         <w:rPr>
           <w:rFonts w:ascii="__IBM_Plex_Sans_Fallback_c8daab" w:hAnsi="__IBM_Plex_Sans_Fallback_c8daab"/>
           <w:color w:val="1F2937"/>
           <w:shd w:val="clear" w:color="auto" w:fill="FFFFFF"/>
         </w:rPr>
-        <w:t xml:space="preserve"> </w:t>
+        <w:t xml:space="preserve"> ? </w:t>
       </w:r>
       <w:proofErr w:type="spellStart"/>
-      <w:proofErr w:type="gramStart"/>
       <w:r>
         <w:rPr>
           <w:rFonts w:ascii="__IBM_Plex_Sans_Fallback_c8daab" w:hAnsi="__IBM_Plex_Sans_Fallback_c8daab"/>
           <w:color w:val="1F2937"/>
           <w:shd w:val="clear" w:color="auto" w:fill="FFFFFF"/>
         </w:rPr>
-        <w:t>CartItems</w:t>
+        <w:t>CartItems.reduce</w:t>
       </w:r>
       <w:proofErr w:type="spellEnd"/>
       <w:r>
@@ -4249,108 +3691,25 @@
           <w:color w:val="1F2937"/>
           <w:shd w:val="clear" w:color="auto" w:fill="FFFFFF"/>
         </w:rPr>
-        <w:t xml:space="preserve"> ?</w:t>
-      </w:r>
-      <w:proofErr w:type="gramEnd"/>
+        <w:t xml:space="preserve">((total, item) =&gt; total + </w:t>
+      </w:r>
+      <w:proofErr w:type="spellStart"/>
       <w:r>
         <w:rPr>
           <w:rFonts w:ascii="__IBM_Plex_Sans_Fallback_c8daab" w:hAnsi="__IBM_Plex_Sans_Fallback_c8daab"/>
           <w:color w:val="1F2937"/>
           <w:shd w:val="clear" w:color="auto" w:fill="FFFFFF"/>
         </w:rPr>
-        <w:t xml:space="preserve"> </w:t>
-      </w:r>
-      <w:proofErr w:type="spellStart"/>
+        <w:t>item.quantity</w:t>
+      </w:r>
+      <w:proofErr w:type="spellEnd"/>
       <w:r>
         <w:rPr>
           <w:rFonts w:ascii="__IBM_Plex_Sans_Fallback_c8daab" w:hAnsi="__IBM_Plex_Sans_Fallback_c8daab"/>
           <w:color w:val="1F2937"/>
           <w:shd w:val="clear" w:color="auto" w:fill="FFFFFF"/>
         </w:rPr>
-        <w:t>CartItems.</w:t>
-      </w:r>
-      <w:proofErr w:type="gramStart"/>
-      <w:r>
-        <w:rPr>
-          <w:rFonts w:ascii="__IBM_Plex_Sans_Fallback_c8daab" w:hAnsi="__IBM_Plex_Sans_Fallback_c8daab"/>
-          <w:color w:val="1F2937"/>
-          <w:shd w:val="clear" w:color="auto" w:fill="FFFFFF"/>
-        </w:rPr>
-        <w:t>reduce</w:t>
-      </w:r>
-      <w:proofErr w:type="spellEnd"/>
-      <w:r>
-        <w:rPr>
-          <w:rFonts w:ascii="__IBM_Plex_Sans_Fallback_c8daab" w:hAnsi="__IBM_Plex_Sans_Fallback_c8daab"/>
-          <w:color w:val="1F2937"/>
-          <w:shd w:val="clear" w:color="auto" w:fill="FFFFFF"/>
-        </w:rPr>
-        <w:t>((</w:t>
-      </w:r>
-      <w:proofErr w:type="gramEnd"/>
-      <w:r>
-        <w:rPr>
-          <w:rFonts w:ascii="__IBM_Plex_Sans_Fallback_c8daab" w:hAnsi="__IBM_Plex_Sans_Fallback_c8daab"/>
-          <w:color w:val="1F2937"/>
-          <w:shd w:val="clear" w:color="auto" w:fill="FFFFFF"/>
-        </w:rPr>
-        <w:t xml:space="preserve">total, item) =&gt; total + </w:t>
-      </w:r>
-      <w:proofErr w:type="spellStart"/>
-      <w:proofErr w:type="gramStart"/>
-      <w:r>
-        <w:rPr>
-          <w:rFonts w:ascii="__IBM_Plex_Sans_Fallback_c8daab" w:hAnsi="__IBM_Plex_Sans_Fallback_c8daab"/>
-          <w:color w:val="1F2937"/>
-          <w:shd w:val="clear" w:color="auto" w:fill="FFFFFF"/>
-        </w:rPr>
-        <w:t>item.quantity</w:t>
-      </w:r>
-      <w:proofErr w:type="spellEnd"/>
-      <w:proofErr w:type="gramEnd"/>
-      <w:r>
-        <w:rPr>
-          <w:rFonts w:ascii="__IBM_Plex_Sans_Fallback_c8daab" w:hAnsi="__IBM_Plex_Sans_Fallback_c8daab"/>
-          <w:color w:val="1F2937"/>
-          <w:shd w:val="clear" w:color="auto" w:fill="FFFFFF"/>
-        </w:rPr>
-        <w:t>, 0</w:t>
-      </w:r>
-      <w:proofErr w:type="gramStart"/>
-      <w:r>
-        <w:rPr>
-          <w:rFonts w:ascii="__IBM_Plex_Sans_Fallback_c8daab" w:hAnsi="__IBM_Plex_Sans_Fallback_c8daab"/>
-          <w:color w:val="1F2937"/>
-          <w:shd w:val="clear" w:color="auto" w:fill="FFFFFF"/>
-        </w:rPr>
-        <w:t>) :</w:t>
-      </w:r>
-      <w:proofErr w:type="gramEnd"/>
-      <w:r>
-        <w:rPr>
-          <w:rFonts w:ascii="__IBM_Plex_Sans_Fallback_c8daab" w:hAnsi="__IBM_Plex_Sans_Fallback_c8daab"/>
-          <w:color w:val="1F2937"/>
-          <w:shd w:val="clear" w:color="auto" w:fill="FFFFFF"/>
-        </w:rPr>
-        <w:t xml:space="preserve"> 0</w:t>
-      </w:r>
-      <w:proofErr w:type="gramStart"/>
-      <w:r>
-        <w:rPr>
-          <w:rFonts w:ascii="__IBM_Plex_Sans_Fallback_c8daab" w:hAnsi="__IBM_Plex_Sans_Fallback_c8daab"/>
-          <w:color w:val="1F2937"/>
-          <w:shd w:val="clear" w:color="auto" w:fill="FFFFFF"/>
-        </w:rPr>
-        <w:t>; }</w:t>
-      </w:r>
-      <w:proofErr w:type="gramEnd"/>
-      <w:r>
-        <w:rPr>
-          <w:rFonts w:ascii="__IBM_Plex_Sans_Fallback_c8daab" w:hAnsi="__IBM_Plex_Sans_Fallback_c8daab"/>
-          <w:color w:val="1F2937"/>
-          <w:shd w:val="clear" w:color="auto" w:fill="FFFFFF"/>
-        </w:rPr>
-        <w:t>;</w:t>
+        <w:t>, 0) : 0; };</w:t>
       </w:r>
     </w:p>
     <w:p/>
@@ -4486,18 +3845,8 @@
           <w:color w:val="1F2937"/>
           <w:shd w:val="clear" w:color="auto" w:fill="FFFFFF"/>
         </w:rPr>
-        <w:t>(item.name)</w:t>
-      </w:r>
-      <w:proofErr w:type="gramStart"/>
-      <w:r>
-        <w:rPr>
-          <w:rFonts w:ascii="__IBM_Plex_Sans_Fallback_c8daab" w:hAnsi="__IBM_Plex_Sans_Fallback_c8daab"/>
-          <w:color w:val="1F2937"/>
-          <w:shd w:val="clear" w:color="auto" w:fill="FFFFFF"/>
-        </w:rPr>
-        <w:t>);</w:t>
-      </w:r>
-      <w:proofErr w:type="gramEnd"/>
+        <w:t>(item.name));</w:t>
+      </w:r>
     </w:p>
     <w:p>
       <w:pPr>
@@ -4568,7 +3917,6 @@
         <w:t>The </w:t>
       </w:r>
       <w:proofErr w:type="spellStart"/>
-      <w:proofErr w:type="gramStart"/>
       <w:r>
         <w:rPr>
           <w:b/>
@@ -4582,37 +3930,17 @@
           <w:b/>
           <w:bCs/>
         </w:rPr>
-        <w:t>(</w:t>
-      </w:r>
-      <w:proofErr w:type="gramEnd"/>
-      <w:r>
-        <w:rPr>
-          <w:b/>
-          <w:bCs/>
-        </w:rPr>
-        <w:t>)</w:t>
-      </w:r>
-      <w:r>
-        <w:t xml:space="preserve"> function from </w:t>
-      </w:r>
-      <w:proofErr w:type="gramStart"/>
-      <w:r>
-        <w:t>the </w:t>
-      </w:r>
-      <w:r>
-        <w:rPr>
-          <w:b/>
-          <w:bCs/>
-        </w:rPr>
-        <w:t>@</w:t>
-      </w:r>
-      <w:proofErr w:type="gramEnd"/>
-      <w:r>
-        <w:rPr>
-          <w:b/>
-          <w:bCs/>
-        </w:rPr>
-        <w:t>reduxjs/toolkit</w:t>
+        <w:t>()</w:t>
+      </w:r>
+      <w:r>
+        <w:t> function from the </w:t>
+      </w:r>
+      <w:r>
+        <w:rPr>
+          <w:b/>
+          <w:bCs/>
+        </w:rPr>
+        <w:t>@reduxjs/toolkit</w:t>
       </w:r>
       <w:r>
         <w:t> package is imported to set up the Redux store.</w:t>
@@ -4650,15 +3978,7 @@
       </w:r>
       <w:proofErr w:type="spellEnd"/>
       <w:r>
-        <w:t> </w:t>
-      </w:r>
-      <w:proofErr w:type="gramStart"/>
-      <w:r>
-        <w:t>file</w:t>
-      </w:r>
-      <w:proofErr w:type="gramEnd"/>
-      <w:r>
-        <w:t xml:space="preserve"> which is imported, manages the state slice related to the shopping cart.</w:t>
+        <w:t> file which is imported, manages the state slice related to the shopping cart.</w:t>
       </w:r>
     </w:p>
     <w:p/>
@@ -4698,48 +4018,125 @@
           <w:shd w:val="clear" w:color="auto" w:fill="F9FAFB"/>
           <w14:ligatures w14:val="none"/>
         </w:rPr>
+        <w:t xml:space="preserve"> { </w:t>
+      </w:r>
+      <w:proofErr w:type="spellStart"/>
+      <w:r>
+        <w:rPr>
+          <w:rFonts w:ascii="Consolas" w:eastAsia="Times New Roman" w:hAnsi="Consolas" w:cs="Times New Roman"/>
+          <w:color w:val="333333"/>
+          <w:kern w:val="0"/>
+          <w:sz w:val="21"/>
+          <w:szCs w:val="21"/>
+          <w:shd w:val="clear" w:color="auto" w:fill="F9FAFB"/>
+          <w14:ligatures w14:val="none"/>
+        </w:rPr>
+        <w:t>configureStore</w:t>
+      </w:r>
+      <w:proofErr w:type="spellEnd"/>
+      <w:r>
+        <w:rPr>
+          <w:rFonts w:ascii="Consolas" w:eastAsia="Times New Roman" w:hAnsi="Consolas" w:cs="Times New Roman"/>
+          <w:color w:val="333333"/>
+          <w:kern w:val="0"/>
+          <w:sz w:val="21"/>
+          <w:szCs w:val="21"/>
+          <w:shd w:val="clear" w:color="auto" w:fill="F9FAFB"/>
+          <w14:ligatures w14:val="none"/>
+        </w:rPr>
+        <w:t xml:space="preserve"> } </w:t>
+      </w:r>
+      <w:r>
+        <w:rPr>
+          <w:rFonts w:ascii="Consolas" w:eastAsia="Times New Roman" w:hAnsi="Consolas" w:cs="Times New Roman"/>
+          <w:color w:val="0000FF"/>
+          <w:kern w:val="0"/>
+          <w:sz w:val="21"/>
+          <w:szCs w:val="21"/>
+          <w:bdr w:val="single" w:sz="2" w:space="0" w:color="E2E8F0" w:frame="1"/>
+          <w:shd w:val="clear" w:color="auto" w:fill="F9FAFB"/>
+          <w14:ligatures w14:val="none"/>
+        </w:rPr>
+        <w:t>from</w:t>
+      </w:r>
+      <w:r>
+        <w:rPr>
+          <w:rFonts w:ascii="Consolas" w:eastAsia="Times New Roman" w:hAnsi="Consolas" w:cs="Times New Roman"/>
+          <w:color w:val="333333"/>
+          <w:kern w:val="0"/>
+          <w:sz w:val="21"/>
+          <w:szCs w:val="21"/>
+          <w:shd w:val="clear" w:color="auto" w:fill="F9FAFB"/>
+          <w14:ligatures w14:val="none"/>
+        </w:rPr>
         <w:t xml:space="preserve"> </w:t>
       </w:r>
-      <w:proofErr w:type="gramStart"/>
-      <w:r>
-        <w:rPr>
-          <w:rFonts w:ascii="Consolas" w:eastAsia="Times New Roman" w:hAnsi="Consolas" w:cs="Times New Roman"/>
-          <w:color w:val="333333"/>
-          <w:kern w:val="0"/>
-          <w:sz w:val="21"/>
-          <w:szCs w:val="21"/>
-          <w:shd w:val="clear" w:color="auto" w:fill="F9FAFB"/>
-          <w14:ligatures w14:val="none"/>
-        </w:rPr>
-        <w:t xml:space="preserve">{ </w:t>
+      <w:r>
+        <w:rPr>
+          <w:rFonts w:ascii="Consolas" w:eastAsia="Times New Roman" w:hAnsi="Consolas" w:cs="Times New Roman"/>
+          <w:color w:val="A31515"/>
+          <w:kern w:val="0"/>
+          <w:sz w:val="21"/>
+          <w:szCs w:val="21"/>
+          <w:bdr w:val="single" w:sz="2" w:space="0" w:color="E2E8F0" w:frame="1"/>
+          <w:shd w:val="clear" w:color="auto" w:fill="F9FAFB"/>
+          <w14:ligatures w14:val="none"/>
+        </w:rPr>
+        <w:t>'@</w:t>
       </w:r>
       <w:proofErr w:type="spellStart"/>
       <w:r>
         <w:rPr>
           <w:rFonts w:ascii="Consolas" w:eastAsia="Times New Roman" w:hAnsi="Consolas" w:cs="Times New Roman"/>
-          <w:color w:val="333333"/>
-          <w:kern w:val="0"/>
-          <w:sz w:val="21"/>
-          <w:szCs w:val="21"/>
-          <w:shd w:val="clear" w:color="auto" w:fill="F9FAFB"/>
-          <w14:ligatures w14:val="none"/>
-        </w:rPr>
-        <w:t>configureStore</w:t>
+          <w:color w:val="A31515"/>
+          <w:kern w:val="0"/>
+          <w:sz w:val="21"/>
+          <w:szCs w:val="21"/>
+          <w:bdr w:val="single" w:sz="2" w:space="0" w:color="E2E8F0" w:frame="1"/>
+          <w:shd w:val="clear" w:color="auto" w:fill="F9FAFB"/>
+          <w14:ligatures w14:val="none"/>
+        </w:rPr>
+        <w:t>reduxjs</w:t>
       </w:r>
       <w:proofErr w:type="spellEnd"/>
-      <w:proofErr w:type="gramEnd"/>
-      <w:r>
-        <w:rPr>
-          <w:rFonts w:ascii="Consolas" w:eastAsia="Times New Roman" w:hAnsi="Consolas" w:cs="Times New Roman"/>
-          <w:color w:val="333333"/>
-          <w:kern w:val="0"/>
-          <w:sz w:val="21"/>
-          <w:szCs w:val="21"/>
-          <w:shd w:val="clear" w:color="auto" w:fill="F9FAFB"/>
-          <w14:ligatures w14:val="none"/>
-        </w:rPr>
-        <w:t xml:space="preserve"> } </w:t>
-      </w:r>
+      <w:r>
+        <w:rPr>
+          <w:rFonts w:ascii="Consolas" w:eastAsia="Times New Roman" w:hAnsi="Consolas" w:cs="Times New Roman"/>
+          <w:color w:val="A31515"/>
+          <w:kern w:val="0"/>
+          <w:sz w:val="21"/>
+          <w:szCs w:val="21"/>
+          <w:bdr w:val="single" w:sz="2" w:space="0" w:color="E2E8F0" w:frame="1"/>
+          <w:shd w:val="clear" w:color="auto" w:fill="F9FAFB"/>
+          <w14:ligatures w14:val="none"/>
+        </w:rPr>
+        <w:t>/toolkit'</w:t>
+      </w:r>
+      <w:r>
+        <w:rPr>
+          <w:rFonts w:ascii="Consolas" w:eastAsia="Times New Roman" w:hAnsi="Consolas" w:cs="Times New Roman"/>
+          <w:color w:val="333333"/>
+          <w:kern w:val="0"/>
+          <w:sz w:val="21"/>
+          <w:szCs w:val="21"/>
+          <w:shd w:val="clear" w:color="auto" w:fill="F9FAFB"/>
+          <w14:ligatures w14:val="none"/>
+        </w:rPr>
+        <w:t>;</w:t>
+      </w:r>
+    </w:p>
+    <w:p>
+      <w:pPr>
+        <w:rPr>
+          <w:rFonts w:ascii="Consolas" w:eastAsia="Times New Roman" w:hAnsi="Consolas" w:cs="Times New Roman"/>
+          <w:color w:val="333333"/>
+          <w:kern w:val="0"/>
+          <w:sz w:val="21"/>
+          <w:szCs w:val="21"/>
+          <w:shd w:val="clear" w:color="auto" w:fill="F9FAFB"/>
+          <w14:ligatures w14:val="none"/>
+        </w:rPr>
+      </w:pPr>
       <w:r>
         <w:rPr>
           <w:rFonts w:ascii="Consolas" w:eastAsia="Times New Roman" w:hAnsi="Consolas" w:cs="Times New Roman"/>
@@ -4751,6 +4148,57 @@
           <w:shd w:val="clear" w:color="auto" w:fill="F9FAFB"/>
           <w14:ligatures w14:val="none"/>
         </w:rPr>
+        <w:t>import</w:t>
+      </w:r>
+      <w:r>
+        <w:rPr>
+          <w:rFonts w:ascii="Consolas" w:eastAsia="Times New Roman" w:hAnsi="Consolas" w:cs="Times New Roman"/>
+          <w:color w:val="333333"/>
+          <w:kern w:val="0"/>
+          <w:sz w:val="21"/>
+          <w:szCs w:val="21"/>
+          <w:shd w:val="clear" w:color="auto" w:fill="F9FAFB"/>
+          <w14:ligatures w14:val="none"/>
+        </w:rPr>
+        <w:t xml:space="preserve"> </w:t>
+      </w:r>
+      <w:proofErr w:type="spellStart"/>
+      <w:r>
+        <w:rPr>
+          <w:rFonts w:ascii="Consolas" w:eastAsia="Times New Roman" w:hAnsi="Consolas" w:cs="Times New Roman"/>
+          <w:color w:val="333333"/>
+          <w:kern w:val="0"/>
+          <w:sz w:val="21"/>
+          <w:szCs w:val="21"/>
+          <w:shd w:val="clear" w:color="auto" w:fill="F9FAFB"/>
+          <w14:ligatures w14:val="none"/>
+        </w:rPr>
+        <w:t>cartReducer</w:t>
+      </w:r>
+      <w:proofErr w:type="spellEnd"/>
+      <w:r>
+        <w:rPr>
+          <w:rFonts w:ascii="Consolas" w:eastAsia="Times New Roman" w:hAnsi="Consolas" w:cs="Times New Roman"/>
+          <w:color w:val="333333"/>
+          <w:kern w:val="0"/>
+          <w:sz w:val="21"/>
+          <w:szCs w:val="21"/>
+          <w:shd w:val="clear" w:color="auto" w:fill="F9FAFB"/>
+          <w14:ligatures w14:val="none"/>
+        </w:rPr>
+        <w:t xml:space="preserve"> </w:t>
+      </w:r>
+      <w:r>
+        <w:rPr>
+          <w:rFonts w:ascii="Consolas" w:eastAsia="Times New Roman" w:hAnsi="Consolas" w:cs="Times New Roman"/>
+          <w:color w:val="0000FF"/>
+          <w:kern w:val="0"/>
+          <w:sz w:val="21"/>
+          <w:szCs w:val="21"/>
+          <w:bdr w:val="single" w:sz="2" w:space="0" w:color="E2E8F0" w:frame="1"/>
+          <w:shd w:val="clear" w:color="auto" w:fill="F9FAFB"/>
+          <w14:ligatures w14:val="none"/>
+        </w:rPr>
         <w:t>from</w:t>
       </w:r>
       <w:r>
@@ -4776,7 +4224,7 @@
           <w:shd w:val="clear" w:color="auto" w:fill="F9FAFB"/>
           <w14:ligatures w14:val="none"/>
         </w:rPr>
-        <w:t>'@</w:t>
+        <w:t>'./</w:t>
       </w:r>
       <w:proofErr w:type="spellStart"/>
       <w:r>
@@ -4790,7 +4238,7 @@
           <w:shd w:val="clear" w:color="auto" w:fill="F9FAFB"/>
           <w14:ligatures w14:val="none"/>
         </w:rPr>
-        <w:t>reduxjs</w:t>
+        <w:t>CartSlice</w:t>
       </w:r>
       <w:proofErr w:type="spellEnd"/>
       <w:r>
@@ -4804,20 +4252,6 @@
           <w:shd w:val="clear" w:color="auto" w:fill="F9FAFB"/>
           <w14:ligatures w14:val="none"/>
         </w:rPr>
-        <w:t>/toolkit</w:t>
-      </w:r>
-      <w:proofErr w:type="gramStart"/>
-      <w:r>
-        <w:rPr>
-          <w:rFonts w:ascii="Consolas" w:eastAsia="Times New Roman" w:hAnsi="Consolas" w:cs="Times New Roman"/>
-          <w:color w:val="A31515"/>
-          <w:kern w:val="0"/>
-          <w:sz w:val="21"/>
-          <w:szCs w:val="21"/>
-          <w:bdr w:val="single" w:sz="2" w:space="0" w:color="E2E8F0" w:frame="1"/>
-          <w:shd w:val="clear" w:color="auto" w:fill="F9FAFB"/>
-          <w14:ligatures w14:val="none"/>
-        </w:rPr>
         <w:t>'</w:t>
       </w:r>
       <w:r>
@@ -4832,153 +4266,6 @@
         </w:rPr>
         <w:t>;</w:t>
       </w:r>
-      <w:proofErr w:type="gramEnd"/>
-    </w:p>
-    <w:p>
-      <w:pPr>
-        <w:rPr>
-          <w:rFonts w:ascii="Consolas" w:eastAsia="Times New Roman" w:hAnsi="Consolas" w:cs="Times New Roman"/>
-          <w:color w:val="333333"/>
-          <w:kern w:val="0"/>
-          <w:sz w:val="21"/>
-          <w:szCs w:val="21"/>
-          <w:shd w:val="clear" w:color="auto" w:fill="F9FAFB"/>
-          <w14:ligatures w14:val="none"/>
-        </w:rPr>
-      </w:pPr>
-      <w:r>
-        <w:rPr>
-          <w:rFonts w:ascii="Consolas" w:eastAsia="Times New Roman" w:hAnsi="Consolas" w:cs="Times New Roman"/>
-          <w:color w:val="0000FF"/>
-          <w:kern w:val="0"/>
-          <w:sz w:val="21"/>
-          <w:szCs w:val="21"/>
-          <w:bdr w:val="single" w:sz="2" w:space="0" w:color="E2E8F0" w:frame="1"/>
-          <w:shd w:val="clear" w:color="auto" w:fill="F9FAFB"/>
-          <w14:ligatures w14:val="none"/>
-        </w:rPr>
-        <w:t>import</w:t>
-      </w:r>
-      <w:r>
-        <w:rPr>
-          <w:rFonts w:ascii="Consolas" w:eastAsia="Times New Roman" w:hAnsi="Consolas" w:cs="Times New Roman"/>
-          <w:color w:val="333333"/>
-          <w:kern w:val="0"/>
-          <w:sz w:val="21"/>
-          <w:szCs w:val="21"/>
-          <w:shd w:val="clear" w:color="auto" w:fill="F9FAFB"/>
-          <w14:ligatures w14:val="none"/>
-        </w:rPr>
-        <w:t xml:space="preserve"> </w:t>
-      </w:r>
-      <w:proofErr w:type="spellStart"/>
-      <w:r>
-        <w:rPr>
-          <w:rFonts w:ascii="Consolas" w:eastAsia="Times New Roman" w:hAnsi="Consolas" w:cs="Times New Roman"/>
-          <w:color w:val="333333"/>
-          <w:kern w:val="0"/>
-          <w:sz w:val="21"/>
-          <w:szCs w:val="21"/>
-          <w:shd w:val="clear" w:color="auto" w:fill="F9FAFB"/>
-          <w14:ligatures w14:val="none"/>
-        </w:rPr>
-        <w:t>cartReducer</w:t>
-      </w:r>
-      <w:proofErr w:type="spellEnd"/>
-      <w:r>
-        <w:rPr>
-          <w:rFonts w:ascii="Consolas" w:eastAsia="Times New Roman" w:hAnsi="Consolas" w:cs="Times New Roman"/>
-          <w:color w:val="333333"/>
-          <w:kern w:val="0"/>
-          <w:sz w:val="21"/>
-          <w:szCs w:val="21"/>
-          <w:shd w:val="clear" w:color="auto" w:fill="F9FAFB"/>
-          <w14:ligatures w14:val="none"/>
-        </w:rPr>
-        <w:t xml:space="preserve"> </w:t>
-      </w:r>
-      <w:r>
-        <w:rPr>
-          <w:rFonts w:ascii="Consolas" w:eastAsia="Times New Roman" w:hAnsi="Consolas" w:cs="Times New Roman"/>
-          <w:color w:val="0000FF"/>
-          <w:kern w:val="0"/>
-          <w:sz w:val="21"/>
-          <w:szCs w:val="21"/>
-          <w:bdr w:val="single" w:sz="2" w:space="0" w:color="E2E8F0" w:frame="1"/>
-          <w:shd w:val="clear" w:color="auto" w:fill="F9FAFB"/>
-          <w14:ligatures w14:val="none"/>
-        </w:rPr>
-        <w:t>from</w:t>
-      </w:r>
-      <w:r>
-        <w:rPr>
-          <w:rFonts w:ascii="Consolas" w:eastAsia="Times New Roman" w:hAnsi="Consolas" w:cs="Times New Roman"/>
-          <w:color w:val="333333"/>
-          <w:kern w:val="0"/>
-          <w:sz w:val="21"/>
-          <w:szCs w:val="21"/>
-          <w:shd w:val="clear" w:color="auto" w:fill="F9FAFB"/>
-          <w14:ligatures w14:val="none"/>
-        </w:rPr>
-        <w:t xml:space="preserve"> </w:t>
-      </w:r>
-      <w:proofErr w:type="gramStart"/>
-      <w:r>
-        <w:rPr>
-          <w:rFonts w:ascii="Consolas" w:eastAsia="Times New Roman" w:hAnsi="Consolas" w:cs="Times New Roman"/>
-          <w:color w:val="A31515"/>
-          <w:kern w:val="0"/>
-          <w:sz w:val="21"/>
-          <w:szCs w:val="21"/>
-          <w:bdr w:val="single" w:sz="2" w:space="0" w:color="E2E8F0" w:frame="1"/>
-          <w:shd w:val="clear" w:color="auto" w:fill="F9FAFB"/>
-          <w14:ligatures w14:val="none"/>
-        </w:rPr>
-        <w:t>'./</w:t>
-      </w:r>
-      <w:proofErr w:type="spellStart"/>
-      <w:proofErr w:type="gramEnd"/>
-      <w:r>
-        <w:rPr>
-          <w:rFonts w:ascii="Consolas" w:eastAsia="Times New Roman" w:hAnsi="Consolas" w:cs="Times New Roman"/>
-          <w:color w:val="A31515"/>
-          <w:kern w:val="0"/>
-          <w:sz w:val="21"/>
-          <w:szCs w:val="21"/>
-          <w:bdr w:val="single" w:sz="2" w:space="0" w:color="E2E8F0" w:frame="1"/>
-          <w:shd w:val="clear" w:color="auto" w:fill="F9FAFB"/>
-          <w14:ligatures w14:val="none"/>
-        </w:rPr>
-        <w:t>CartSlice</w:t>
-      </w:r>
-      <w:proofErr w:type="spellEnd"/>
-      <w:proofErr w:type="gramStart"/>
-      <w:r>
-        <w:rPr>
-          <w:rFonts w:ascii="Consolas" w:eastAsia="Times New Roman" w:hAnsi="Consolas" w:cs="Times New Roman"/>
-          <w:color w:val="A31515"/>
-          <w:kern w:val="0"/>
-          <w:sz w:val="21"/>
-          <w:szCs w:val="21"/>
-          <w:bdr w:val="single" w:sz="2" w:space="0" w:color="E2E8F0" w:frame="1"/>
-          <w:shd w:val="clear" w:color="auto" w:fill="F9FAFB"/>
-          <w14:ligatures w14:val="none"/>
-        </w:rPr>
-        <w:t>'</w:t>
-      </w:r>
-      <w:r>
-        <w:rPr>
-          <w:rFonts w:ascii="Consolas" w:eastAsia="Times New Roman" w:hAnsi="Consolas" w:cs="Times New Roman"/>
-          <w:color w:val="333333"/>
-          <w:kern w:val="0"/>
-          <w:sz w:val="21"/>
-          <w:szCs w:val="21"/>
-          <w:shd w:val="clear" w:color="auto" w:fill="F9FAFB"/>
-          <w14:ligatures w14:val="none"/>
-        </w:rPr>
-        <w:t>;</w:t>
-      </w:r>
-      <w:proofErr w:type="gramEnd"/>
     </w:p>
     <w:p>
       <w:pPr>
@@ -5002,7 +4289,6 @@
         <w:t>The </w:t>
       </w:r>
       <w:proofErr w:type="spellStart"/>
-      <w:proofErr w:type="gramStart"/>
       <w:r>
         <w:rPr>
           <w:b/>
@@ -5016,26 +4302,10 @@
           <w:b/>
           <w:bCs/>
         </w:rPr>
-        <w:t>(</w:t>
-      </w:r>
-      <w:proofErr w:type="gramEnd"/>
-      <w:r>
-        <w:rPr>
-          <w:b/>
-          <w:bCs/>
-        </w:rPr>
-        <w:t>)</w:t>
-      </w:r>
-      <w:r>
-        <w:t xml:space="preserve"> function is used to </w:t>
-      </w:r>
-      <w:proofErr w:type="gramStart"/>
-      <w:r>
-        <w:t>setup</w:t>
-      </w:r>
-      <w:proofErr w:type="gramEnd"/>
-      <w:r>
-        <w:t xml:space="preserve"> the Redux store.</w:t>
+        <w:t>()</w:t>
+      </w:r>
+      <w:r>
+        <w:t> function is used to setup the Redux store.</w:t>
       </w:r>
     </w:p>
     <w:p>
@@ -5050,7 +4320,6 @@
         <w:t>Inside the configuration object passed to </w:t>
       </w:r>
       <w:proofErr w:type="spellStart"/>
-      <w:proofErr w:type="gramStart"/>
       <w:r>
         <w:rPr>
           <w:b/>
@@ -5064,15 +4333,7 @@
           <w:b/>
           <w:bCs/>
         </w:rPr>
-        <w:t>(</w:t>
-      </w:r>
-      <w:proofErr w:type="gramEnd"/>
-      <w:r>
-        <w:rPr>
-          <w:b/>
-          <w:bCs/>
-        </w:rPr>
-        <w:t>)</w:t>
+        <w:t>()</w:t>
       </w:r>
       <w:r>
         <w:t>, the </w:t>
@@ -5088,7 +4349,6 @@
         <w:t> key specifies the reducer functions. In this case, the </w:t>
       </w:r>
       <w:proofErr w:type="spellStart"/>
-      <w:proofErr w:type="gramStart"/>
       <w:r>
         <w:rPr>
           <w:b/>
@@ -5097,7 +4357,6 @@
         <w:t>cartReducer</w:t>
       </w:r>
       <w:proofErr w:type="spellEnd"/>
-      <w:proofErr w:type="gramEnd"/>
       <w:r>
         <w:t> is assigned to manage the </w:t>
       </w:r>
@@ -5206,7 +4465,6 @@
         <w:t xml:space="preserve"> store = </w:t>
       </w:r>
       <w:proofErr w:type="spellStart"/>
-      <w:proofErr w:type="gramStart"/>
       <w:r>
         <w:rPr>
           <w:rFonts w:ascii="Consolas" w:eastAsia="Times New Roman" w:hAnsi="Consolas" w:cs="Times New Roman"/>
@@ -5231,20 +4489,7 @@
           <w:shd w:val="clear" w:color="auto" w:fill="F9FAFB"/>
           <w14:ligatures w14:val="none"/>
         </w:rPr>
-        <w:t>(</w:t>
-      </w:r>
-      <w:proofErr w:type="gramEnd"/>
-      <w:r>
-        <w:rPr>
-          <w:rFonts w:ascii="Consolas" w:eastAsia="Times New Roman" w:hAnsi="Consolas" w:cs="Times New Roman"/>
-          <w:color w:val="333333"/>
-          <w:kern w:val="0"/>
-          <w:sz w:val="21"/>
-          <w:szCs w:val="21"/>
-          <w:shd w:val="clear" w:color="auto" w:fill="F9FAFB"/>
-          <w14:ligatures w14:val="none"/>
-        </w:rPr>
-        <w:t>{</w:t>
+        <w:t>({</w:t>
       </w:r>
     </w:p>
     <w:p>
@@ -5311,7 +4556,6 @@
         </w:rPr>
         <w:t xml:space="preserve">    </w:t>
       </w:r>
-      <w:proofErr w:type="gramStart"/>
       <w:r>
         <w:rPr>
           <w:rFonts w:ascii="Consolas" w:eastAsia="Times New Roman" w:hAnsi="Consolas" w:cs="Times New Roman"/>
@@ -5337,7 +4581,6 @@
         </w:rPr>
         <w:t>: {</w:t>
       </w:r>
-      <w:proofErr w:type="gramEnd"/>
     </w:p>
     <w:p>
       <w:pPr>
@@ -5519,22 +4762,8 @@
           <w:shd w:val="clear" w:color="auto" w:fill="F9FAFB"/>
           <w14:ligatures w14:val="none"/>
         </w:rPr>
-        <w:t>}</w:t>
-      </w:r>
-      <w:proofErr w:type="gramStart"/>
-      <w:r>
-        <w:rPr>
-          <w:rFonts w:ascii="Consolas" w:eastAsia="Times New Roman" w:hAnsi="Consolas" w:cs="Times New Roman"/>
-          <w:color w:val="333333"/>
-          <w:kern w:val="0"/>
-          <w:sz w:val="21"/>
-          <w:szCs w:val="21"/>
-          <w:shd w:val="clear" w:color="auto" w:fill="F9FAFB"/>
-          <w14:ligatures w14:val="none"/>
-        </w:rPr>
-        <w:t>);</w:t>
-      </w:r>
-      <w:proofErr w:type="gramEnd"/>
+        <w:t>});</w:t>
+      </w:r>
     </w:p>
     <w:p>
       <w:pPr>
@@ -5653,22 +4882,10 @@
           <w:b/>
           <w:bCs/>
         </w:rPr>
-        <w:t xml:space="preserve">export default </w:t>
-      </w:r>
-      <w:proofErr w:type="gramStart"/>
-      <w:r>
-        <w:rPr>
-          <w:b/>
-          <w:bCs/>
-        </w:rPr>
-        <w:t>store;</w:t>
-      </w:r>
-      <w:r>
-        <w:t>,</w:t>
-      </w:r>
-      <w:proofErr w:type="gramEnd"/>
-      <w:r>
-        <w:t xml:space="preserve"> so it can be used throughout the application to manage state.</w:t>
+        <w:t>export default store;</w:t>
+      </w:r>
+      <w:r>
+        <w:t>, so it can be used throughout the application to manage state.</w:t>
       </w:r>
     </w:p>
     <w:p>
@@ -5723,20 +4940,8 @@
           <w:szCs w:val="21"/>
           <w:shd w:val="clear" w:color="auto" w:fill="F9FAFB"/>
         </w:rPr>
-        <w:t xml:space="preserve"> </w:t>
-      </w:r>
-      <w:proofErr w:type="gramStart"/>
-      <w:r>
-        <w:rPr>
-          <w:rFonts w:ascii="Consolas" w:hAnsi="Consolas"/>
-          <w:color w:val="333333"/>
-          <w:sz w:val="21"/>
-          <w:szCs w:val="21"/>
-          <w:shd w:val="clear" w:color="auto" w:fill="F9FAFB"/>
-        </w:rPr>
-        <w:t>store;</w:t>
-      </w:r>
-      <w:proofErr w:type="gramEnd"/>
+        <w:t xml:space="preserve"> store;</w:t>
+      </w:r>
     </w:p>
     <w:p>
       <w:pPr>
@@ -5883,18 +5088,7 @@
           <w:szCs w:val="21"/>
           <w:shd w:val="clear" w:color="auto" w:fill="F9FAFB"/>
         </w:rPr>
-        <w:t xml:space="preserve"> </w:t>
-      </w:r>
-      <w:proofErr w:type="gramStart"/>
-      <w:r>
-        <w:rPr>
-          <w:rFonts w:ascii="Consolas" w:hAnsi="Consolas"/>
-          <w:color w:val="333333"/>
-          <w:sz w:val="21"/>
-          <w:szCs w:val="21"/>
-          <w:shd w:val="clear" w:color="auto" w:fill="F9FAFB"/>
-        </w:rPr>
-        <w:t xml:space="preserve">{ </w:t>
+        <w:t xml:space="preserve"> { </w:t>
       </w:r>
       <w:r>
         <w:rPr>
@@ -5908,7 +5102,6 @@
         </w:rPr>
         <w:t>Provider</w:t>
       </w:r>
-      <w:proofErr w:type="gramEnd"/>
       <w:r>
         <w:rPr>
           <w:rFonts w:ascii="Consolas" w:hAnsi="Consolas"/>
@@ -5951,24 +5144,11 @@
           <w:bdr w:val="single" w:sz="2" w:space="0" w:color="E2E8F0" w:frame="1"/>
           <w:shd w:val="clear" w:color="auto" w:fill="F9FAFB"/>
         </w:rPr>
-        <w:t>'react-redux</w:t>
-      </w:r>
-      <w:proofErr w:type="gramStart"/>
-      <w:r>
-        <w:rPr>
-          <w:rStyle w:val="hljs-string"/>
+        <w:t>'react-redux'</w:t>
+      </w:r>
+      <w:r>
+        <w:rPr>
           <w:rFonts w:ascii="Consolas" w:hAnsi="Consolas"/>
-          <w:color w:val="A31515"/>
-          <w:sz w:val="21"/>
-          <w:szCs w:val="21"/>
-          <w:bdr w:val="single" w:sz="2" w:space="0" w:color="E2E8F0" w:frame="1"/>
-          <w:shd w:val="clear" w:color="auto" w:fill="F9FAFB"/>
-        </w:rPr>
-        <w:t>'</w:t>
-      </w:r>
-      <w:r>
-        <w:rPr>
-          <w:rFonts w:ascii="Consolas" w:hAnsi="Consolas"/>
           <w:color w:val="333333"/>
           <w:sz w:val="21"/>
           <w:szCs w:val="21"/>
@@ -5976,7 +5156,6 @@
         </w:rPr>
         <w:t>;</w:t>
       </w:r>
-      <w:proofErr w:type="gramEnd"/>
     </w:p>
     <w:p>
       <w:pPr>
@@ -6075,24 +5254,11 @@
           <w:bdr w:val="single" w:sz="2" w:space="0" w:color="E2E8F0" w:frame="1"/>
           <w:shd w:val="clear" w:color="auto" w:fill="F9FAFB"/>
         </w:rPr>
-        <w:t>'./store.js</w:t>
-      </w:r>
-      <w:proofErr w:type="gramStart"/>
-      <w:r>
-        <w:rPr>
-          <w:rStyle w:val="hljs-string"/>
+        <w:t>'./store.js'</w:t>
+      </w:r>
+      <w:r>
+        <w:rPr>
           <w:rFonts w:ascii="Consolas" w:hAnsi="Consolas"/>
-          <w:color w:val="A31515"/>
-          <w:sz w:val="21"/>
-          <w:szCs w:val="21"/>
-          <w:bdr w:val="single" w:sz="2" w:space="0" w:color="E2E8F0" w:frame="1"/>
-          <w:shd w:val="clear" w:color="auto" w:fill="F9FAFB"/>
-        </w:rPr>
-        <w:t>'</w:t>
-      </w:r>
-      <w:r>
-        <w:rPr>
-          <w:rFonts w:ascii="Consolas" w:hAnsi="Consolas"/>
           <w:color w:val="333333"/>
           <w:sz w:val="21"/>
           <w:szCs w:val="21"/>
@@ -6100,7 +5266,6 @@
         </w:rPr>
         <w:t>;</w:t>
       </w:r>
-      <w:proofErr w:type="gramEnd"/>
     </w:p>
     <w:p>
       <w:pPr>

</xml_diff>